<commit_message>
D01 results (MNIST/FMNIST 3 seeds; SVHN/CIFAR-10 separability 3 seeds; Kaggle rerun agrees): evidence figures ev01-ev11 for every claim, added to the handout (Part 5.9) and the Hinglish notes; random-half MMD floor fix
Co-Authored-By: Claude Opus 5.5 <noreply@anthropic.com>
</commit_message>
<xml_diff>
--- a/docs/professor_report/OursA_Backup_Handout.docx
+++ b/docs/professor_report/OursA_Backup_Handout.docx
@@ -13100,9 +13100,9 @@
       <w:r>
         <w:drawing>
           <wp:inline distT="0" distB="0" distL="0" distR="0">
-            <wp:extent cx="6096000" cy="2076450"/>
+            <wp:extent cx="6096000" cy="1771650"/>
             <wp:effectExtent t="0" r="0" b="0" l="0"/>
-            <wp:docPr id="22" name="f15_mc_kh.png" descr="Figure 9. One class in 2-D: the generator's output, after MC (right mean and spread) and after KH (right shape). The MMD to the real class falls 0.44 → 0.25 → 0.03." title="f15_mc_kh.png"/>
+            <wp:docPr id="22" name="ev07_rare_class_mnist.png" descr="Figure 9. Real data, MNIST's rarest class (24 samples): the generator's output, after MC (right centre and width) and after KH (right shape). Details in Part 5.9." title="ev07_rare_class_mnist.png"/>
             <wp:cNvGraphicFramePr>
               <a:graphicFrameLocks xmlns:a="http://schemas.openxmlformats.org/drawingml/2006/main" noChangeAspect="1"/>
             </wp:cNvGraphicFramePr>
@@ -13125,7 +13125,7 @@
                   <pic:spPr bwMode="auto">
                     <a:xfrm>
                       <a:off x="0" y="0"/>
-                      <a:ext cx="6096000" cy="2076450"/>
+                      <a:ext cx="6096000" cy="1771650"/>
                     </a:xfrm>
                     <a:prstGeom prst="rect">
                       <a:avLst/>
@@ -13151,7 +13151,7 @@
           <w:sz w:val="18"/>
           <w:szCs w:val="18"/>
         </w:rPr>
-        <w:t xml:space="preserve">Figure 9. One class in 2-D: the generator's output, after MC (right mean and spread) and after KH (right shape). The MMD to the real class falls 0.44 → 0.25 → 0.03.</w:t>
+        <w:t xml:space="preserve">Figure 9. Real data, MNIST's rarest class (24 samples): the generator's output, after MC (right centre and width) and after KH (right shape). Details in Part 5.9.</w:t>
       </w:r>
     </w:p>
     <w:p>
@@ -21979,6 +21979,655 @@
       </w:pPr>
       <w:r>
         <w:t xml:space="preserve">After the fixes, fake features are as hard as real ones, not artificially clean.</w:t>
+      </w:r>
+    </w:p>
+    <w:p>
+      <w:pPr>
+        <w:pStyle w:val="Heading2"/>
+        <w:keepNext/>
+        <w:spacing w:after="120" w:before="240"/>
+      </w:pPr>
+      <w:r>
+        <w:t xml:space="preserve">5.9 Proof on real data: what each component does</w:t>
+      </w:r>
+    </w:p>
+    <w:p>
+      <w:pPr>
+        <w:spacing w:after="120" w:line="276"/>
+        <w:jc w:val="both"/>
+      </w:pPr>
+      <w:r>
+        <w:t xml:space="preserve">Measured on real features: MNIST and FashionMNIST, long tail, 3 seeds, the same splits as every run. The </w:t>
+      </w:r>
+      <w:r>
+        <w:rPr>
+          <w:i/>
+          <w:iCs/>
+        </w:rPr>
+        <w:t xml:space="preserve">referee</w:t>
+      </w:r>
+      <w:r>
+        <w:t xml:space="preserve"> is a head trained on held-out real features; it never takes part in training. Code: experiments/D01_component_evidence.py.</w:t>
+      </w:r>
+    </w:p>
+    <w:p>
+      <w:pPr>
+        <w:spacing w:after="60" w:before="120"/>
+        <w:jc w:val="center"/>
+      </w:pPr>
+      <w:r>
+        <w:drawing>
+          <wp:inline distT="0" distB="0" distL="0" distR="0">
+            <wp:extent cx="6096000" cy="3095625"/>
+            <wp:effectExtent t="0" r="0" b="0" l="0"/>
+            <wp:docPr id="31" name="ev01_collapse.png" descr="Rows of rare classes under FedAvg end at 0.33 (MNIST) and 0.43 (FMNIST) of their start value; with HWA they grow (×1.7, ×2.4). They shrink even when 70–90 % of clients hold the class." title="ev01_collapse.png"/>
+            <wp:cNvGraphicFramePr>
+              <a:graphicFrameLocks xmlns:a="http://schemas.openxmlformats.org/drawingml/2006/main" noChangeAspect="1"/>
+            </wp:cNvGraphicFramePr>
+            <a:graphic xmlns:a="http://schemas.openxmlformats.org/drawingml/2006/main">
+              <a:graphicData uri="http://schemas.openxmlformats.org/drawingml/2006/picture">
+                <pic:pic xmlns:pic="http://schemas.openxmlformats.org/drawingml/2006/picture">
+                  <pic:nvPicPr>
+                    <pic:cNvPr id="0" name="" descr=""/>
+                    <pic:cNvPicPr>
+                      <a:picLocks noChangeAspect="1" noChangeArrowheads="1"/>
+                    </pic:cNvPicPr>
+                  </pic:nvPicPr>
+                  <pic:blipFill>
+                    <a:blip r:embed="rId37" cstate="none"/>
+                    <a:srcRect/>
+                    <a:stretch>
+                      <a:fillRect/>
+                    </a:stretch>
+                  </pic:blipFill>
+                  <pic:spPr bwMode="auto">
+                    <a:xfrm>
+                      <a:off x="0" y="0"/>
+                      <a:ext cx="6096000" cy="3095625"/>
+                    </a:xfrm>
+                    <a:prstGeom prst="rect">
+                      <a:avLst/>
+                    </a:prstGeom>
+                  </pic:spPr>
+                </pic:pic>
+              </a:graphicData>
+            </a:graphic>
+          </wp:inline>
+        </w:drawing>
+      </w:r>
+    </w:p>
+    <w:p>
+      <w:pPr>
+        <w:spacing w:after="220"/>
+        <w:jc w:val="center"/>
+      </w:pPr>
+      <w:r>
+        <w:rPr>
+          <w:i/>
+          <w:iCs/>
+          <w:color w:val="5B6676"/>
+          <w:sz w:val="18"/>
+          <w:szCs w:val="18"/>
+        </w:rPr>
+        <w:t xml:space="preserve">Rows of rare classes under FedAvg end at 0.33 (MNIST) and 0.43 (FMNIST) of their start value; with HWA they grow (×1.7, ×2.4). They shrink even when 70–90 % of clients hold the class.</w:t>
+      </w:r>
+    </w:p>
+    <w:p>
+      <w:pPr>
+        <w:spacing w:after="60" w:before="120"/>
+        <w:jc w:val="center"/>
+      </w:pPr>
+      <w:r>
+        <w:drawing>
+          <wp:inline distT="0" distB="0" distL="0" distR="0">
+            <wp:extent cx="6096000" cy="3829050"/>
+            <wp:effectExtent t="0" r="0" b="0" l="0"/>
+            <wp:docPr id="32" name="ev02_fidelity.png" descr="Rare-class fake samples recognised as their class: GeFL-F 11 % / 21 %, + HWA 33 % / 67 %, PC-VAE 93 % / 90 %, Ours-A 89 % / 80 % (real test features: 96 % / 84 %)." title="ev02_fidelity.png"/>
+            <wp:cNvGraphicFramePr>
+              <a:graphicFrameLocks xmlns:a="http://schemas.openxmlformats.org/drawingml/2006/main" noChangeAspect="1"/>
+            </wp:cNvGraphicFramePr>
+            <a:graphic xmlns:a="http://schemas.openxmlformats.org/drawingml/2006/main">
+              <a:graphicData uri="http://schemas.openxmlformats.org/drawingml/2006/picture">
+                <pic:pic xmlns:pic="http://schemas.openxmlformats.org/drawingml/2006/picture">
+                  <pic:nvPicPr>
+                    <pic:cNvPr id="0" name="" descr=""/>
+                    <pic:cNvPicPr>
+                      <a:picLocks noChangeAspect="1" noChangeArrowheads="1"/>
+                    </pic:cNvPicPr>
+                  </pic:nvPicPr>
+                  <pic:blipFill>
+                    <a:blip r:embed="rId38" cstate="none"/>
+                    <a:srcRect/>
+                    <a:stretch>
+                      <a:fillRect/>
+                    </a:stretch>
+                  </pic:blipFill>
+                  <pic:spPr bwMode="auto">
+                    <a:xfrm>
+                      <a:off x="0" y="0"/>
+                      <a:ext cx="6096000" cy="3829050"/>
+                    </a:xfrm>
+                    <a:prstGeom prst="rect">
+                      <a:avLst/>
+                    </a:prstGeom>
+                  </pic:spPr>
+                </pic:pic>
+              </a:graphicData>
+            </a:graphic>
+          </wp:inline>
+        </w:drawing>
+      </w:r>
+    </w:p>
+    <w:p>
+      <w:pPr>
+        <w:spacing w:after="220"/>
+        <w:jc w:val="center"/>
+      </w:pPr>
+      <w:r>
+        <w:rPr>
+          <w:i/>
+          <w:iCs/>
+          <w:color w:val="5B6676"/>
+          <w:sz w:val="18"/>
+          <w:szCs w:val="18"/>
+        </w:rPr>
+        <w:t xml:space="preserve">Rare-class fake samples recognised as their class: GeFL-F 11 % / 21 %, + HWA 33 % / 67 %, PC-VAE 93 % / 90 %, Ours-A 89 % / 80 % (real test features: 96 % / 84 %).</w:t>
+      </w:r>
+    </w:p>
+    <w:p>
+      <w:pPr>
+        <w:spacing w:after="60" w:before="120"/>
+        <w:jc w:val="center"/>
+      </w:pPr>
+      <w:r>
+        <w:drawing>
+          <wp:inline distT="0" distB="0" distL="0" distR="0">
+            <wp:extent cx="6096000" cy="3552825"/>
+            <wp:effectExtent t="0" r="0" b="0" l="0"/>
+            <wp:docPr id="33" name="ev03_moments.png" descr="Spread of fake features (1 = real): PC-VAE 0.50 / 0.45, + MC 0.86 / 0.89, + KH 0.95 / 0.98. Rare-class mean error: 0.19 → 0.09 → 0.05 class std (MNIST)." title="ev03_moments.png"/>
+            <wp:cNvGraphicFramePr>
+              <a:graphicFrameLocks xmlns:a="http://schemas.openxmlformats.org/drawingml/2006/main" noChangeAspect="1"/>
+            </wp:cNvGraphicFramePr>
+            <a:graphic xmlns:a="http://schemas.openxmlformats.org/drawingml/2006/main">
+              <a:graphicData uri="http://schemas.openxmlformats.org/drawingml/2006/picture">
+                <pic:pic xmlns:pic="http://schemas.openxmlformats.org/drawingml/2006/picture">
+                  <pic:nvPicPr>
+                    <pic:cNvPr id="0" name="" descr=""/>
+                    <pic:cNvPicPr>
+                      <a:picLocks noChangeAspect="1" noChangeArrowheads="1"/>
+                    </pic:cNvPicPr>
+                  </pic:nvPicPr>
+                  <pic:blipFill>
+                    <a:blip r:embed="rId39" cstate="none"/>
+                    <a:srcRect/>
+                    <a:stretch>
+                      <a:fillRect/>
+                    </a:stretch>
+                  </pic:blipFill>
+                  <pic:spPr bwMode="auto">
+                    <a:xfrm>
+                      <a:off x="0" y="0"/>
+                      <a:ext cx="6096000" cy="3552825"/>
+                    </a:xfrm>
+                    <a:prstGeom prst="rect">
+                      <a:avLst/>
+                    </a:prstGeom>
+                  </pic:spPr>
+                </pic:pic>
+              </a:graphicData>
+            </a:graphic>
+          </wp:inline>
+        </w:drawing>
+      </w:r>
+    </w:p>
+    <w:p>
+      <w:pPr>
+        <w:spacing w:after="220"/>
+        <w:jc w:val="center"/>
+      </w:pPr>
+      <w:r>
+        <w:rPr>
+          <w:i/>
+          <w:iCs/>
+          <w:color w:val="5B6676"/>
+          <w:sz w:val="18"/>
+          <w:szCs w:val="18"/>
+        </w:rPr>
+        <w:t xml:space="preserve">Spread of fake features (1 = real): PC-VAE 0.50 / 0.45, + MC 0.86 / 0.89, + KH 0.95 / 0.98. Rare-class mean error: 0.19 → 0.09 → 0.05 class std (MNIST).</w:t>
+      </w:r>
+    </w:p>
+    <w:p>
+      <w:pPr>
+        <w:spacing w:after="60" w:before="120"/>
+        <w:jc w:val="center"/>
+      </w:pPr>
+      <w:r>
+        <w:drawing>
+          <wp:inline distT="0" distB="0" distL="0" distR="0">
+            <wp:extent cx="5715000" cy="1895475"/>
+            <wp:effectExtent t="0" r="0" b="0" l="0"/>
+            <wp:docPr id="34" name="ev11_fake_separability.png" descr="Class separability F of fake features: GeFL-F 0.10 / 0.28 (classes overlap), PC-VAE 0.78 / 1.36 (too clean), Ours-A 0.35 / 0.62, real 0.33 / 0.61." title="ev11_fake_separability.png"/>
+            <wp:cNvGraphicFramePr>
+              <a:graphicFrameLocks xmlns:a="http://schemas.openxmlformats.org/drawingml/2006/main" noChangeAspect="1"/>
+            </wp:cNvGraphicFramePr>
+            <a:graphic xmlns:a="http://schemas.openxmlformats.org/drawingml/2006/main">
+              <a:graphicData uri="http://schemas.openxmlformats.org/drawingml/2006/picture">
+                <pic:pic xmlns:pic="http://schemas.openxmlformats.org/drawingml/2006/picture">
+                  <pic:nvPicPr>
+                    <pic:cNvPr id="0" name="" descr=""/>
+                    <pic:cNvPicPr>
+                      <a:picLocks noChangeAspect="1" noChangeArrowheads="1"/>
+                    </pic:cNvPicPr>
+                  </pic:nvPicPr>
+                  <pic:blipFill>
+                    <a:blip r:embed="rId40" cstate="none"/>
+                    <a:srcRect/>
+                    <a:stretch>
+                      <a:fillRect/>
+                    </a:stretch>
+                  </pic:blipFill>
+                  <pic:spPr bwMode="auto">
+                    <a:xfrm>
+                      <a:off x="0" y="0"/>
+                      <a:ext cx="5715000" cy="1895475"/>
+                    </a:xfrm>
+                    <a:prstGeom prst="rect">
+                      <a:avLst/>
+                    </a:prstGeom>
+                  </pic:spPr>
+                </pic:pic>
+              </a:graphicData>
+            </a:graphic>
+          </wp:inline>
+        </w:drawing>
+      </w:r>
+    </w:p>
+    <w:p>
+      <w:pPr>
+        <w:spacing w:after="220"/>
+        <w:jc w:val="center"/>
+      </w:pPr>
+      <w:r>
+        <w:rPr>
+          <w:i/>
+          <w:iCs/>
+          <w:color w:val="5B6676"/>
+          <w:sz w:val="18"/>
+          <w:szCs w:val="18"/>
+        </w:rPr>
+        <w:t xml:space="preserve">Class separability F of fake features: GeFL-F 0.10 / 0.28 (classes overlap), PC-VAE 0.78 / 1.36 (too clean), Ours-A 0.35 / 0.62, real 0.33 / 0.61.</w:t>
+      </w:r>
+    </w:p>
+    <w:p>
+      <w:pPr>
+        <w:spacing w:after="60" w:before="120"/>
+        <w:jc w:val="center"/>
+      </w:pPr>
+      <w:r>
+        <w:drawing>
+          <wp:inline distT="0" distB="0" distL="0" distR="0">
+            <wp:extent cx="6096000" cy="3752850"/>
+            <wp:effectExtent t="0" r="0" b="0" l="0"/>
+            <wp:docPr id="35" name="ev04_mmd.png" descr="Distance to real test features (MMD, all classes): GeFL-F 0.22 / 0.25 → PC-VAE 0.18 / 0.19 → + MC 0.086 / 0.092 → + KH 0.069 / 0.074. Lower MMD goes with higher real accuracy (r = −0.75 / −0.51), as Lemma 1 says." title="ev04_mmd.png"/>
+            <wp:cNvGraphicFramePr>
+              <a:graphicFrameLocks xmlns:a="http://schemas.openxmlformats.org/drawingml/2006/main" noChangeAspect="1"/>
+            </wp:cNvGraphicFramePr>
+            <a:graphic xmlns:a="http://schemas.openxmlformats.org/drawingml/2006/main">
+              <a:graphicData uri="http://schemas.openxmlformats.org/drawingml/2006/picture">
+                <pic:pic xmlns:pic="http://schemas.openxmlformats.org/drawingml/2006/picture">
+                  <pic:nvPicPr>
+                    <pic:cNvPr id="0" name="" descr=""/>
+                    <pic:cNvPicPr>
+                      <a:picLocks noChangeAspect="1" noChangeArrowheads="1"/>
+                    </pic:cNvPicPr>
+                  </pic:nvPicPr>
+                  <pic:blipFill>
+                    <a:blip r:embed="rId41" cstate="none"/>
+                    <a:srcRect/>
+                    <a:stretch>
+                      <a:fillRect/>
+                    </a:stretch>
+                  </pic:blipFill>
+                  <pic:spPr bwMode="auto">
+                    <a:xfrm>
+                      <a:off x="0" y="0"/>
+                      <a:ext cx="6096000" cy="3752850"/>
+                    </a:xfrm>
+                    <a:prstGeom prst="rect">
+                      <a:avLst/>
+                    </a:prstGeom>
+                  </pic:spPr>
+                </pic:pic>
+              </a:graphicData>
+            </a:graphic>
+          </wp:inline>
+        </w:drawing>
+      </w:r>
+    </w:p>
+    <w:p>
+      <w:pPr>
+        <w:spacing w:after="220"/>
+        <w:jc w:val="center"/>
+      </w:pPr>
+      <w:r>
+        <w:rPr>
+          <w:i/>
+          <w:iCs/>
+          <w:color w:val="5B6676"/>
+          <w:sz w:val="18"/>
+          <w:szCs w:val="18"/>
+        </w:rPr>
+        <w:t xml:space="preserve">Distance to real test features (MMD, all classes): GeFL-F 0.22 / 0.25 → PC-VAE 0.18 / 0.19 → + MC 0.086 / 0.092 → + KH 0.069 / 0.074. Lower MMD goes with higher real accuracy (r = −0.75 / −0.51), as Lemma 1 says.</w:t>
+      </w:r>
+    </w:p>
+    <w:p>
+      <w:pPr>
+        <w:spacing w:after="60" w:before="120"/>
+        <w:jc w:val="center"/>
+      </w:pPr>
+      <w:r>
+        <w:drawing>
+          <wp:inline distT="0" distB="0" distL="0" distR="0">
+            <wp:extent cx="6096000" cy="2114550"/>
+            <wp:effectExtent t="0" r="0" b="0" l="0"/>
+            <wp:docPr id="36" name="ev05_tstr.png" descr="Head trained only on fake features, tested on real data (balanced accuracy): GeFL-F 59 / 47, + HWA 81 / 74, PC-VAE 92 / 77, + MC 94 / 78, + KH 94 / 78. Rare classes on MNIST: 32 → 91. KH adds little in this test; its gain shows inside the full pipeline (+0.8 / +0.7)." title="ev05_tstr.png"/>
+            <wp:cNvGraphicFramePr>
+              <a:graphicFrameLocks xmlns:a="http://schemas.openxmlformats.org/drawingml/2006/main" noChangeAspect="1"/>
+            </wp:cNvGraphicFramePr>
+            <a:graphic xmlns:a="http://schemas.openxmlformats.org/drawingml/2006/main">
+              <a:graphicData uri="http://schemas.openxmlformats.org/drawingml/2006/picture">
+                <pic:pic xmlns:pic="http://schemas.openxmlformats.org/drawingml/2006/picture">
+                  <pic:nvPicPr>
+                    <pic:cNvPr id="0" name="" descr=""/>
+                    <pic:cNvPicPr>
+                      <a:picLocks noChangeAspect="1" noChangeArrowheads="1"/>
+                    </pic:cNvPicPr>
+                  </pic:nvPicPr>
+                  <pic:blipFill>
+                    <a:blip r:embed="rId42" cstate="none"/>
+                    <a:srcRect/>
+                    <a:stretch>
+                      <a:fillRect/>
+                    </a:stretch>
+                  </pic:blipFill>
+                  <pic:spPr bwMode="auto">
+                    <a:xfrm>
+                      <a:off x="0" y="0"/>
+                      <a:ext cx="6096000" cy="2114550"/>
+                    </a:xfrm>
+                    <a:prstGeom prst="rect">
+                      <a:avLst/>
+                    </a:prstGeom>
+                  </pic:spPr>
+                </pic:pic>
+              </a:graphicData>
+            </a:graphic>
+          </wp:inline>
+        </w:drawing>
+      </w:r>
+    </w:p>
+    <w:p>
+      <w:pPr>
+        <w:spacing w:after="220"/>
+        <w:jc w:val="center"/>
+      </w:pPr>
+      <w:r>
+        <w:rPr>
+          <w:i/>
+          <w:iCs/>
+          <w:color w:val="5B6676"/>
+          <w:sz w:val="18"/>
+          <w:szCs w:val="18"/>
+        </w:rPr>
+        <w:t xml:space="preserve">Head trained only on fake features, tested on real data (balanced accuracy): GeFL-F 59 / 47, + HWA 81 / 74, PC-VAE 92 / 77, + MC 94 / 78, + KH 94 / 78. Rare classes on MNIST: 32 → 91. KH adds little in this test; its gain shows inside the full pipeline (+0.8 / +0.7).</w:t>
+      </w:r>
+    </w:p>
+    <w:p>
+      <w:pPr>
+        <w:spacing w:after="60" w:before="120"/>
+        <w:jc w:val="center"/>
+      </w:pPr>
+      <w:r>
+        <w:drawing>
+          <wp:inline distT="0" distB="0" distL="0" distR="0">
+            <wp:extent cx="6096000" cy="1771650"/>
+            <wp:effectExtent t="0" r="0" b="0" l="0"/>
+            <wp:docPr id="37" name="ev07_rare_class_mnist.png" descr="MNIST's rarest class (24 real samples): GeFL-F's fake class 9 lies on other classes; PC-VAE is on the class but too narrow; MC and KH spread it over the real class." title="ev07_rare_class_mnist.png"/>
+            <wp:cNvGraphicFramePr>
+              <a:graphicFrameLocks xmlns:a="http://schemas.openxmlformats.org/drawingml/2006/main" noChangeAspect="1"/>
+            </wp:cNvGraphicFramePr>
+            <a:graphic xmlns:a="http://schemas.openxmlformats.org/drawingml/2006/main">
+              <a:graphicData uri="http://schemas.openxmlformats.org/drawingml/2006/picture">
+                <pic:pic xmlns:pic="http://schemas.openxmlformats.org/drawingml/2006/picture">
+                  <pic:nvPicPr>
+                    <pic:cNvPr id="0" name="" descr=""/>
+                    <pic:cNvPicPr>
+                      <a:picLocks noChangeAspect="1" noChangeArrowheads="1"/>
+                    </pic:cNvPicPr>
+                  </pic:nvPicPr>
+                  <pic:blipFill>
+                    <a:blip r:embed="rId30" cstate="none"/>
+                    <a:srcRect/>
+                    <a:stretch>
+                      <a:fillRect/>
+                    </a:stretch>
+                  </pic:blipFill>
+                  <pic:spPr bwMode="auto">
+                    <a:xfrm>
+                      <a:off x="0" y="0"/>
+                      <a:ext cx="6096000" cy="1771650"/>
+                    </a:xfrm>
+                    <a:prstGeom prst="rect">
+                      <a:avLst/>
+                    </a:prstGeom>
+                  </pic:spPr>
+                </pic:pic>
+              </a:graphicData>
+            </a:graphic>
+          </wp:inline>
+        </w:drawing>
+      </w:r>
+    </w:p>
+    <w:p>
+      <w:pPr>
+        <w:spacing w:after="220"/>
+        <w:jc w:val="center"/>
+      </w:pPr>
+      <w:r>
+        <w:rPr>
+          <w:i/>
+          <w:iCs/>
+          <w:color w:val="5B6676"/>
+          <w:sz w:val="18"/>
+          <w:szCs w:val="18"/>
+        </w:rPr>
+        <w:t xml:space="preserve">MNIST's rarest class (24 real samples): GeFL-F's fake class 9 lies on other classes; PC-VAE is on the class but too narrow; MC and KH spread it over the real class.</w:t>
+      </w:r>
+    </w:p>
+    <w:p>
+      <w:pPr>
+        <w:spacing w:after="60" w:before="120"/>
+        <w:jc w:val="center"/>
+      </w:pPr>
+      <w:r>
+        <w:drawing>
+          <wp:inline distT="0" distB="0" distL="0" distR="0">
+            <wp:extent cx="6096000" cy="3133725"/>
+            <wp:effectExtent t="0" r="0" b="0" l="0"/>
+            <wp:docPr id="38" name="ev08_la_csl.png" descr="LA (seed 0): balanced accuracy 92.3 → 95.5 (MNIST), 74.0 → 79.2 (FMNIST); correlation between a client's own class shares and its predictions 0.61 → 0.42, 0.67 → 0.54. CSL: the soft target is closer to the real-data referee than the one-hot label (TV 0.098 → 0.088, 0.192 → 0.179)." title="ev08_la_csl.png"/>
+            <wp:cNvGraphicFramePr>
+              <a:graphicFrameLocks xmlns:a="http://schemas.openxmlformats.org/drawingml/2006/main" noChangeAspect="1"/>
+            </wp:cNvGraphicFramePr>
+            <a:graphic xmlns:a="http://schemas.openxmlformats.org/drawingml/2006/main">
+              <a:graphicData uri="http://schemas.openxmlformats.org/drawingml/2006/picture">
+                <pic:pic xmlns:pic="http://schemas.openxmlformats.org/drawingml/2006/picture">
+                  <pic:nvPicPr>
+                    <pic:cNvPr id="0" name="" descr=""/>
+                    <pic:cNvPicPr>
+                      <a:picLocks noChangeAspect="1" noChangeArrowheads="1"/>
+                    </pic:cNvPicPr>
+                  </pic:nvPicPr>
+                  <pic:blipFill>
+                    <a:blip r:embed="rId43" cstate="none"/>
+                    <a:srcRect/>
+                    <a:stretch>
+                      <a:fillRect/>
+                    </a:stretch>
+                  </pic:blipFill>
+                  <pic:spPr bwMode="auto">
+                    <a:xfrm>
+                      <a:off x="0" y="0"/>
+                      <a:ext cx="6096000" cy="3133725"/>
+                    </a:xfrm>
+                    <a:prstGeom prst="rect">
+                      <a:avLst/>
+                    </a:prstGeom>
+                  </pic:spPr>
+                </pic:pic>
+              </a:graphicData>
+            </a:graphic>
+          </wp:inline>
+        </w:drawing>
+      </w:r>
+    </w:p>
+    <w:p>
+      <w:pPr>
+        <w:spacing w:after="220"/>
+        <w:jc w:val="center"/>
+      </w:pPr>
+      <w:r>
+        <w:rPr>
+          <w:i/>
+          <w:iCs/>
+          <w:color w:val="5B6676"/>
+          <w:sz w:val="18"/>
+          <w:szCs w:val="18"/>
+        </w:rPr>
+        <w:t xml:space="preserve">LA (seed 0): balanced accuracy 92.3 → 95.5 (MNIST), 74.0 → 79.2 (FMNIST); correlation between a client's own class shares and its predictions 0.61 → 0.42, 0.67 → 0.54. CSL: the soft target is closer to the real-data referee than the one-hot label (TV 0.098 → 0.088, 0.192 → 0.179).</w:t>
+      </w:r>
+    </w:p>
+    <w:p>
+      <w:pPr>
+        <w:spacing w:after="60" w:before="120"/>
+        <w:jc w:val="center"/>
+      </w:pPr>
+      <w:r>
+        <w:drawing>
+          <wp:inline distT="0" distB="0" distL="0" distR="0">
+            <wp:extent cx="4953000" cy="1733550"/>
+            <wp:effectExtent t="0" r="0" b="0" l="0"/>
+            <wp:docPr id="39" name="ev09_ts.png" descr="More fake training helps more with the better generator (MNIST: −0.05 vs +1.71)." title="ev09_ts.png"/>
+            <wp:cNvGraphicFramePr>
+              <a:graphicFrameLocks xmlns:a="http://schemas.openxmlformats.org/drawingml/2006/main" noChangeAspect="1"/>
+            </wp:cNvGraphicFramePr>
+            <a:graphic xmlns:a="http://schemas.openxmlformats.org/drawingml/2006/main">
+              <a:graphicData uri="http://schemas.openxmlformats.org/drawingml/2006/picture">
+                <pic:pic xmlns:pic="http://schemas.openxmlformats.org/drawingml/2006/picture">
+                  <pic:nvPicPr>
+                    <pic:cNvPr id="0" name="" descr=""/>
+                    <pic:cNvPicPr>
+                      <a:picLocks noChangeAspect="1" noChangeArrowheads="1"/>
+                    </pic:cNvPicPr>
+                  </pic:nvPicPr>
+                  <pic:blipFill>
+                    <a:blip r:embed="rId44" cstate="none"/>
+                    <a:srcRect/>
+                    <a:stretch>
+                      <a:fillRect/>
+                    </a:stretch>
+                  </pic:blipFill>
+                  <pic:spPr bwMode="auto">
+                    <a:xfrm>
+                      <a:off x="0" y="0"/>
+                      <a:ext cx="4953000" cy="1733550"/>
+                    </a:xfrm>
+                    <a:prstGeom prst="rect">
+                      <a:avLst/>
+                    </a:prstGeom>
+                  </pic:spPr>
+                </pic:pic>
+              </a:graphicData>
+            </a:graphic>
+          </wp:inline>
+        </w:drawing>
+      </w:r>
+    </w:p>
+    <w:p>
+      <w:pPr>
+        <w:spacing w:after="220"/>
+        <w:jc w:val="center"/>
+      </w:pPr>
+      <w:r>
+        <w:rPr>
+          <w:i/>
+          <w:iCs/>
+          <w:color w:val="5B6676"/>
+          <w:sz w:val="18"/>
+          <w:szCs w:val="18"/>
+        </w:rPr>
+        <w:t xml:space="preserve">More fake training helps more with the better generator (MNIST: −0.05 vs +1.71).</w:t>
+      </w:r>
+    </w:p>
+    <w:p>
+      <w:pPr>
+        <w:spacing w:after="60" w:before="120"/>
+        <w:jc w:val="center"/>
+      </w:pPr>
+      <w:r>
+        <w:drawing>
+          <wp:inline distT="0" distB="0" distL="0" distR="0">
+            <wp:extent cx="6096000" cy="2828925"/>
+            <wp:effectExtent t="0" r="0" b="0" l="0"/>
+            <wp:docPr id="40" name="ev06_separability.png" descr="How well the exact class mean identifies the class (3 seeds): F = 0.33 / 0.61 / 0.07 / 0.013 and nearest-mean accuracy 81 / 69 / 40 / 13 % on MNIST / FMNIST / CIFAR-10 / SVHN (chance 10 %). SVHN's means carry almost no class information: the reason Ours-A is weak there." title="ev06_separability.png"/>
+            <wp:cNvGraphicFramePr>
+              <a:graphicFrameLocks xmlns:a="http://schemas.openxmlformats.org/drawingml/2006/main" noChangeAspect="1"/>
+            </wp:cNvGraphicFramePr>
+            <a:graphic xmlns:a="http://schemas.openxmlformats.org/drawingml/2006/main">
+              <a:graphicData uri="http://schemas.openxmlformats.org/drawingml/2006/picture">
+                <pic:pic xmlns:pic="http://schemas.openxmlformats.org/drawingml/2006/picture">
+                  <pic:nvPicPr>
+                    <pic:cNvPr id="0" name="" descr=""/>
+                    <pic:cNvPicPr>
+                      <a:picLocks noChangeAspect="1" noChangeArrowheads="1"/>
+                    </pic:cNvPicPr>
+                  </pic:nvPicPr>
+                  <pic:blipFill>
+                    <a:blip r:embed="rId45" cstate="none"/>
+                    <a:srcRect/>
+                    <a:stretch>
+                      <a:fillRect/>
+                    </a:stretch>
+                  </pic:blipFill>
+                  <pic:spPr bwMode="auto">
+                    <a:xfrm>
+                      <a:off x="0" y="0"/>
+                      <a:ext cx="6096000" cy="2828925"/>
+                    </a:xfrm>
+                    <a:prstGeom prst="rect">
+                      <a:avLst/>
+                    </a:prstGeom>
+                  </pic:spPr>
+                </pic:pic>
+              </a:graphicData>
+            </a:graphic>
+          </wp:inline>
+        </w:drawing>
+      </w:r>
+    </w:p>
+    <w:p>
+      <w:pPr>
+        <w:spacing w:after="220"/>
+        <w:jc w:val="center"/>
+      </w:pPr>
+      <w:r>
+        <w:rPr>
+          <w:i/>
+          <w:iCs/>
+          <w:color w:val="5B6676"/>
+          <w:sz w:val="18"/>
+          <w:szCs w:val="18"/>
+        </w:rPr>
+        <w:t xml:space="preserve">How well the exact class mean identifies the class (3 seeds): F = 0.33 / 0.61 / 0.07 / 0.013 and nearest-mean accuracy 81 / 69 / 40 / 13 % on MNIST / FMNIST / CIFAR-10 / SVHN (chance 10 %). SVHN's means carry almost no class information: the reason Ours-A is weak there.</w:t>
       </w:r>
     </w:p>
     <w:p>

</xml_diff>

<commit_message>
Evidence figures and text now from the Kaggle D01 run (NB34, NB35); local run kept as a replication
Co-Authored-By: Claude Opus 5.5 <noreply@anthropic.com>
</commit_message>
<xml_diff>
--- a/docs/professor_report/OursA_Backup_Handout.docx
+++ b/docs/professor_report/OursA_Backup_Handout.docx
@@ -21997,7 +21997,7 @@
         <w:jc w:val="both"/>
       </w:pPr>
       <w:r>
-        <w:t xml:space="preserve">Measured on real features: MNIST and FashionMNIST, long tail, 3 seeds, the same splits as every run. The </w:t>
+        <w:t xml:space="preserve">Measured on real features: MNIST and FashionMNIST, long tail, 3 seeds, the same splits as every run (Kaggle T4; a second run on another GPU gives the same numbers within about 1 point). The </w:t>
       </w:r>
       <w:r>
         <w:rPr>
@@ -22018,9 +22018,9 @@
       <w:r>
         <w:drawing>
           <wp:inline distT="0" distB="0" distL="0" distR="0">
-            <wp:extent cx="6096000" cy="3095625"/>
+            <wp:extent cx="6096000" cy="3105150"/>
             <wp:effectExtent t="0" r="0" b="0" l="0"/>
-            <wp:docPr id="31" name="ev01_collapse.png" descr="Rows of rare classes under FedAvg end at 0.33 (MNIST) and 0.43 (FMNIST) of their start value; with HWA they grow (×1.7, ×2.4). They shrink even when 70–90 % of clients hold the class." title="ev01_collapse.png"/>
+            <wp:docPr id="31" name="ev01_collapse.png" descr="Rows of rare classes under FedAvg end at 0.33 (MNIST) and 0.44 (FMNIST) of their start value; with HWA they grow (×1.7, ×2.4). They shrink even when 70–90 % of clients hold the class." title="ev01_collapse.png"/>
             <wp:cNvGraphicFramePr>
               <a:graphicFrameLocks xmlns:a="http://schemas.openxmlformats.org/drawingml/2006/main" noChangeAspect="1"/>
             </wp:cNvGraphicFramePr>
@@ -22043,7 +22043,7 @@
                   <pic:spPr bwMode="auto">
                     <a:xfrm>
                       <a:off x="0" y="0"/>
-                      <a:ext cx="6096000" cy="3095625"/>
+                      <a:ext cx="6096000" cy="3105150"/>
                     </a:xfrm>
                     <a:prstGeom prst="rect">
                       <a:avLst/>
@@ -22069,7 +22069,7 @@
           <w:sz w:val="18"/>
           <w:szCs w:val="18"/>
         </w:rPr>
-        <w:t xml:space="preserve">Rows of rare classes under FedAvg end at 0.33 (MNIST) and 0.43 (FMNIST) of their start value; with HWA they grow (×1.7, ×2.4). They shrink even when 70–90 % of clients hold the class.</w:t>
+        <w:t xml:space="preserve">Rows of rare classes under FedAvg end at 0.33 (MNIST) and 0.44 (FMNIST) of their start value; with HWA they grow (×1.7, ×2.4). They shrink even when 70–90 % of clients hold the class.</w:t>
       </w:r>
     </w:p>
     <w:p>
@@ -22082,7 +22082,7 @@
           <wp:inline distT="0" distB="0" distL="0" distR="0">
             <wp:extent cx="6096000" cy="3829050"/>
             <wp:effectExtent t="0" r="0" b="0" l="0"/>
-            <wp:docPr id="32" name="ev02_fidelity.png" descr="Rare-class fake samples recognised as their class: GeFL-F 11 % / 21 %, + HWA 33 % / 67 %, PC-VAE 93 % / 90 %, Ours-A 89 % / 80 % (real test features: 96 % / 84 %)." title="ev02_fidelity.png"/>
+            <wp:docPr id="32" name="ev02_fidelity.png" descr="Rare-class fake samples recognised as their class: GeFL-F 10 % / 20 %, + HWA 31 % / 71 %, PC-VAE 93 % / 88 %, Ours-A 90 % / 79 % (real test features: 97 % / 84 %)." title="ev02_fidelity.png"/>
             <wp:cNvGraphicFramePr>
               <a:graphicFrameLocks xmlns:a="http://schemas.openxmlformats.org/drawingml/2006/main" noChangeAspect="1"/>
             </wp:cNvGraphicFramePr>
@@ -22131,7 +22131,7 @@
           <w:sz w:val="18"/>
           <w:szCs w:val="18"/>
         </w:rPr>
-        <w:t xml:space="preserve">Rare-class fake samples recognised as their class: GeFL-F 11 % / 21 %, + HWA 33 % / 67 %, PC-VAE 93 % / 90 %, Ours-A 89 % / 80 % (real test features: 96 % / 84 %).</w:t>
+        <w:t xml:space="preserve">Rare-class fake samples recognised as their class: GeFL-F 10 % / 20 %, + HWA 31 % / 71 %, PC-VAE 93 % / 88 %, Ours-A 90 % / 79 % (real test features: 97 % / 84 %).</w:t>
       </w:r>
     </w:p>
     <w:p>
@@ -22144,7 +22144,7 @@
           <wp:inline distT="0" distB="0" distL="0" distR="0">
             <wp:extent cx="6096000" cy="3552825"/>
             <wp:effectExtent t="0" r="0" b="0" l="0"/>
-            <wp:docPr id="33" name="ev03_moments.png" descr="Spread of fake features (1 = real): PC-VAE 0.50 / 0.45, + MC 0.86 / 0.89, + KH 0.95 / 0.98. Rare-class mean error: 0.19 → 0.09 → 0.05 class std (MNIST)." title="ev03_moments.png"/>
+            <wp:docPr id="33" name="ev03_moments.png" descr="Spread of fake features (1 = real): PC-VAE 0.47 / 0.45, + MC 0.85 / 0.90, + KH 0.95 / 0.98. Rare-class mean error: 0.22 → 0.09 → 0.05 class std (MNIST)." title="ev03_moments.png"/>
             <wp:cNvGraphicFramePr>
               <a:graphicFrameLocks xmlns:a="http://schemas.openxmlformats.org/drawingml/2006/main" noChangeAspect="1"/>
             </wp:cNvGraphicFramePr>
@@ -22193,7 +22193,7 @@
           <w:sz w:val="18"/>
           <w:szCs w:val="18"/>
         </w:rPr>
-        <w:t xml:space="preserve">Spread of fake features (1 = real): PC-VAE 0.50 / 0.45, + MC 0.86 / 0.89, + KH 0.95 / 0.98. Rare-class mean error: 0.19 → 0.09 → 0.05 class std (MNIST).</w:t>
+        <w:t xml:space="preserve">Spread of fake features (1 = real): PC-VAE 0.47 / 0.45, + MC 0.85 / 0.90, + KH 0.95 / 0.98. Rare-class mean error: 0.22 → 0.09 → 0.05 class std (MNIST).</w:t>
       </w:r>
     </w:p>
     <w:p>
@@ -22206,7 +22206,7 @@
           <wp:inline distT="0" distB="0" distL="0" distR="0">
             <wp:extent cx="5715000" cy="1895475"/>
             <wp:effectExtent t="0" r="0" b="0" l="0"/>
-            <wp:docPr id="34" name="ev11_fake_separability.png" descr="Class separability F of fake features: GeFL-F 0.10 / 0.28 (classes overlap), PC-VAE 0.78 / 1.36 (too clean), Ours-A 0.35 / 0.62, real 0.33 / 0.61." title="ev11_fake_separability.png"/>
+            <wp:docPr id="34" name="ev11_fake_separability.png" descr="Class separability F of fake features: GeFL-F 0.09 / 0.32 (classes overlap), PC-VAE 0.78 / 1.35 (too clean), Ours-A 0.32 / 0.61, real 0.30 / 0.60." title="ev11_fake_separability.png"/>
             <wp:cNvGraphicFramePr>
               <a:graphicFrameLocks xmlns:a="http://schemas.openxmlformats.org/drawingml/2006/main" noChangeAspect="1"/>
             </wp:cNvGraphicFramePr>
@@ -22255,7 +22255,7 @@
           <w:sz w:val="18"/>
           <w:szCs w:val="18"/>
         </w:rPr>
-        <w:t xml:space="preserve">Class separability F of fake features: GeFL-F 0.10 / 0.28 (classes overlap), PC-VAE 0.78 / 1.36 (too clean), Ours-A 0.35 / 0.62, real 0.33 / 0.61.</w:t>
+        <w:t xml:space="preserve">Class separability F of fake features: GeFL-F 0.09 / 0.32 (classes overlap), PC-VAE 0.78 / 1.35 (too clean), Ours-A 0.32 / 0.61, real 0.30 / 0.60.</w:t>
       </w:r>
     </w:p>
     <w:p>
@@ -22266,9 +22266,9 @@
       <w:r>
         <w:drawing>
           <wp:inline distT="0" distB="0" distL="0" distR="0">
-            <wp:extent cx="6096000" cy="3752850"/>
+            <wp:extent cx="6096000" cy="3762375"/>
             <wp:effectExtent t="0" r="0" b="0" l="0"/>
-            <wp:docPr id="35" name="ev04_mmd.png" descr="Distance to real test features (MMD, all classes): GeFL-F 0.22 / 0.25 → PC-VAE 0.18 / 0.19 → + MC 0.086 / 0.092 → + KH 0.069 / 0.074. Lower MMD goes with higher real accuracy (r = −0.75 / −0.51), as Lemma 1 says." title="ev04_mmd.png"/>
+            <wp:docPr id="35" name="ev04_mmd.png" descr="Distance to real test features (MMD, all classes): GeFL-F 0.22 / 0.25 → PC-VAE 0.20 / 0.19 → + MC 0.089 / 0.093 → + KH 0.071 / 0.078. Lower MMD goes with higher real accuracy (r = −0.69 / −0.47), as Lemma 1 says." title="ev04_mmd.png"/>
             <wp:cNvGraphicFramePr>
               <a:graphicFrameLocks xmlns:a="http://schemas.openxmlformats.org/drawingml/2006/main" noChangeAspect="1"/>
             </wp:cNvGraphicFramePr>
@@ -22291,7 +22291,7 @@
                   <pic:spPr bwMode="auto">
                     <a:xfrm>
                       <a:off x="0" y="0"/>
-                      <a:ext cx="6096000" cy="3752850"/>
+                      <a:ext cx="6096000" cy="3762375"/>
                     </a:xfrm>
                     <a:prstGeom prst="rect">
                       <a:avLst/>
@@ -22317,7 +22317,7 @@
           <w:sz w:val="18"/>
           <w:szCs w:val="18"/>
         </w:rPr>
-        <w:t xml:space="preserve">Distance to real test features (MMD, all classes): GeFL-F 0.22 / 0.25 → PC-VAE 0.18 / 0.19 → + MC 0.086 / 0.092 → + KH 0.069 / 0.074. Lower MMD goes with higher real accuracy (r = −0.75 / −0.51), as Lemma 1 says.</w:t>
+        <w:t xml:space="preserve">Distance to real test features (MMD, all classes): GeFL-F 0.22 / 0.25 → PC-VAE 0.20 / 0.19 → + MC 0.089 / 0.093 → + KH 0.071 / 0.078. Lower MMD goes with higher real accuracy (r = −0.69 / −0.47), as Lemma 1 says.</w:t>
       </w:r>
     </w:p>
     <w:p>
@@ -22330,7 +22330,7 @@
           <wp:inline distT="0" distB="0" distL="0" distR="0">
             <wp:extent cx="6096000" cy="2114550"/>
             <wp:effectExtent t="0" r="0" b="0" l="0"/>
-            <wp:docPr id="36" name="ev05_tstr.png" descr="Head trained only on fake features, tested on real data (balanced accuracy): GeFL-F 59 / 47, + HWA 81 / 74, PC-VAE 92 / 77, + MC 94 / 78, + KH 94 / 78. Rare classes on MNIST: 32 → 91. KH adds little in this test; its gain shows inside the full pipeline (+0.8 / +0.7)." title="ev05_tstr.png"/>
+            <wp:docPr id="36" name="ev05_tstr.png" descr="Head trained only on fake features, tested on real data (balanced accuracy): GeFL-F 57 / 48, + HWA 81 / 76, PC-VAE 92 / 76, + MC 94 / 77, + KH 94 / 76. Rare classes on MNIST: 32 → 89. KH does not add in this test (−0.2 / −1.1); its gain shows only inside the full pipeline (+0.8 / +0.7)." title="ev05_tstr.png"/>
             <wp:cNvGraphicFramePr>
               <a:graphicFrameLocks xmlns:a="http://schemas.openxmlformats.org/drawingml/2006/main" noChangeAspect="1"/>
             </wp:cNvGraphicFramePr>
@@ -22379,7 +22379,7 @@
           <w:sz w:val="18"/>
           <w:szCs w:val="18"/>
         </w:rPr>
-        <w:t xml:space="preserve">Head trained only on fake features, tested on real data (balanced accuracy): GeFL-F 59 / 47, + HWA 81 / 74, PC-VAE 92 / 77, + MC 94 / 78, + KH 94 / 78. Rare classes on MNIST: 32 → 91. KH adds little in this test; its gain shows inside the full pipeline (+0.8 / +0.7).</w:t>
+        <w:t xml:space="preserve">Head trained only on fake features, tested on real data (balanced accuracy): GeFL-F 57 / 48, + HWA 81 / 76, PC-VAE 92 / 76, + MC 94 / 77, + KH 94 / 76. Rare classes on MNIST: 32 → 89. KH does not add in this test (−0.2 / −1.1); its gain shows only inside the full pipeline (+0.8 / +0.7).</w:t>
       </w:r>
     </w:p>
     <w:p>
@@ -22454,7 +22454,7 @@
           <wp:inline distT="0" distB="0" distL="0" distR="0">
             <wp:extent cx="6096000" cy="3133725"/>
             <wp:effectExtent t="0" r="0" b="0" l="0"/>
-            <wp:docPr id="38" name="ev08_la_csl.png" descr="LA (seed 0): balanced accuracy 92.3 → 95.5 (MNIST), 74.0 → 79.2 (FMNIST); correlation between a client's own class shares and its predictions 0.61 → 0.42, 0.67 → 0.54. CSL: the soft target is closer to the real-data referee than the one-hot label (TV 0.098 → 0.088, 0.192 → 0.179)." title="ev08_la_csl.png"/>
+            <wp:docPr id="38" name="ev08_la_csl.png" descr="LA (seed 0): balanced accuracy 92.0 → 95.2 (MNIST), 75.5 → 79.9 (FMNIST); correlation between a client's own class shares and its predictions 0.64 → 0.44, 0.67 → 0.52. CSL: the soft target is closer to the real-data referee than the one-hot label, lower or equal in every class (TV 0.100 → 0.092, 0.212 → 0.202)." title="ev08_la_csl.png"/>
             <wp:cNvGraphicFramePr>
               <a:graphicFrameLocks xmlns:a="http://schemas.openxmlformats.org/drawingml/2006/main" noChangeAspect="1"/>
             </wp:cNvGraphicFramePr>
@@ -22503,7 +22503,7 @@
           <w:sz w:val="18"/>
           <w:szCs w:val="18"/>
         </w:rPr>
-        <w:t xml:space="preserve">LA (seed 0): balanced accuracy 92.3 → 95.5 (MNIST), 74.0 → 79.2 (FMNIST); correlation between a client's own class shares and its predictions 0.61 → 0.42, 0.67 → 0.54. CSL: the soft target is closer to the real-data referee than the one-hot label (TV 0.098 → 0.088, 0.192 → 0.179).</w:t>
+        <w:t xml:space="preserve">LA (seed 0): balanced accuracy 92.0 → 95.2 (MNIST), 75.5 → 79.9 (FMNIST); correlation between a client's own class shares and its predictions 0.64 → 0.44, 0.67 → 0.52. CSL: the soft target is closer to the real-data referee than the one-hot label, lower or equal in every class (TV 0.100 → 0.092, 0.212 → 0.202).</w:t>
       </w:r>
     </w:p>
     <w:p>
@@ -22578,7 +22578,7 @@
           <wp:inline distT="0" distB="0" distL="0" distR="0">
             <wp:extent cx="6096000" cy="2828925"/>
             <wp:effectExtent t="0" r="0" b="0" l="0"/>
-            <wp:docPr id="40" name="ev06_separability.png" descr="How well the exact class mean identifies the class (3 seeds): F = 0.33 / 0.61 / 0.07 / 0.013 and nearest-mean accuracy 81 / 69 / 40 / 13 % on MNIST / FMNIST / CIFAR-10 / SVHN (chance 10 %). SVHN's means carry almost no class information: the reason Ours-A is weak there." title="ev06_separability.png"/>
+            <wp:docPr id="40" name="ev06_separability.png" descr="How well the exact class mean identifies the class (3 seeds): F = 0.30 / 0.60 / 0.07 / 0.012 and nearest-mean accuracy 82 / 69 / 41 / 12 % on MNIST / FMNIST / CIFAR-10 / SVHN (chance 10 %). SVHN's means carry almost no class information: the reason Ours-A is weak there." title="ev06_separability.png"/>
             <wp:cNvGraphicFramePr>
               <a:graphicFrameLocks xmlns:a="http://schemas.openxmlformats.org/drawingml/2006/main" noChangeAspect="1"/>
             </wp:cNvGraphicFramePr>
@@ -22627,7 +22627,7 @@
           <w:sz w:val="18"/>
           <w:szCs w:val="18"/>
         </w:rPr>
-        <w:t xml:space="preserve">How well the exact class mean identifies the class (3 seeds): F = 0.33 / 0.61 / 0.07 / 0.013 and nearest-mean accuracy 81 / 69 / 40 / 13 % on MNIST / FMNIST / CIFAR-10 / SVHN (chance 10 %). SVHN's means carry almost no class information: the reason Ours-A is weak there.</w:t>
+        <w:t xml:space="preserve">How well the exact class mean identifies the class (3 seeds): F = 0.30 / 0.60 / 0.07 / 0.012 and nearest-mean accuracy 82 / 69 / 41 / 12 % on MNIST / FMNIST / CIFAR-10 / SVHN (chance 10 %). SVHN's means carry almost no class information: the reason Ours-A is weak there.</w:t>
       </w:r>
     </w:p>
     <w:p>

</xml_diff>

<commit_message>
Handout: 'How to read the numbers' section (every measurement in plain words, which ones matter), abbreviations replaced by full names in text, tables and result figures
Co-Authored-By: Claude Opus 5.5 <noreply@anthropic.com>
Claude-Session: https://claude.ai/code/session_01R9DoJK31pgNEQjPmzRPouQ
</commit_message>
<xml_diff>
--- a/docs/professor_report/OursA_Backup_Handout.docx
+++ b/docs/professor_report/OursA_Backup_Handout.docx
@@ -171,7 +171,7 @@
         <w:t xml:space="preserve">Our architecture (Ours-A):</w:t>
       </w:r>
       <w:r>
-        <w:t xml:space="preserve"> class identity from the exact class mean, fake features corrected to exact class statistics, consensus labels, client-prior loss.</w:t>
+        <w:t xml:space="preserve"> class identity from the exact class mean, fake features corrected to exact class statistics, consensus labels, logit adjustment (a loss that cancels each client's own class skew).</w:t>
       </w:r>
     </w:p>
     <w:tbl>
@@ -1284,7 +1284,7 @@
                 <w:sz w:val="18"/>
                 <w:szCs w:val="18"/>
               </w:rPr>
-              <w:t xml:space="preserve">above on MNIST (10/50/100 clients) and CIFAR-10; level on FMNIST; below on SVHN</w:t>
+              <w:t xml:space="preserve">above on MNIST (10/50/100 clients), CIFAR-10 and SVHN (with the switch); level on FashionMNIST</w:t>
             </w:r>
           </w:p>
         </w:tc>
@@ -1379,7 +1379,7 @@
               <w:t xml:space="preserve">last layer</w:t>
             </w:r>
             <w:r>
-              <w:t xml:space="preserve"> of each head. Re-fitting only that layer on real data (a known fix: CCVR, CReFF, Fed3R) lifts GeFL-F to 90.7 / 79.2 / 64.8 (MNIST / FMNIST / SVHN, long tail).</w:t>
+              <w:t xml:space="preserve"> of each head. Re-fitting only that layer on real data (a known fix: CCVR, CReFF, Fed3R) lifts GeFL-F to 90.7 / 79.2 / 64.8 (MNIST / FashionMNIST / SVHN, long tail).</w:t>
             </w:r>
           </w:p>
           <w:p>
@@ -1481,7 +1481,7 @@
               <w:t xml:space="preserve">New Part 6:</w:t>
             </w:r>
             <w:r>
-              <w:t xml:space="preserve"> where the remaining error lives (the last layer), a federated fix from exact statistics (ER), and the stronger baseline above.</w:t>
+              <w:t xml:space="preserve"> where the remaining error lives (the last layer), a federated fix from exact statistics (exact readout), and the stronger baseline above.</w:t>
             </w:r>
           </w:p>
           <w:p>
@@ -1496,7 +1496,7 @@
               <w:t xml:space="preserve">New results:</w:t>
             </w:r>
             <w:r>
-              <w:t xml:space="preserve"> leave-one-out ablation (Part 5.6), SVHN switch (Part 5.7), FashionMNIST at 50 / 100 clients (Part 5.5), covariance version MC-B (Part 8).</w:t>
+              <w:t xml:space="preserve"> leave-one-out ablation (Part 5.6), SVHN switch (Part 5.7), FashionMNIST at 50 / 100 clients (Part 5.5), covariance correction (Part 8).</w:t>
             </w:r>
           </w:p>
           <w:p>
@@ -1529,6 +1529,2714 @@
         <w:spacing w:after="200"/>
       </w:pPr>
       <w:r>
+        <w:t xml:space="preserve">How to read the numbers</w:t>
+      </w:r>
+    </w:p>
+    <w:p>
+      <w:pPr>
+        <w:spacing w:after="120" w:line="276"/>
+        <w:jc w:val="both"/>
+      </w:pPr>
+      <w:r>
+        <w:t xml:space="preserve">This report uses many measurements. Only four of them decide whether the method works; one exists only to compare with the original paper; the rest are </w:t>
+      </w:r>
+      <w:r>
+        <w:rPr>
+          <w:i/>
+          <w:iCs/>
+        </w:rPr>
+        <w:t xml:space="preserve">diagnostics</w:t>
+      </w:r>
+      <w:r>
+        <w:t xml:space="preserve">: they explain why something works or fails, and are not goals in themselves. Every accuracy is in percent; a difference between two accuracies is in </w:t>
+      </w:r>
+      <w:r>
+        <w:rPr>
+          <w:i/>
+          <w:iCs/>
+        </w:rPr>
+        <w:t xml:space="preserve">points</w:t>
+      </w:r>
+      <w:r>
+        <w:t xml:space="preserve"> (79.7 − 58.5 = +21.2 points).</w:t>
+      </w:r>
+    </w:p>
+    <w:p>
+      <w:pPr>
+        <w:pStyle w:val="Heading2"/>
+        <w:keepNext/>
+        <w:spacing w:after="120" w:before="240"/>
+      </w:pPr>
+      <w:r>
+        <w:t xml:space="preserve">A. The numbers that decide whether the method works</w:t>
+      </w:r>
+    </w:p>
+    <w:tbl>
+      <w:tblPr>
+        <w:tblW w:type="dxa" w:w="9638"/>
+        <w:tblBorders>
+          <w:top w:val="single" w:color="auto" w:sz="4"/>
+          <w:left w:val="single" w:color="auto" w:sz="4"/>
+          <w:bottom w:val="single" w:color="auto" w:sz="4"/>
+          <w:right w:val="single" w:color="auto" w:sz="4"/>
+          <w:insideH w:val="single" w:color="auto" w:sz="4"/>
+          <w:insideV w:val="single" w:color="auto" w:sz="4"/>
+        </w:tblBorders>
+      </w:tblPr>
+      <w:tblGrid>
+        <w:gridCol w:w="2209"/>
+        <w:gridCol w:w="4417"/>
+        <w:gridCol w:w="3012"/>
+      </w:tblGrid>
+      <w:tr>
+        <w:trPr>
+          <w:tblHeader/>
+        </w:trPr>
+        <w:tc>
+          <w:tcPr>
+            <w:tcW w:type="dxa" w:w="2209"/>
+            <w:tcBorders>
+              <w:top w:val="single" w:color="BFC7D5" w:sz="4"/>
+              <w:left w:val="single" w:color="BFC7D5" w:sz="4"/>
+              <w:bottom w:val="single" w:color="BFC7D5" w:sz="4"/>
+              <w:right w:val="single" w:color="BFC7D5" w:sz="4"/>
+            </w:tcBorders>
+            <w:shd w:fill="1C4E9A" w:color="auto" w:val="clear"/>
+            <w:tcMar>
+              <w:top w:type="dxa" w:w="60"/>
+              <w:left w:type="dxa" w:w="90"/>
+              <w:bottom w:type="dxa" w:w="60"/>
+              <w:right w:type="dxa" w:w="90"/>
+            </w:tcMar>
+          </w:tcPr>
+          <w:p>
+            <w:pPr>
+              <w:jc w:val="left"/>
+            </w:pPr>
+            <w:r>
+              <w:rPr>
+                <w:b/>
+                <w:bCs/>
+                <w:color w:val="FFFFFF"/>
+                <w:sz w:val="18"/>
+                <w:szCs w:val="18"/>
+              </w:rPr>
+              <w:t xml:space="preserve">Measurement</w:t>
+            </w:r>
+          </w:p>
+        </w:tc>
+        <w:tc>
+          <w:tcPr>
+            <w:tcW w:type="dxa" w:w="4417"/>
+            <w:tcBorders>
+              <w:top w:val="single" w:color="BFC7D5" w:sz="4"/>
+              <w:left w:val="single" w:color="BFC7D5" w:sz="4"/>
+              <w:bottom w:val="single" w:color="BFC7D5" w:sz="4"/>
+              <w:right w:val="single" w:color="BFC7D5" w:sz="4"/>
+            </w:tcBorders>
+            <w:shd w:fill="1C4E9A" w:color="auto" w:val="clear"/>
+            <w:tcMar>
+              <w:top w:type="dxa" w:w="60"/>
+              <w:left w:type="dxa" w:w="90"/>
+              <w:bottom w:type="dxa" w:w="60"/>
+              <w:right w:type="dxa" w:w="90"/>
+            </w:tcMar>
+          </w:tcPr>
+          <w:p>
+            <w:pPr>
+              <w:jc w:val="left"/>
+            </w:pPr>
+            <w:r>
+              <w:rPr>
+                <w:b/>
+                <w:bCs/>
+                <w:color w:val="FFFFFF"/>
+                <w:sz w:val="18"/>
+                <w:szCs w:val="18"/>
+              </w:rPr>
+              <w:t xml:space="preserve">What it measures, in plain words</w:t>
+            </w:r>
+          </w:p>
+        </w:tc>
+        <w:tc>
+          <w:tcPr>
+            <w:tcW w:type="dxa" w:w="3012"/>
+            <w:tcBorders>
+              <w:top w:val="single" w:color="BFC7D5" w:sz="4"/>
+              <w:left w:val="single" w:color="BFC7D5" w:sz="4"/>
+              <w:bottom w:val="single" w:color="BFC7D5" w:sz="4"/>
+              <w:right w:val="single" w:color="BFC7D5" w:sz="4"/>
+            </w:tcBorders>
+            <w:shd w:fill="1C4E9A" w:color="auto" w:val="clear"/>
+            <w:tcMar>
+              <w:top w:type="dxa" w:w="60"/>
+              <w:left w:type="dxa" w:w="90"/>
+              <w:bottom w:type="dxa" w:w="60"/>
+              <w:right w:type="dxa" w:w="90"/>
+            </w:tcMar>
+          </w:tcPr>
+          <w:p>
+            <w:pPr>
+              <w:jc w:val="left"/>
+            </w:pPr>
+            <w:r>
+              <w:rPr>
+                <w:b/>
+                <w:bCs/>
+                <w:color w:val="FFFFFF"/>
+                <w:sz w:val="18"/>
+                <w:szCs w:val="18"/>
+              </w:rPr>
+              <w:t xml:space="preserve">How to read it</w:t>
+            </w:r>
+          </w:p>
+        </w:tc>
+      </w:tr>
+      <w:tr>
+        <w:tc>
+          <w:tcPr>
+            <w:tcW w:type="dxa" w:w="2209"/>
+            <w:tcBorders>
+              <w:top w:val="single" w:color="BFC7D5" w:sz="4"/>
+              <w:left w:val="single" w:color="BFC7D5" w:sz="4"/>
+              <w:bottom w:val="single" w:color="BFC7D5" w:sz="4"/>
+              <w:right w:val="single" w:color="BFC7D5" w:sz="4"/>
+            </w:tcBorders>
+            <w:shd w:fill="FFFFFF" w:color="auto" w:val="clear"/>
+            <w:tcMar>
+              <w:top w:type="dxa" w:w="60"/>
+              <w:left w:type="dxa" w:w="90"/>
+              <w:bottom w:type="dxa" w:w="60"/>
+              <w:right w:type="dxa" w:w="90"/>
+            </w:tcMar>
+          </w:tcPr>
+          <w:p>
+            <w:pPr>
+              <w:jc w:val="left"/>
+            </w:pPr>
+            <w:r>
+              <w:rPr>
+                <w:b/>
+                <w:bCs/>
+                <w:sz w:val="18"/>
+                <w:szCs w:val="18"/>
+              </w:rPr>
+              <w:t xml:space="preserve">Balanced accuracy</w:t>
+            </w:r>
+          </w:p>
+        </w:tc>
+        <w:tc>
+          <w:tcPr>
+            <w:tcW w:type="dxa" w:w="4417"/>
+            <w:tcBorders>
+              <w:top w:val="single" w:color="BFC7D5" w:sz="4"/>
+              <w:left w:val="single" w:color="BFC7D5" w:sz="4"/>
+              <w:bottom w:val="single" w:color="BFC7D5" w:sz="4"/>
+              <w:right w:val="single" w:color="BFC7D5" w:sz="4"/>
+            </w:tcBorders>
+            <w:shd w:fill="FFFFFF" w:color="auto" w:val="clear"/>
+            <w:tcMar>
+              <w:top w:type="dxa" w:w="60"/>
+              <w:left w:type="dxa" w:w="90"/>
+              <w:bottom w:type="dxa" w:w="60"/>
+              <w:right w:type="dxa" w:w="90"/>
+            </w:tcMar>
+          </w:tcPr>
+          <w:p>
+            <w:pPr>
+              <w:jc w:val="left"/>
+            </w:pPr>
+            <w:r>
+              <w:rPr>
+                <w:sz w:val="18"/>
+                <w:szCs w:val="18"/>
+              </w:rPr>
+              <w:t xml:space="preserve">Accuracy on each of the 10 classes separately, then averaged, so a rare class counts as much as a common one. Measured on the test set after the last training round.</w:t>
+            </w:r>
+          </w:p>
+        </w:tc>
+        <w:tc>
+          <w:tcPr>
+            <w:tcW w:type="dxa" w:w="3012"/>
+            <w:tcBorders>
+              <w:top w:val="single" w:color="BFC7D5" w:sz="4"/>
+              <w:left w:val="single" w:color="BFC7D5" w:sz="4"/>
+              <w:bottom w:val="single" w:color="BFC7D5" w:sz="4"/>
+              <w:right w:val="single" w:color="BFC7D5" w:sz="4"/>
+            </w:tcBorders>
+            <w:shd w:fill="FFFFFF" w:color="auto" w:val="clear"/>
+            <w:tcMar>
+              <w:top w:type="dxa" w:w="60"/>
+              <w:left w:type="dxa" w:w="90"/>
+              <w:bottom w:type="dxa" w:w="60"/>
+              <w:right w:type="dxa" w:w="90"/>
+            </w:tcMar>
+          </w:tcPr>
+          <w:p>
+            <w:pPr>
+              <w:jc w:val="left"/>
+            </w:pPr>
+            <w:r>
+              <w:rPr>
+                <w:sz w:val="18"/>
+                <w:szCs w:val="18"/>
+              </w:rPr>
+              <w:t xml:space="preserve">10 = guessing, 100 = perfect. </w:t>
+            </w:r>
+            <w:r>
+              <w:rPr>
+                <w:b/>
+                <w:bCs/>
+                <w:sz w:val="18"/>
+                <w:szCs w:val="18"/>
+              </w:rPr>
+              <w:t xml:space="preserve">The headline number of this report.</w:t>
+            </w:r>
+          </w:p>
+        </w:tc>
+      </w:tr>
+      <w:tr>
+        <w:tc>
+          <w:tcPr>
+            <w:tcW w:type="dxa" w:w="2209"/>
+            <w:tcBorders>
+              <w:top w:val="single" w:color="BFC7D5" w:sz="4"/>
+              <w:left w:val="single" w:color="BFC7D5" w:sz="4"/>
+              <w:bottom w:val="single" w:color="BFC7D5" w:sz="4"/>
+              <w:right w:val="single" w:color="BFC7D5" w:sz="4"/>
+            </w:tcBorders>
+            <w:shd w:fill="F7F9FC" w:color="auto" w:val="clear"/>
+            <w:tcMar>
+              <w:top w:type="dxa" w:w="60"/>
+              <w:left w:type="dxa" w:w="90"/>
+              <w:bottom w:type="dxa" w:w="60"/>
+              <w:right w:type="dxa" w:w="90"/>
+            </w:tcMar>
+          </w:tcPr>
+          <w:p>
+            <w:pPr>
+              <w:jc w:val="left"/>
+            </w:pPr>
+            <w:r>
+              <w:rPr>
+                <w:b/>
+                <w:bCs/>
+                <w:sz w:val="18"/>
+                <w:szCs w:val="18"/>
+              </w:rPr>
+              <w:t xml:space="preserve">Rare-class accuracy</w:t>
+            </w:r>
+            <w:r>
+              <w:rPr>
+                <w:sz w:val="18"/>
+                <w:szCs w:val="18"/>
+              </w:rPr>
+              <w:t xml:space="preserve"> ("tail recall")</w:t>
+            </w:r>
+          </w:p>
+        </w:tc>
+        <w:tc>
+          <w:tcPr>
+            <w:tcW w:type="dxa" w:w="4417"/>
+            <w:tcBorders>
+              <w:top w:val="single" w:color="BFC7D5" w:sz="4"/>
+              <w:left w:val="single" w:color="BFC7D5" w:sz="4"/>
+              <w:bottom w:val="single" w:color="BFC7D5" w:sz="4"/>
+              <w:right w:val="single" w:color="BFC7D5" w:sz="4"/>
+            </w:tcBorders>
+            <w:shd w:fill="F7F9FC" w:color="auto" w:val="clear"/>
+            <w:tcMar>
+              <w:top w:type="dxa" w:w="60"/>
+              <w:left w:type="dxa" w:w="90"/>
+              <w:bottom w:type="dxa" w:w="60"/>
+              <w:right w:type="dxa" w:w="90"/>
+            </w:tcMar>
+          </w:tcPr>
+          <w:p>
+            <w:pPr>
+              <w:jc w:val="left"/>
+            </w:pPr>
+            <w:r>
+              <w:rPr>
+                <w:sz w:val="18"/>
+                <w:szCs w:val="18"/>
+              </w:rPr>
+              <w:t xml:space="preserve">The same, but averaged over the 4 rarest classes only.</w:t>
+            </w:r>
+          </w:p>
+        </w:tc>
+        <w:tc>
+          <w:tcPr>
+            <w:tcW w:type="dxa" w:w="3012"/>
+            <w:tcBorders>
+              <w:top w:val="single" w:color="BFC7D5" w:sz="4"/>
+              <w:left w:val="single" w:color="BFC7D5" w:sz="4"/>
+              <w:bottom w:val="single" w:color="BFC7D5" w:sz="4"/>
+              <w:right w:val="single" w:color="BFC7D5" w:sz="4"/>
+            </w:tcBorders>
+            <w:shd w:fill="F7F9FC" w:color="auto" w:val="clear"/>
+            <w:tcMar>
+              <w:top w:type="dxa" w:w="60"/>
+              <w:left w:type="dxa" w:w="90"/>
+              <w:bottom w:type="dxa" w:w="60"/>
+              <w:right w:type="dxa" w:w="90"/>
+            </w:tcMar>
+          </w:tcPr>
+          <w:p>
+            <w:pPr>
+              <w:jc w:val="left"/>
+            </w:pPr>
+            <w:r>
+              <w:rPr>
+                <w:sz w:val="18"/>
+                <w:szCs w:val="18"/>
+              </w:rPr>
+              <w:t xml:space="preserve">Shows whether the rare classes came back. Close to balanced accuracy = rare classes are no longer neglected.</w:t>
+            </w:r>
+          </w:p>
+        </w:tc>
+      </w:tr>
+      <w:tr>
+        <w:tc>
+          <w:tcPr>
+            <w:tcW w:type="dxa" w:w="2209"/>
+            <w:tcBorders>
+              <w:top w:val="single" w:color="BFC7D5" w:sz="4"/>
+              <w:left w:val="single" w:color="BFC7D5" w:sz="4"/>
+              <w:bottom w:val="single" w:color="BFC7D5" w:sz="4"/>
+              <w:right w:val="single" w:color="BFC7D5" w:sz="4"/>
+            </w:tcBorders>
+            <w:shd w:fill="FFFFFF" w:color="auto" w:val="clear"/>
+            <w:tcMar>
+              <w:top w:type="dxa" w:w="60"/>
+              <w:left w:type="dxa" w:w="90"/>
+              <w:bottom w:type="dxa" w:w="60"/>
+              <w:right w:type="dxa" w:w="90"/>
+            </w:tcMar>
+          </w:tcPr>
+          <w:p>
+            <w:pPr>
+              <w:jc w:val="left"/>
+            </w:pPr>
+            <w:r>
+              <w:rPr>
+                <w:b/>
+                <w:bCs/>
+                <w:sz w:val="18"/>
+                <w:szCs w:val="18"/>
+              </w:rPr>
+              <w:t xml:space="preserve">Gain</w:t>
+            </w:r>
+            <w:r>
+              <w:rPr>
+                <w:sz w:val="18"/>
+                <w:szCs w:val="18"/>
+              </w:rPr>
+              <w:t xml:space="preserve"> (points)</w:t>
+            </w:r>
+          </w:p>
+        </w:tc>
+        <w:tc>
+          <w:tcPr>
+            <w:tcW w:type="dxa" w:w="4417"/>
+            <w:tcBorders>
+              <w:top w:val="single" w:color="BFC7D5" w:sz="4"/>
+              <w:left w:val="single" w:color="BFC7D5" w:sz="4"/>
+              <w:bottom w:val="single" w:color="BFC7D5" w:sz="4"/>
+              <w:right w:val="single" w:color="BFC7D5" w:sz="4"/>
+            </w:tcBorders>
+            <w:shd w:fill="FFFFFF" w:color="auto" w:val="clear"/>
+            <w:tcMar>
+              <w:top w:type="dxa" w:w="60"/>
+              <w:left w:type="dxa" w:w="90"/>
+              <w:bottom w:type="dxa" w:w="60"/>
+              <w:right w:type="dxa" w:w="90"/>
+            </w:tcMar>
+          </w:tcPr>
+          <w:p>
+            <w:pPr>
+              <w:jc w:val="left"/>
+            </w:pPr>
+            <w:r>
+              <w:rPr>
+                <w:sz w:val="18"/>
+                <w:szCs w:val="18"/>
+              </w:rPr>
+              <w:t xml:space="preserve">Accuracy of one method minus another, on the same data splits and starting weights.</w:t>
+            </w:r>
+          </w:p>
+        </w:tc>
+        <w:tc>
+          <w:tcPr>
+            <w:tcW w:type="dxa" w:w="3012"/>
+            <w:tcBorders>
+              <w:top w:val="single" w:color="BFC7D5" w:sz="4"/>
+              <w:left w:val="single" w:color="BFC7D5" w:sz="4"/>
+              <w:bottom w:val="single" w:color="BFC7D5" w:sz="4"/>
+              <w:right w:val="single" w:color="BFC7D5" w:sz="4"/>
+            </w:tcBorders>
+            <w:shd w:fill="FFFFFF" w:color="auto" w:val="clear"/>
+            <w:tcMar>
+              <w:top w:type="dxa" w:w="60"/>
+              <w:left w:type="dxa" w:w="90"/>
+              <w:bottom w:type="dxa" w:w="60"/>
+              <w:right w:type="dxa" w:w="90"/>
+            </w:tcMar>
+          </w:tcPr>
+          <w:p>
+            <w:pPr>
+              <w:jc w:val="left"/>
+            </w:pPr>
+            <w:r>
+              <w:rPr>
+                <w:sz w:val="18"/>
+                <w:szCs w:val="18"/>
+              </w:rPr>
+              <w:t xml:space="preserve">+21 = 21 percentage points better.</w:t>
+            </w:r>
+          </w:p>
+        </w:tc>
+      </w:tr>
+      <w:tr>
+        <w:tc>
+          <w:tcPr>
+            <w:tcW w:type="dxa" w:w="2209"/>
+            <w:tcBorders>
+              <w:top w:val="single" w:color="BFC7D5" w:sz="4"/>
+              <w:left w:val="single" w:color="BFC7D5" w:sz="4"/>
+              <w:bottom w:val="single" w:color="BFC7D5" w:sz="4"/>
+              <w:right w:val="single" w:color="BFC7D5" w:sz="4"/>
+            </w:tcBorders>
+            <w:shd w:fill="F7F9FC" w:color="auto" w:val="clear"/>
+            <w:tcMar>
+              <w:top w:type="dxa" w:w="60"/>
+              <w:left w:type="dxa" w:w="90"/>
+              <w:bottom w:type="dxa" w:w="60"/>
+              <w:right w:type="dxa" w:w="90"/>
+            </w:tcMar>
+          </w:tcPr>
+          <w:p>
+            <w:pPr>
+              <w:jc w:val="left"/>
+            </w:pPr>
+            <w:r>
+              <w:rPr>
+                <w:b/>
+                <w:bCs/>
+                <w:sz w:val="18"/>
+                <w:szCs w:val="18"/>
+              </w:rPr>
+              <w:t xml:space="preserve">± and p-value</w:t>
+            </w:r>
+          </w:p>
+        </w:tc>
+        <w:tc>
+          <w:tcPr>
+            <w:tcW w:type="dxa" w:w="4417"/>
+            <w:tcBorders>
+              <w:top w:val="single" w:color="BFC7D5" w:sz="4"/>
+              <w:left w:val="single" w:color="BFC7D5" w:sz="4"/>
+              <w:bottom w:val="single" w:color="BFC7D5" w:sz="4"/>
+              <w:right w:val="single" w:color="BFC7D5" w:sz="4"/>
+            </w:tcBorders>
+            <w:shd w:fill="F7F9FC" w:color="auto" w:val="clear"/>
+            <w:tcMar>
+              <w:top w:type="dxa" w:w="60"/>
+              <w:left w:type="dxa" w:w="90"/>
+              <w:bottom w:type="dxa" w:w="60"/>
+              <w:right w:type="dxa" w:w="90"/>
+            </w:tcMar>
+          </w:tcPr>
+          <w:p>
+            <w:pPr>
+              <w:jc w:val="left"/>
+            </w:pPr>
+            <w:r>
+              <w:rPr>
+                <w:sz w:val="18"/>
+                <w:szCs w:val="18"/>
+              </w:rPr>
+              <w:t xml:space="preserve">Every result is repeated 3 times with different random splits ("seeds"); ± is the spread over the 3. The p-value asks: if the two methods were really equal, how likely is a difference this consistent?</w:t>
+            </w:r>
+          </w:p>
+        </w:tc>
+        <w:tc>
+          <w:tcPr>
+            <w:tcW w:type="dxa" w:w="3012"/>
+            <w:tcBorders>
+              <w:top w:val="single" w:color="BFC7D5" w:sz="4"/>
+              <w:left w:val="single" w:color="BFC7D5" w:sz="4"/>
+              <w:bottom w:val="single" w:color="BFC7D5" w:sz="4"/>
+              <w:right w:val="single" w:color="BFC7D5" w:sz="4"/>
+            </w:tcBorders>
+            <w:shd w:fill="F7F9FC" w:color="auto" w:val="clear"/>
+            <w:tcMar>
+              <w:top w:type="dxa" w:w="60"/>
+              <w:left w:type="dxa" w:w="90"/>
+              <w:bottom w:type="dxa" w:w="60"/>
+              <w:right w:type="dxa" w:w="90"/>
+            </w:tcMar>
+          </w:tcPr>
+          <w:p>
+            <w:pPr>
+              <w:jc w:val="left"/>
+            </w:pPr>
+            <w:r>
+              <w:rPr>
+                <w:sz w:val="18"/>
+                <w:szCs w:val="18"/>
+              </w:rPr>
+              <w:t xml:space="preserve">± small compared with the gain = trustworthy. p below 0.05 is the usual bar. With only 3 repeats, p-values are rough.</w:t>
+            </w:r>
+          </w:p>
+        </w:tc>
+      </w:tr>
+    </w:tbl>
+    <w:p>
+      <w:pPr>
+        <w:spacing w:after="160"/>
+      </w:pPr>
+    </w:p>
+    <w:p>
+      <w:pPr>
+        <w:pStyle w:val="Heading2"/>
+        <w:keepNext/>
+        <w:spacing w:after="120" w:before="240"/>
+      </w:pPr>
+      <w:r>
+        <w:t xml:space="preserve">B. Only for comparison with the original paper</w:t>
+      </w:r>
+    </w:p>
+    <w:tbl>
+      <w:tblPr>
+        <w:tblW w:type="dxa" w:w="9638"/>
+        <w:tblBorders>
+          <w:top w:val="single" w:color="auto" w:sz="4"/>
+          <w:left w:val="single" w:color="auto" w:sz="4"/>
+          <w:bottom w:val="single" w:color="auto" w:sz="4"/>
+          <w:right w:val="single" w:color="auto" w:sz="4"/>
+          <w:insideH w:val="single" w:color="auto" w:sz="4"/>
+          <w:insideV w:val="single" w:color="auto" w:sz="4"/>
+        </w:tblBorders>
+      </w:tblPr>
+      <w:tblGrid>
+        <w:gridCol w:w="2209"/>
+        <w:gridCol w:w="4417"/>
+        <w:gridCol w:w="3012"/>
+      </w:tblGrid>
+      <w:tr>
+        <w:trPr>
+          <w:tblHeader/>
+        </w:trPr>
+        <w:tc>
+          <w:tcPr>
+            <w:tcW w:type="dxa" w:w="2209"/>
+            <w:tcBorders>
+              <w:top w:val="single" w:color="BFC7D5" w:sz="4"/>
+              <w:left w:val="single" w:color="BFC7D5" w:sz="4"/>
+              <w:bottom w:val="single" w:color="BFC7D5" w:sz="4"/>
+              <w:right w:val="single" w:color="BFC7D5" w:sz="4"/>
+            </w:tcBorders>
+            <w:shd w:fill="1C4E9A" w:color="auto" w:val="clear"/>
+            <w:tcMar>
+              <w:top w:type="dxa" w:w="60"/>
+              <w:left w:type="dxa" w:w="90"/>
+              <w:bottom w:type="dxa" w:w="60"/>
+              <w:right w:type="dxa" w:w="90"/>
+            </w:tcMar>
+          </w:tcPr>
+          <w:p>
+            <w:pPr>
+              <w:jc w:val="left"/>
+            </w:pPr>
+            <w:r>
+              <w:rPr>
+                <w:b/>
+                <w:bCs/>
+                <w:color w:val="FFFFFF"/>
+                <w:sz w:val="18"/>
+                <w:szCs w:val="18"/>
+              </w:rPr>
+              <w:t xml:space="preserve">Measurement</w:t>
+            </w:r>
+          </w:p>
+        </w:tc>
+        <w:tc>
+          <w:tcPr>
+            <w:tcW w:type="dxa" w:w="4417"/>
+            <w:tcBorders>
+              <w:top w:val="single" w:color="BFC7D5" w:sz="4"/>
+              <w:left w:val="single" w:color="BFC7D5" w:sz="4"/>
+              <w:bottom w:val="single" w:color="BFC7D5" w:sz="4"/>
+              <w:right w:val="single" w:color="BFC7D5" w:sz="4"/>
+            </w:tcBorders>
+            <w:shd w:fill="1C4E9A" w:color="auto" w:val="clear"/>
+            <w:tcMar>
+              <w:top w:type="dxa" w:w="60"/>
+              <w:left w:type="dxa" w:w="90"/>
+              <w:bottom w:type="dxa" w:w="60"/>
+              <w:right w:type="dxa" w:w="90"/>
+            </w:tcMar>
+          </w:tcPr>
+          <w:p>
+            <w:pPr>
+              <w:jc w:val="left"/>
+            </w:pPr>
+            <w:r>
+              <w:rPr>
+                <w:b/>
+                <w:bCs/>
+                <w:color w:val="FFFFFF"/>
+                <w:sz w:val="18"/>
+                <w:szCs w:val="18"/>
+              </w:rPr>
+              <w:t xml:space="preserve">What it measures, in plain words</w:t>
+            </w:r>
+          </w:p>
+        </w:tc>
+        <w:tc>
+          <w:tcPr>
+            <w:tcW w:type="dxa" w:w="3012"/>
+            <w:tcBorders>
+              <w:top w:val="single" w:color="BFC7D5" w:sz="4"/>
+              <w:left w:val="single" w:color="BFC7D5" w:sz="4"/>
+              <w:bottom w:val="single" w:color="BFC7D5" w:sz="4"/>
+              <w:right w:val="single" w:color="BFC7D5" w:sz="4"/>
+            </w:tcBorders>
+            <w:shd w:fill="1C4E9A" w:color="auto" w:val="clear"/>
+            <w:tcMar>
+              <w:top w:type="dxa" w:w="60"/>
+              <w:left w:type="dxa" w:w="90"/>
+              <w:bottom w:type="dxa" w:w="60"/>
+              <w:right w:type="dxa" w:w="90"/>
+            </w:tcMar>
+          </w:tcPr>
+          <w:p>
+            <w:pPr>
+              <w:jc w:val="left"/>
+            </w:pPr>
+            <w:r>
+              <w:rPr>
+                <w:b/>
+                <w:bCs/>
+                <w:color w:val="FFFFFF"/>
+                <w:sz w:val="18"/>
+                <w:szCs w:val="18"/>
+              </w:rPr>
+              <w:t xml:space="preserve">How to read it</w:t>
+            </w:r>
+          </w:p>
+        </w:tc>
+      </w:tr>
+      <w:tr>
+        <w:tc>
+          <w:tcPr>
+            <w:tcW w:type="dxa" w:w="2209"/>
+            <w:tcBorders>
+              <w:top w:val="single" w:color="BFC7D5" w:sz="4"/>
+              <w:left w:val="single" w:color="BFC7D5" w:sz="4"/>
+              <w:bottom w:val="single" w:color="BFC7D5" w:sz="4"/>
+              <w:right w:val="single" w:color="BFC7D5" w:sz="4"/>
+            </w:tcBorders>
+            <w:shd w:fill="FFFFFF" w:color="auto" w:val="clear"/>
+            <w:tcMar>
+              <w:top w:type="dxa" w:w="60"/>
+              <w:left w:type="dxa" w:w="90"/>
+              <w:bottom w:type="dxa" w:w="60"/>
+              <w:right w:type="dxa" w:w="90"/>
+            </w:tcMar>
+          </w:tcPr>
+          <w:p>
+            <w:pPr>
+              <w:jc w:val="left"/>
+            </w:pPr>
+            <w:r>
+              <w:rPr>
+                <w:b/>
+                <w:bCs/>
+                <w:sz w:val="18"/>
+                <w:szCs w:val="18"/>
+              </w:rPr>
+              <w:t xml:space="preserve">Paper's accuracy</w:t>
+            </w:r>
+            <w:r>
+              <w:rPr>
+                <w:sz w:val="18"/>
+                <w:szCs w:val="18"/>
+              </w:rPr>
+              <w:t xml:space="preserve"> (best_mean_acc)</w:t>
+            </w:r>
+          </w:p>
+        </w:tc>
+        <w:tc>
+          <w:tcPr>
+            <w:tcW w:type="dxa" w:w="4417"/>
+            <w:tcBorders>
+              <w:top w:val="single" w:color="BFC7D5" w:sz="4"/>
+              <w:left w:val="single" w:color="BFC7D5" w:sz="4"/>
+              <w:bottom w:val="single" w:color="BFC7D5" w:sz="4"/>
+              <w:right w:val="single" w:color="BFC7D5" w:sz="4"/>
+            </w:tcBorders>
+            <w:shd w:fill="FFFFFF" w:color="auto" w:val="clear"/>
+            <w:tcMar>
+              <w:top w:type="dxa" w:w="60"/>
+              <w:left w:type="dxa" w:w="90"/>
+              <w:bottom w:type="dxa" w:w="60"/>
+              <w:right w:type="dxa" w:w="90"/>
+            </w:tcMar>
+          </w:tcPr>
+          <w:p>
+            <w:pPr>
+              <w:jc w:val="left"/>
+            </w:pPr>
+            <w:r>
+              <w:rPr>
+                <w:sz w:val="18"/>
+                <w:szCs w:val="18"/>
+              </w:rPr>
+              <w:t xml:space="preserve">For each of the 10 model types, its best test accuracy over all rounds; then the average of the 10.</w:t>
+            </w:r>
+          </w:p>
+        </w:tc>
+        <w:tc>
+          <w:tcPr>
+            <w:tcW w:type="dxa" w:w="3012"/>
+            <w:tcBorders>
+              <w:top w:val="single" w:color="BFC7D5" w:sz="4"/>
+              <w:left w:val="single" w:color="BFC7D5" w:sz="4"/>
+              <w:bottom w:val="single" w:color="BFC7D5" w:sz="4"/>
+              <w:right w:val="single" w:color="BFC7D5" w:sz="4"/>
+            </w:tcBorders>
+            <w:shd w:fill="FFFFFF" w:color="auto" w:val="clear"/>
+            <w:tcMar>
+              <w:top w:type="dxa" w:w="60"/>
+              <w:left w:type="dxa" w:w="90"/>
+              <w:bottom w:type="dxa" w:w="60"/>
+              <w:right w:type="dxa" w:w="90"/>
+            </w:tcMar>
+          </w:tcPr>
+          <w:p>
+            <w:pPr>
+              <w:jc w:val="left"/>
+            </w:pPr>
+            <w:r>
+              <w:rPr>
+                <w:sz w:val="18"/>
+                <w:szCs w:val="18"/>
+              </w:rPr>
+              <w:t xml:space="preserve">Optimistic, because it picks the best round by looking at the test set. We use it only where we compare with the paper's own tables; our own claims use balanced accuracy at the last round.</w:t>
+            </w:r>
+          </w:p>
+        </w:tc>
+      </w:tr>
+    </w:tbl>
+    <w:p>
+      <w:pPr>
+        <w:spacing w:after="160"/>
+      </w:pPr>
+    </w:p>
+    <w:p>
+      <w:pPr>
+        <w:pStyle w:val="Heading2"/>
+        <w:keepNext/>
+        <w:spacing w:after="120" w:before="240"/>
+      </w:pPr>
+      <w:r>
+        <w:t xml:space="preserve">C. Diagnostics: why it works or fails</w:t>
+      </w:r>
+    </w:p>
+    <w:tbl>
+      <w:tblPr>
+        <w:tblW w:type="dxa" w:w="9638"/>
+        <w:tblBorders>
+          <w:top w:val="single" w:color="auto" w:sz="4"/>
+          <w:left w:val="single" w:color="auto" w:sz="4"/>
+          <w:bottom w:val="single" w:color="auto" w:sz="4"/>
+          <w:right w:val="single" w:color="auto" w:sz="4"/>
+          <w:insideH w:val="single" w:color="auto" w:sz="4"/>
+          <w:insideV w:val="single" w:color="auto" w:sz="4"/>
+        </w:tblBorders>
+      </w:tblPr>
+      <w:tblGrid>
+        <w:gridCol w:w="2209"/>
+        <w:gridCol w:w="4417"/>
+        <w:gridCol w:w="3012"/>
+      </w:tblGrid>
+      <w:tr>
+        <w:trPr>
+          <w:tblHeader/>
+        </w:trPr>
+        <w:tc>
+          <w:tcPr>
+            <w:tcW w:type="dxa" w:w="2209"/>
+            <w:tcBorders>
+              <w:top w:val="single" w:color="BFC7D5" w:sz="4"/>
+              <w:left w:val="single" w:color="BFC7D5" w:sz="4"/>
+              <w:bottom w:val="single" w:color="BFC7D5" w:sz="4"/>
+              <w:right w:val="single" w:color="BFC7D5" w:sz="4"/>
+            </w:tcBorders>
+            <w:shd w:fill="1C4E9A" w:color="auto" w:val="clear"/>
+            <w:tcMar>
+              <w:top w:type="dxa" w:w="60"/>
+              <w:left w:type="dxa" w:w="90"/>
+              <w:bottom w:type="dxa" w:w="60"/>
+              <w:right w:type="dxa" w:w="90"/>
+            </w:tcMar>
+          </w:tcPr>
+          <w:p>
+            <w:pPr>
+              <w:jc w:val="left"/>
+            </w:pPr>
+            <w:r>
+              <w:rPr>
+                <w:b/>
+                <w:bCs/>
+                <w:color w:val="FFFFFF"/>
+                <w:sz w:val="18"/>
+                <w:szCs w:val="18"/>
+              </w:rPr>
+              <w:t xml:space="preserve">Measurement</w:t>
+            </w:r>
+          </w:p>
+        </w:tc>
+        <w:tc>
+          <w:tcPr>
+            <w:tcW w:type="dxa" w:w="4417"/>
+            <w:tcBorders>
+              <w:top w:val="single" w:color="BFC7D5" w:sz="4"/>
+              <w:left w:val="single" w:color="BFC7D5" w:sz="4"/>
+              <w:bottom w:val="single" w:color="BFC7D5" w:sz="4"/>
+              <w:right w:val="single" w:color="BFC7D5" w:sz="4"/>
+            </w:tcBorders>
+            <w:shd w:fill="1C4E9A" w:color="auto" w:val="clear"/>
+            <w:tcMar>
+              <w:top w:type="dxa" w:w="60"/>
+              <w:left w:type="dxa" w:w="90"/>
+              <w:bottom w:type="dxa" w:w="60"/>
+              <w:right w:type="dxa" w:w="90"/>
+            </w:tcMar>
+          </w:tcPr>
+          <w:p>
+            <w:pPr>
+              <w:jc w:val="left"/>
+            </w:pPr>
+            <w:r>
+              <w:rPr>
+                <w:b/>
+                <w:bCs/>
+                <w:color w:val="FFFFFF"/>
+                <w:sz w:val="18"/>
+                <w:szCs w:val="18"/>
+              </w:rPr>
+              <w:t xml:space="preserve">What it measures, in plain words</w:t>
+            </w:r>
+          </w:p>
+        </w:tc>
+        <w:tc>
+          <w:tcPr>
+            <w:tcW w:type="dxa" w:w="3012"/>
+            <w:tcBorders>
+              <w:top w:val="single" w:color="BFC7D5" w:sz="4"/>
+              <w:left w:val="single" w:color="BFC7D5" w:sz="4"/>
+              <w:bottom w:val="single" w:color="BFC7D5" w:sz="4"/>
+              <w:right w:val="single" w:color="BFC7D5" w:sz="4"/>
+            </w:tcBorders>
+            <w:shd w:fill="1C4E9A" w:color="auto" w:val="clear"/>
+            <w:tcMar>
+              <w:top w:type="dxa" w:w="60"/>
+              <w:left w:type="dxa" w:w="90"/>
+              <w:bottom w:type="dxa" w:w="60"/>
+              <w:right w:type="dxa" w:w="90"/>
+            </w:tcMar>
+          </w:tcPr>
+          <w:p>
+            <w:pPr>
+              <w:jc w:val="left"/>
+            </w:pPr>
+            <w:r>
+              <w:rPr>
+                <w:b/>
+                <w:bCs/>
+                <w:color w:val="FFFFFF"/>
+                <w:sz w:val="18"/>
+                <w:szCs w:val="18"/>
+              </w:rPr>
+              <w:t xml:space="preserve">How to read it</w:t>
+            </w:r>
+          </w:p>
+        </w:tc>
+      </w:tr>
+      <w:tr>
+        <w:tc>
+          <w:tcPr>
+            <w:tcW w:type="dxa" w:w="2209"/>
+            <w:tcBorders>
+              <w:top w:val="single" w:color="BFC7D5" w:sz="4"/>
+              <w:left w:val="single" w:color="BFC7D5" w:sz="4"/>
+              <w:bottom w:val="single" w:color="BFC7D5" w:sz="4"/>
+              <w:right w:val="single" w:color="BFC7D5" w:sz="4"/>
+            </w:tcBorders>
+            <w:shd w:fill="FFFFFF" w:color="auto" w:val="clear"/>
+            <w:tcMar>
+              <w:top w:type="dxa" w:w="60"/>
+              <w:left w:type="dxa" w:w="90"/>
+              <w:bottom w:type="dxa" w:w="60"/>
+              <w:right w:type="dxa" w:w="90"/>
+            </w:tcMar>
+          </w:tcPr>
+          <w:p>
+            <w:pPr>
+              <w:jc w:val="left"/>
+            </w:pPr>
+            <w:r>
+              <w:rPr>
+                <w:b/>
+                <w:bCs/>
+                <w:sz w:val="18"/>
+                <w:szCs w:val="18"/>
+              </w:rPr>
+              <w:t xml:space="preserve">Row length ratio</w:t>
+            </w:r>
+            <w:r>
+              <w:rPr>
+                <w:sz w:val="18"/>
+                <w:szCs w:val="18"/>
+              </w:rPr>
+              <w:t xml:space="preserve"> (rare / common)</w:t>
+            </w:r>
+          </w:p>
+        </w:tc>
+        <w:tc>
+          <w:tcPr>
+            <w:tcW w:type="dxa" w:w="4417"/>
+            <w:tcBorders>
+              <w:top w:val="single" w:color="BFC7D5" w:sz="4"/>
+              <w:left w:val="single" w:color="BFC7D5" w:sz="4"/>
+              <w:bottom w:val="single" w:color="BFC7D5" w:sz="4"/>
+              <w:right w:val="single" w:color="BFC7D5" w:sz="4"/>
+            </w:tcBorders>
+            <w:shd w:fill="FFFFFF" w:color="auto" w:val="clear"/>
+            <w:tcMar>
+              <w:top w:type="dxa" w:w="60"/>
+              <w:left w:type="dxa" w:w="90"/>
+              <w:bottom w:type="dxa" w:w="60"/>
+              <w:right w:type="dxa" w:w="90"/>
+            </w:tcMar>
+          </w:tcPr>
+          <w:p>
+            <w:pPr>
+              <w:jc w:val="left"/>
+            </w:pPr>
+            <w:r>
+              <w:rPr>
+                <w:sz w:val="18"/>
+                <w:szCs w:val="18"/>
+              </w:rPr>
+              <w:t xml:space="preserve">The original generator stores each class as a row of 512 numbers. We compare the length of the rows of rare classes with those of common classes.</w:t>
+            </w:r>
+          </w:p>
+        </w:tc>
+        <w:tc>
+          <w:tcPr>
+            <w:tcW w:type="dxa" w:w="3012"/>
+            <w:tcBorders>
+              <w:top w:val="single" w:color="BFC7D5" w:sz="4"/>
+              <w:left w:val="single" w:color="BFC7D5" w:sz="4"/>
+              <w:bottom w:val="single" w:color="BFC7D5" w:sz="4"/>
+              <w:right w:val="single" w:color="BFC7D5" w:sz="4"/>
+            </w:tcBorders>
+            <w:shd w:fill="FFFFFF" w:color="auto" w:val="clear"/>
+            <w:tcMar>
+              <w:top w:type="dxa" w:w="60"/>
+              <w:left w:type="dxa" w:w="90"/>
+              <w:bottom w:type="dxa" w:w="60"/>
+              <w:right w:type="dxa" w:w="90"/>
+            </w:tcMar>
+          </w:tcPr>
+          <w:p>
+            <w:pPr>
+              <w:jc w:val="left"/>
+            </w:pPr>
+            <w:r>
+              <w:rPr>
+                <w:sz w:val="18"/>
+                <w:szCs w:val="18"/>
+              </w:rPr>
+              <w:t xml:space="preserve">1 = rare classes treated like common ones. 0.2 = rare-class rows shrank to a fifth: the generator can no longer tell rare classes apart. </w:t>
+            </w:r>
+            <w:r>
+              <w:rPr>
+                <w:b/>
+                <w:bCs/>
+                <w:sz w:val="18"/>
+                <w:szCs w:val="18"/>
+              </w:rPr>
+              <w:t xml:space="preserve">Proof of the collapse</w:t>
+            </w:r>
+            <w:r>
+              <w:rPr>
+                <w:sz w:val="18"/>
+                <w:szCs w:val="18"/>
+              </w:rPr>
+              <w:t xml:space="preserve"> (Part 2).</w:t>
+            </w:r>
+          </w:p>
+        </w:tc>
+      </w:tr>
+      <w:tr>
+        <w:tc>
+          <w:tcPr>
+            <w:tcW w:type="dxa" w:w="2209"/>
+            <w:tcBorders>
+              <w:top w:val="single" w:color="BFC7D5" w:sz="4"/>
+              <w:left w:val="single" w:color="BFC7D5" w:sz="4"/>
+              <w:bottom w:val="single" w:color="BFC7D5" w:sz="4"/>
+              <w:right w:val="single" w:color="BFC7D5" w:sz="4"/>
+            </w:tcBorders>
+            <w:shd w:fill="F7F9FC" w:color="auto" w:val="clear"/>
+            <w:tcMar>
+              <w:top w:type="dxa" w:w="60"/>
+              <w:left w:type="dxa" w:w="90"/>
+              <w:bottom w:type="dxa" w:w="60"/>
+              <w:right w:type="dxa" w:w="90"/>
+            </w:tcMar>
+          </w:tcPr>
+          <w:p>
+            <w:pPr>
+              <w:jc w:val="left"/>
+            </w:pPr>
+            <w:r>
+              <w:rPr>
+                <w:b/>
+                <w:bCs/>
+                <w:sz w:val="18"/>
+                <w:szCs w:val="18"/>
+              </w:rPr>
+              <w:t xml:space="preserve">Holder gain / non-holder loss, and the threshold θ</w:t>
+            </w:r>
+          </w:p>
+        </w:tc>
+        <w:tc>
+          <w:tcPr>
+            <w:tcW w:type="dxa" w:w="4417"/>
+            <w:tcBorders>
+              <w:top w:val="single" w:color="BFC7D5" w:sz="4"/>
+              <w:left w:val="single" w:color="BFC7D5" w:sz="4"/>
+              <w:bottom w:val="single" w:color="BFC7D5" w:sz="4"/>
+              <w:right w:val="single" w:color="BFC7D5" w:sz="4"/>
+            </w:tcBorders>
+            <w:shd w:fill="F7F9FC" w:color="auto" w:val="clear"/>
+            <w:tcMar>
+              <w:top w:type="dxa" w:w="60"/>
+              <w:left w:type="dxa" w:w="90"/>
+              <w:bottom w:type="dxa" w:w="60"/>
+              <w:right w:type="dxa" w:w="90"/>
+            </w:tcMar>
+          </w:tcPr>
+          <w:p>
+            <w:pPr>
+              <w:jc w:val="left"/>
+            </w:pPr>
+            <w:r>
+              <w:rPr>
+                <w:sz w:val="18"/>
+                <w:szCs w:val="18"/>
+              </w:rPr>
+              <w:t xml:space="preserve">Per round: how much the clients that have a class lengthen its row, against how much the clients without it shorten it. θ is the share of clients that must have the class for the row not to shrink.</w:t>
+            </w:r>
+          </w:p>
+        </w:tc>
+        <w:tc>
+          <w:tcPr>
+            <w:tcW w:type="dxa" w:w="3012"/>
+            <w:tcBorders>
+              <w:top w:val="single" w:color="BFC7D5" w:sz="4"/>
+              <w:left w:val="single" w:color="BFC7D5" w:sz="4"/>
+              <w:bottom w:val="single" w:color="BFC7D5" w:sz="4"/>
+              <w:right w:val="single" w:color="BFC7D5" w:sz="4"/>
+            </w:tcBorders>
+            <w:shd w:fill="F7F9FC" w:color="auto" w:val="clear"/>
+            <w:tcMar>
+              <w:top w:type="dxa" w:w="60"/>
+              <w:left w:type="dxa" w:w="90"/>
+              <w:bottom w:type="dxa" w:w="60"/>
+              <w:right w:type="dxa" w:w="90"/>
+            </w:tcMar>
+          </w:tcPr>
+          <w:p>
+            <w:pPr>
+              <w:jc w:val="left"/>
+            </w:pPr>
+            <w:r>
+              <w:rPr>
+                <w:sz w:val="18"/>
+                <w:szCs w:val="18"/>
+              </w:rPr>
+              <w:t xml:space="preserve">Measured θ = 0.61–0.93: a rare class shrinks unless 61–93 % of clients have it, not 50 % as we first claimed.</w:t>
+            </w:r>
+          </w:p>
+        </w:tc>
+      </w:tr>
+      <w:tr>
+        <w:tc>
+          <w:tcPr>
+            <w:tcW w:type="dxa" w:w="2209"/>
+            <w:tcBorders>
+              <w:top w:val="single" w:color="BFC7D5" w:sz="4"/>
+              <w:left w:val="single" w:color="BFC7D5" w:sz="4"/>
+              <w:bottom w:val="single" w:color="BFC7D5" w:sz="4"/>
+              <w:right w:val="single" w:color="BFC7D5" w:sz="4"/>
+            </w:tcBorders>
+            <w:shd w:fill="FFFFFF" w:color="auto" w:val="clear"/>
+            <w:tcMar>
+              <w:top w:type="dxa" w:w="60"/>
+              <w:left w:type="dxa" w:w="90"/>
+              <w:bottom w:type="dxa" w:w="60"/>
+              <w:right w:type="dxa" w:w="90"/>
+            </w:tcMar>
+          </w:tcPr>
+          <w:p>
+            <w:pPr>
+              <w:jc w:val="left"/>
+            </w:pPr>
+            <w:r>
+              <w:rPr>
+                <w:b/>
+                <w:bCs/>
+                <w:sz w:val="18"/>
+                <w:szCs w:val="18"/>
+              </w:rPr>
+              <w:t xml:space="preserve">Fake-sample correctness</w:t>
+            </w:r>
+            <w:r>
+              <w:rPr>
+                <w:sz w:val="18"/>
+                <w:szCs w:val="18"/>
+              </w:rPr>
+              <w:t xml:space="preserve"> ("fidelity")</w:t>
+            </w:r>
+          </w:p>
+        </w:tc>
+        <w:tc>
+          <w:tcPr>
+            <w:tcW w:type="dxa" w:w="4417"/>
+            <w:tcBorders>
+              <w:top w:val="single" w:color="BFC7D5" w:sz="4"/>
+              <w:left w:val="single" w:color="BFC7D5" w:sz="4"/>
+              <w:bottom w:val="single" w:color="BFC7D5" w:sz="4"/>
+              <w:right w:val="single" w:color="BFC7D5" w:sz="4"/>
+            </w:tcBorders>
+            <w:shd w:fill="FFFFFF" w:color="auto" w:val="clear"/>
+            <w:tcMar>
+              <w:top w:type="dxa" w:w="60"/>
+              <w:left w:type="dxa" w:w="90"/>
+              <w:bottom w:type="dxa" w:w="60"/>
+              <w:right w:type="dxa" w:w="90"/>
+            </w:tcMar>
+          </w:tcPr>
+          <w:p>
+            <w:pPr>
+              <w:jc w:val="left"/>
+            </w:pPr>
+            <w:r>
+              <w:rPr>
+                <w:sz w:val="18"/>
+                <w:szCs w:val="18"/>
+              </w:rPr>
+              <w:t xml:space="preserve">A separate judge classifier, trained only on real data and never used in training, labels the generator's fake samples of a rare class. Share it labels correctly.</w:t>
+            </w:r>
+          </w:p>
+        </w:tc>
+        <w:tc>
+          <w:tcPr>
+            <w:tcW w:type="dxa" w:w="3012"/>
+            <w:tcBorders>
+              <w:top w:val="single" w:color="BFC7D5" w:sz="4"/>
+              <w:left w:val="single" w:color="BFC7D5" w:sz="4"/>
+              <w:bottom w:val="single" w:color="BFC7D5" w:sz="4"/>
+              <w:right w:val="single" w:color="BFC7D5" w:sz="4"/>
+            </w:tcBorders>
+            <w:shd w:fill="FFFFFF" w:color="auto" w:val="clear"/>
+            <w:tcMar>
+              <w:top w:type="dxa" w:w="60"/>
+              <w:left w:type="dxa" w:w="90"/>
+              <w:bottom w:type="dxa" w:w="60"/>
+              <w:right w:type="dxa" w:w="90"/>
+            </w:tcMar>
+          </w:tcPr>
+          <w:p>
+            <w:pPr>
+              <w:jc w:val="left"/>
+            </w:pPr>
+            <w:r>
+              <w:rPr>
+                <w:sz w:val="18"/>
+                <w:szCs w:val="18"/>
+              </w:rPr>
+              <w:t xml:space="preserve">10 % = fakes look like random classes. Ceiling = the judge's score on real data (97 % MNIST, 84 % FashionMNIST).</w:t>
+            </w:r>
+          </w:p>
+        </w:tc>
+      </w:tr>
+      <w:tr>
+        <w:tc>
+          <w:tcPr>
+            <w:tcW w:type="dxa" w:w="2209"/>
+            <w:tcBorders>
+              <w:top w:val="single" w:color="BFC7D5" w:sz="4"/>
+              <w:left w:val="single" w:color="BFC7D5" w:sz="4"/>
+              <w:bottom w:val="single" w:color="BFC7D5" w:sz="4"/>
+              <w:right w:val="single" w:color="BFC7D5" w:sz="4"/>
+            </w:tcBorders>
+            <w:shd w:fill="F7F9FC" w:color="auto" w:val="clear"/>
+            <w:tcMar>
+              <w:top w:type="dxa" w:w="60"/>
+              <w:left w:type="dxa" w:w="90"/>
+              <w:bottom w:type="dxa" w:w="60"/>
+              <w:right w:type="dxa" w:w="90"/>
+            </w:tcMar>
+          </w:tcPr>
+          <w:p>
+            <w:pPr>
+              <w:jc w:val="left"/>
+            </w:pPr>
+            <w:r>
+              <w:rPr>
+                <w:b/>
+                <w:bCs/>
+                <w:sz w:val="18"/>
+                <w:szCs w:val="18"/>
+              </w:rPr>
+              <w:t xml:space="preserve">Spread ratio</w:t>
+            </w:r>
+          </w:p>
+        </w:tc>
+        <w:tc>
+          <w:tcPr>
+            <w:tcW w:type="dxa" w:w="4417"/>
+            <w:tcBorders>
+              <w:top w:val="single" w:color="BFC7D5" w:sz="4"/>
+              <w:left w:val="single" w:color="BFC7D5" w:sz="4"/>
+              <w:bottom w:val="single" w:color="BFC7D5" w:sz="4"/>
+              <w:right w:val="single" w:color="BFC7D5" w:sz="4"/>
+            </w:tcBorders>
+            <w:shd w:fill="F7F9FC" w:color="auto" w:val="clear"/>
+            <w:tcMar>
+              <w:top w:type="dxa" w:w="60"/>
+              <w:left w:type="dxa" w:w="90"/>
+              <w:bottom w:type="dxa" w:w="60"/>
+              <w:right w:type="dxa" w:w="90"/>
+            </w:tcMar>
+          </w:tcPr>
+          <w:p>
+            <w:pPr>
+              <w:jc w:val="left"/>
+            </w:pPr>
+            <w:r>
+              <w:rPr>
+                <w:sz w:val="18"/>
+                <w:szCs w:val="18"/>
+              </w:rPr>
+              <w:t xml:space="preserve">How varied the fake samples of a class are, divided by how varied the real ones are.</w:t>
+            </w:r>
+          </w:p>
+        </w:tc>
+        <w:tc>
+          <w:tcPr>
+            <w:tcW w:type="dxa" w:w="3012"/>
+            <w:tcBorders>
+              <w:top w:val="single" w:color="BFC7D5" w:sz="4"/>
+              <w:left w:val="single" w:color="BFC7D5" w:sz="4"/>
+              <w:bottom w:val="single" w:color="BFC7D5" w:sz="4"/>
+              <w:right w:val="single" w:color="BFC7D5" w:sz="4"/>
+            </w:tcBorders>
+            <w:shd w:fill="F7F9FC" w:color="auto" w:val="clear"/>
+            <w:tcMar>
+              <w:top w:type="dxa" w:w="60"/>
+              <w:left w:type="dxa" w:w="90"/>
+              <w:bottom w:type="dxa" w:w="60"/>
+              <w:right w:type="dxa" w:w="90"/>
+            </w:tcMar>
+          </w:tcPr>
+          <w:p>
+            <w:pPr>
+              <w:jc w:val="left"/>
+            </w:pPr>
+            <w:r>
+              <w:rPr>
+                <w:sz w:val="18"/>
+                <w:szCs w:val="18"/>
+              </w:rPr>
+              <w:t xml:space="preserve">1 = right variety. 0.45 = fakes too similar to each other.</w:t>
+            </w:r>
+          </w:p>
+        </w:tc>
+      </w:tr>
+      <w:tr>
+        <w:tc>
+          <w:tcPr>
+            <w:tcW w:type="dxa" w:w="2209"/>
+            <w:tcBorders>
+              <w:top w:val="single" w:color="BFC7D5" w:sz="4"/>
+              <w:left w:val="single" w:color="BFC7D5" w:sz="4"/>
+              <w:bottom w:val="single" w:color="BFC7D5" w:sz="4"/>
+              <w:right w:val="single" w:color="BFC7D5" w:sz="4"/>
+            </w:tcBorders>
+            <w:shd w:fill="FFFFFF" w:color="auto" w:val="clear"/>
+            <w:tcMar>
+              <w:top w:type="dxa" w:w="60"/>
+              <w:left w:type="dxa" w:w="90"/>
+              <w:bottom w:type="dxa" w:w="60"/>
+              <w:right w:type="dxa" w:w="90"/>
+            </w:tcMar>
+          </w:tcPr>
+          <w:p>
+            <w:pPr>
+              <w:jc w:val="left"/>
+            </w:pPr>
+            <w:r>
+              <w:rPr>
+                <w:b/>
+                <w:bCs/>
+                <w:sz w:val="18"/>
+                <w:szCs w:val="18"/>
+              </w:rPr>
+              <w:t xml:space="preserve">Fake-to-real distance</w:t>
+            </w:r>
+            <w:r>
+              <w:rPr>
+                <w:sz w:val="18"/>
+                <w:szCs w:val="18"/>
+              </w:rPr>
+              <w:t xml:space="preserve"> (maximum mean discrepancy)</w:t>
+            </w:r>
+          </w:p>
+        </w:tc>
+        <w:tc>
+          <w:tcPr>
+            <w:tcW w:type="dxa" w:w="4417"/>
+            <w:tcBorders>
+              <w:top w:val="single" w:color="BFC7D5" w:sz="4"/>
+              <w:left w:val="single" w:color="BFC7D5" w:sz="4"/>
+              <w:bottom w:val="single" w:color="BFC7D5" w:sz="4"/>
+              <w:right w:val="single" w:color="BFC7D5" w:sz="4"/>
+            </w:tcBorders>
+            <w:shd w:fill="FFFFFF" w:color="auto" w:val="clear"/>
+            <w:tcMar>
+              <w:top w:type="dxa" w:w="60"/>
+              <w:left w:type="dxa" w:w="90"/>
+              <w:bottom w:type="dxa" w:w="60"/>
+              <w:right w:type="dxa" w:w="90"/>
+            </w:tcMar>
+          </w:tcPr>
+          <w:p>
+            <w:pPr>
+              <w:jc w:val="left"/>
+            </w:pPr>
+            <w:r>
+              <w:rPr>
+                <w:sz w:val="18"/>
+                <w:szCs w:val="18"/>
+              </w:rPr>
+              <w:t xml:space="preserve">One number for how different the whole cloud of fake features is from the cloud of real features.</w:t>
+            </w:r>
+          </w:p>
+        </w:tc>
+        <w:tc>
+          <w:tcPr>
+            <w:tcW w:type="dxa" w:w="3012"/>
+            <w:tcBorders>
+              <w:top w:val="single" w:color="BFC7D5" w:sz="4"/>
+              <w:left w:val="single" w:color="BFC7D5" w:sz="4"/>
+              <w:bottom w:val="single" w:color="BFC7D5" w:sz="4"/>
+              <w:right w:val="single" w:color="BFC7D5" w:sz="4"/>
+            </w:tcBorders>
+            <w:shd w:fill="FFFFFF" w:color="auto" w:val="clear"/>
+            <w:tcMar>
+              <w:top w:type="dxa" w:w="60"/>
+              <w:left w:type="dxa" w:w="90"/>
+              <w:bottom w:type="dxa" w:w="60"/>
+              <w:right w:type="dxa" w:w="90"/>
+            </w:tcMar>
+          </w:tcPr>
+          <w:p>
+            <w:pPr>
+              <w:jc w:val="left"/>
+            </w:pPr>
+            <w:r>
+              <w:rPr>
+                <w:sz w:val="18"/>
+                <w:szCs w:val="18"/>
+              </w:rPr>
+              <w:t xml:space="preserve">0 = identical; lower is better. Compare only within one dataset.</w:t>
+            </w:r>
+          </w:p>
+        </w:tc>
+      </w:tr>
+      <w:tr>
+        <w:tc>
+          <w:tcPr>
+            <w:tcW w:type="dxa" w:w="2209"/>
+            <w:tcBorders>
+              <w:top w:val="single" w:color="BFC7D5" w:sz="4"/>
+              <w:left w:val="single" w:color="BFC7D5" w:sz="4"/>
+              <w:bottom w:val="single" w:color="BFC7D5" w:sz="4"/>
+              <w:right w:val="single" w:color="BFC7D5" w:sz="4"/>
+            </w:tcBorders>
+            <w:shd w:fill="F7F9FC" w:color="auto" w:val="clear"/>
+            <w:tcMar>
+              <w:top w:type="dxa" w:w="60"/>
+              <w:left w:type="dxa" w:w="90"/>
+              <w:bottom w:type="dxa" w:w="60"/>
+              <w:right w:type="dxa" w:w="90"/>
+            </w:tcMar>
+          </w:tcPr>
+          <w:p>
+            <w:pPr>
+              <w:jc w:val="left"/>
+            </w:pPr>
+            <w:r>
+              <w:rPr>
+                <w:b/>
+                <w:bCs/>
+                <w:sz w:val="18"/>
+                <w:szCs w:val="18"/>
+              </w:rPr>
+              <w:t xml:space="preserve">Train-on-fake, test-on-real accuracy</w:t>
+            </w:r>
+          </w:p>
+        </w:tc>
+        <w:tc>
+          <w:tcPr>
+            <w:tcW w:type="dxa" w:w="4417"/>
+            <w:tcBorders>
+              <w:top w:val="single" w:color="BFC7D5" w:sz="4"/>
+              <w:left w:val="single" w:color="BFC7D5" w:sz="4"/>
+              <w:bottom w:val="single" w:color="BFC7D5" w:sz="4"/>
+              <w:right w:val="single" w:color="BFC7D5" w:sz="4"/>
+            </w:tcBorders>
+            <w:shd w:fill="F7F9FC" w:color="auto" w:val="clear"/>
+            <w:tcMar>
+              <w:top w:type="dxa" w:w="60"/>
+              <w:left w:type="dxa" w:w="90"/>
+              <w:bottom w:type="dxa" w:w="60"/>
+              <w:right w:type="dxa" w:w="90"/>
+            </w:tcMar>
+          </w:tcPr>
+          <w:p>
+            <w:pPr>
+              <w:jc w:val="left"/>
+            </w:pPr>
+            <w:r>
+              <w:rPr>
+                <w:sz w:val="18"/>
+                <w:szCs w:val="18"/>
+              </w:rPr>
+              <w:t xml:space="preserve">Train a classifier only on fake features, test it on real data.</w:t>
+            </w:r>
+          </w:p>
+        </w:tc>
+        <w:tc>
+          <w:tcPr>
+            <w:tcW w:type="dxa" w:w="3012"/>
+            <w:tcBorders>
+              <w:top w:val="single" w:color="BFC7D5" w:sz="4"/>
+              <w:left w:val="single" w:color="BFC7D5" w:sz="4"/>
+              <w:bottom w:val="single" w:color="BFC7D5" w:sz="4"/>
+              <w:right w:val="single" w:color="BFC7D5" w:sz="4"/>
+            </w:tcBorders>
+            <w:shd w:fill="F7F9FC" w:color="auto" w:val="clear"/>
+            <w:tcMar>
+              <w:top w:type="dxa" w:w="60"/>
+              <w:left w:type="dxa" w:w="90"/>
+              <w:bottom w:type="dxa" w:w="60"/>
+              <w:right w:type="dxa" w:w="90"/>
+            </w:tcMar>
+          </w:tcPr>
+          <w:p>
+            <w:pPr>
+              <w:jc w:val="left"/>
+            </w:pPr>
+            <w:r>
+              <w:rPr>
+                <w:sz w:val="18"/>
+                <w:szCs w:val="18"/>
+              </w:rPr>
+              <w:t xml:space="preserve">The most direct test of whether fake features are useful.</w:t>
+            </w:r>
+          </w:p>
+        </w:tc>
+      </w:tr>
+      <w:tr>
+        <w:tc>
+          <w:tcPr>
+            <w:tcW w:type="dxa" w:w="2209"/>
+            <w:tcBorders>
+              <w:top w:val="single" w:color="BFC7D5" w:sz="4"/>
+              <w:left w:val="single" w:color="BFC7D5" w:sz="4"/>
+              <w:bottom w:val="single" w:color="BFC7D5" w:sz="4"/>
+              <w:right w:val="single" w:color="BFC7D5" w:sz="4"/>
+            </w:tcBorders>
+            <w:shd w:fill="FFFFFF" w:color="auto" w:val="clear"/>
+            <w:tcMar>
+              <w:top w:type="dxa" w:w="60"/>
+              <w:left w:type="dxa" w:w="90"/>
+              <w:bottom w:type="dxa" w:w="60"/>
+              <w:right w:type="dxa" w:w="90"/>
+            </w:tcMar>
+          </w:tcPr>
+          <w:p>
+            <w:pPr>
+              <w:jc w:val="left"/>
+            </w:pPr>
+            <w:r>
+              <w:rPr>
+                <w:b/>
+                <w:bCs/>
+                <w:sz w:val="18"/>
+                <w:szCs w:val="18"/>
+              </w:rPr>
+              <w:t xml:space="preserve">Class separability</w:t>
+            </w:r>
+            <w:r>
+              <w:rPr>
+                <w:sz w:val="18"/>
+                <w:szCs w:val="18"/>
+              </w:rPr>
+              <w:t xml:space="preserve"> (F) and </w:t>
+            </w:r>
+            <w:r>
+              <w:rPr>
+                <w:b/>
+                <w:bCs/>
+                <w:sz w:val="18"/>
+                <w:szCs w:val="18"/>
+              </w:rPr>
+              <w:t xml:space="preserve">nearest-mean accuracy</w:t>
+            </w:r>
+          </w:p>
+        </w:tc>
+        <w:tc>
+          <w:tcPr>
+            <w:tcW w:type="dxa" w:w="4417"/>
+            <w:tcBorders>
+              <w:top w:val="single" w:color="BFC7D5" w:sz="4"/>
+              <w:left w:val="single" w:color="BFC7D5" w:sz="4"/>
+              <w:bottom w:val="single" w:color="BFC7D5" w:sz="4"/>
+              <w:right w:val="single" w:color="BFC7D5" w:sz="4"/>
+            </w:tcBorders>
+            <w:shd w:fill="FFFFFF" w:color="auto" w:val="clear"/>
+            <w:tcMar>
+              <w:top w:type="dxa" w:w="60"/>
+              <w:left w:type="dxa" w:w="90"/>
+              <w:bottom w:type="dxa" w:w="60"/>
+              <w:right w:type="dxa" w:w="90"/>
+            </w:tcMar>
+          </w:tcPr>
+          <w:p>
+            <w:pPr>
+              <w:jc w:val="left"/>
+            </w:pPr>
+            <w:r>
+              <w:rPr>
+                <w:sz w:val="18"/>
+                <w:szCs w:val="18"/>
+              </w:rPr>
+              <w:t xml:space="preserve">Can the </w:t>
+            </w:r>
+            <w:r>
+              <w:rPr>
+                <w:i/>
+                <w:iCs/>
+                <w:sz w:val="18"/>
+                <w:szCs w:val="18"/>
+              </w:rPr>
+              <w:t xml:space="preserve">average</w:t>
+            </w:r>
+            <w:r>
+              <w:rPr>
+                <w:sz w:val="18"/>
+                <w:szCs w:val="18"/>
+              </w:rPr>
+              <w:t xml:space="preserve"> feature of each class tell the classes apart? F: distance between class averages relative to the spread inside a class. Nearest-mean accuracy: label each real sample by the closest class average.</w:t>
+            </w:r>
+          </w:p>
+        </w:tc>
+        <w:tc>
+          <w:tcPr>
+            <w:tcW w:type="dxa" w:w="3012"/>
+            <w:tcBorders>
+              <w:top w:val="single" w:color="BFC7D5" w:sz="4"/>
+              <w:left w:val="single" w:color="BFC7D5" w:sz="4"/>
+              <w:bottom w:val="single" w:color="BFC7D5" w:sz="4"/>
+              <w:right w:val="single" w:color="BFC7D5" w:sz="4"/>
+            </w:tcBorders>
+            <w:shd w:fill="FFFFFF" w:color="auto" w:val="clear"/>
+            <w:tcMar>
+              <w:top w:type="dxa" w:w="60"/>
+              <w:left w:type="dxa" w:w="90"/>
+              <w:bottom w:type="dxa" w:w="60"/>
+              <w:right w:type="dxa" w:w="90"/>
+            </w:tcMar>
+          </w:tcPr>
+          <w:p>
+            <w:pPr>
+              <w:jc w:val="left"/>
+            </w:pPr>
+            <w:r>
+              <w:rPr>
+                <w:sz w:val="18"/>
+                <w:szCs w:val="18"/>
+              </w:rPr>
+              <w:t xml:space="preserve">F near 0 and nearest-mean accuracy near 10 % = class averages are almost identical. Explains why SVHN fails (12 %).</w:t>
+            </w:r>
+          </w:p>
+        </w:tc>
+      </w:tr>
+      <w:tr>
+        <w:tc>
+          <w:tcPr>
+            <w:tcW w:type="dxa" w:w="2209"/>
+            <w:tcBorders>
+              <w:top w:val="single" w:color="BFC7D5" w:sz="4"/>
+              <w:left w:val="single" w:color="BFC7D5" w:sz="4"/>
+              <w:bottom w:val="single" w:color="BFC7D5" w:sz="4"/>
+              <w:right w:val="single" w:color="BFC7D5" w:sz="4"/>
+            </w:tcBorders>
+            <w:shd w:fill="F7F9FC" w:color="auto" w:val="clear"/>
+            <w:tcMar>
+              <w:top w:type="dxa" w:w="60"/>
+              <w:left w:type="dxa" w:w="90"/>
+              <w:bottom w:type="dxa" w:w="60"/>
+              <w:right w:type="dxa" w:w="90"/>
+            </w:tcMar>
+          </w:tcPr>
+          <w:p>
+            <w:pPr>
+              <w:jc w:val="left"/>
+            </w:pPr>
+            <w:r>
+              <w:rPr>
+                <w:b/>
+                <w:bCs/>
+                <w:sz w:val="18"/>
+                <w:szCs w:val="18"/>
+              </w:rPr>
+              <w:t xml:space="preserve">Last-layer gap</w:t>
+            </w:r>
+            <w:r>
+              <w:rPr>
+                <w:sz w:val="18"/>
+                <w:szCs w:val="18"/>
+              </w:rPr>
+              <w:t xml:space="preserve"> ("readout gap")</w:t>
+            </w:r>
+          </w:p>
+        </w:tc>
+        <w:tc>
+          <w:tcPr>
+            <w:tcW w:type="dxa" w:w="4417"/>
+            <w:tcBorders>
+              <w:top w:val="single" w:color="BFC7D5" w:sz="4"/>
+              <w:left w:val="single" w:color="BFC7D5" w:sz="4"/>
+              <w:bottom w:val="single" w:color="BFC7D5" w:sz="4"/>
+              <w:right w:val="single" w:color="BFC7D5" w:sz="4"/>
+            </w:tcBorders>
+            <w:shd w:fill="F7F9FC" w:color="auto" w:val="clear"/>
+            <w:tcMar>
+              <w:top w:type="dxa" w:w="60"/>
+              <w:left w:type="dxa" w:w="90"/>
+              <w:bottom w:type="dxa" w:w="60"/>
+              <w:right w:type="dxa" w:w="90"/>
+            </w:tcMar>
+          </w:tcPr>
+          <w:p>
+            <w:pPr>
+              <w:jc w:val="left"/>
+            </w:pPr>
+            <w:r>
+              <w:rPr>
+                <w:sz w:val="18"/>
+                <w:szCs w:val="18"/>
+              </w:rPr>
+              <w:t xml:space="preserve">Accuracy after re-fitting only each model's last layer on pooled real data, minus the accuracy as trained.</w:t>
+            </w:r>
+          </w:p>
+        </w:tc>
+        <w:tc>
+          <w:tcPr>
+            <w:tcW w:type="dxa" w:w="3012"/>
+            <w:tcBorders>
+              <w:top w:val="single" w:color="BFC7D5" w:sz="4"/>
+              <w:left w:val="single" w:color="BFC7D5" w:sz="4"/>
+              <w:bottom w:val="single" w:color="BFC7D5" w:sz="4"/>
+              <w:right w:val="single" w:color="BFC7D5" w:sz="4"/>
+            </w:tcBorders>
+            <w:shd w:fill="F7F9FC" w:color="auto" w:val="clear"/>
+            <w:tcMar>
+              <w:top w:type="dxa" w:w="60"/>
+              <w:left w:type="dxa" w:w="90"/>
+              <w:bottom w:type="dxa" w:w="60"/>
+              <w:right w:type="dxa" w:w="90"/>
+            </w:tcMar>
+          </w:tcPr>
+          <w:p>
+            <w:pPr>
+              <w:jc w:val="left"/>
+            </w:pPr>
+            <w:r>
+              <w:rPr>
+                <w:sz w:val="18"/>
+                <w:szCs w:val="18"/>
+              </w:rPr>
+              <w:t xml:space="preserve">How much accuracy is lost in the last layer alone. GeFL-F loses 14–20 points there; Ours-A 0.1–2 (Part 6).</w:t>
+            </w:r>
+          </w:p>
+        </w:tc>
+      </w:tr>
+      <w:tr>
+        <w:tc>
+          <w:tcPr>
+            <w:tcW w:type="dxa" w:w="2209"/>
+            <w:tcBorders>
+              <w:top w:val="single" w:color="BFC7D5" w:sz="4"/>
+              <w:left w:val="single" w:color="BFC7D5" w:sz="4"/>
+              <w:bottom w:val="single" w:color="BFC7D5" w:sz="4"/>
+              <w:right w:val="single" w:color="BFC7D5" w:sz="4"/>
+            </w:tcBorders>
+            <w:shd w:fill="FFFFFF" w:color="auto" w:val="clear"/>
+            <w:tcMar>
+              <w:top w:type="dxa" w:w="60"/>
+              <w:left w:type="dxa" w:w="90"/>
+              <w:bottom w:type="dxa" w:w="60"/>
+              <w:right w:type="dxa" w:w="90"/>
+            </w:tcMar>
+          </w:tcPr>
+          <w:p>
+            <w:pPr>
+              <w:jc w:val="left"/>
+            </w:pPr>
+            <w:r>
+              <w:rPr>
+                <w:b/>
+                <w:bCs/>
+                <w:sz w:val="18"/>
+                <w:szCs w:val="18"/>
+              </w:rPr>
+              <w:t xml:space="preserve">Class-share correlation</w:t>
+            </w:r>
+          </w:p>
+        </w:tc>
+        <w:tc>
+          <w:tcPr>
+            <w:tcW w:type="dxa" w:w="4417"/>
+            <w:tcBorders>
+              <w:top w:val="single" w:color="BFC7D5" w:sz="4"/>
+              <w:left w:val="single" w:color="BFC7D5" w:sz="4"/>
+              <w:bottom w:val="single" w:color="BFC7D5" w:sz="4"/>
+              <w:right w:val="single" w:color="BFC7D5" w:sz="4"/>
+            </w:tcBorders>
+            <w:shd w:fill="FFFFFF" w:color="auto" w:val="clear"/>
+            <w:tcMar>
+              <w:top w:type="dxa" w:w="60"/>
+              <w:left w:type="dxa" w:w="90"/>
+              <w:bottom w:type="dxa" w:w="60"/>
+              <w:right w:type="dxa" w:w="90"/>
+            </w:tcMar>
+          </w:tcPr>
+          <w:p>
+            <w:pPr>
+              <w:jc w:val="left"/>
+            </w:pPr>
+            <w:r>
+              <w:rPr>
+                <w:sz w:val="18"/>
+                <w:szCs w:val="18"/>
+              </w:rPr>
+              <w:t xml:space="preserve">Correlation between how often a client sees each class and how often its model predicts it.</w:t>
+            </w:r>
+          </w:p>
+        </w:tc>
+        <w:tc>
+          <w:tcPr>
+            <w:tcW w:type="dxa" w:w="3012"/>
+            <w:tcBorders>
+              <w:top w:val="single" w:color="BFC7D5" w:sz="4"/>
+              <w:left w:val="single" w:color="BFC7D5" w:sz="4"/>
+              <w:bottom w:val="single" w:color="BFC7D5" w:sz="4"/>
+              <w:right w:val="single" w:color="BFC7D5" w:sz="4"/>
+            </w:tcBorders>
+            <w:shd w:fill="FFFFFF" w:color="auto" w:val="clear"/>
+            <w:tcMar>
+              <w:top w:type="dxa" w:w="60"/>
+              <w:left w:type="dxa" w:w="90"/>
+              <w:bottom w:type="dxa" w:w="60"/>
+              <w:right w:type="dxa" w:w="90"/>
+            </w:tcMar>
+          </w:tcPr>
+          <w:p>
+            <w:pPr>
+              <w:jc w:val="left"/>
+            </w:pPr>
+            <w:r>
+              <w:rPr>
+                <w:sz w:val="18"/>
+                <w:szCs w:val="18"/>
+              </w:rPr>
+              <w:t xml:space="preserve">0 = predictions not biased toward the client's own common classes. Used to show what logit adjustment does.</w:t>
+            </w:r>
+          </w:p>
+        </w:tc>
+      </w:tr>
+      <w:tr>
+        <w:tc>
+          <w:tcPr>
+            <w:tcW w:type="dxa" w:w="2209"/>
+            <w:tcBorders>
+              <w:top w:val="single" w:color="BFC7D5" w:sz="4"/>
+              <w:left w:val="single" w:color="BFC7D5" w:sz="4"/>
+              <w:bottom w:val="single" w:color="BFC7D5" w:sz="4"/>
+              <w:right w:val="single" w:color="BFC7D5" w:sz="4"/>
+            </w:tcBorders>
+            <w:shd w:fill="F7F9FC" w:color="auto" w:val="clear"/>
+            <w:tcMar>
+              <w:top w:type="dxa" w:w="60"/>
+              <w:left w:type="dxa" w:w="90"/>
+              <w:bottom w:type="dxa" w:w="60"/>
+              <w:right w:type="dxa" w:w="90"/>
+            </w:tcMar>
+          </w:tcPr>
+          <w:p>
+            <w:pPr>
+              <w:jc w:val="left"/>
+            </w:pPr>
+            <w:r>
+              <w:rPr>
+                <w:b/>
+                <w:bCs/>
+                <w:sz w:val="18"/>
+                <w:szCs w:val="18"/>
+              </w:rPr>
+              <w:t xml:space="preserve">Total-variation distance of labels</w:t>
+            </w:r>
+          </w:p>
+        </w:tc>
+        <w:tc>
+          <w:tcPr>
+            <w:tcW w:type="dxa" w:w="4417"/>
+            <w:tcBorders>
+              <w:top w:val="single" w:color="BFC7D5" w:sz="4"/>
+              <w:left w:val="single" w:color="BFC7D5" w:sz="4"/>
+              <w:bottom w:val="single" w:color="BFC7D5" w:sz="4"/>
+              <w:right w:val="single" w:color="BFC7D5" w:sz="4"/>
+            </w:tcBorders>
+            <w:shd w:fill="F7F9FC" w:color="auto" w:val="clear"/>
+            <w:tcMar>
+              <w:top w:type="dxa" w:w="60"/>
+              <w:left w:type="dxa" w:w="90"/>
+              <w:bottom w:type="dxa" w:w="60"/>
+              <w:right w:type="dxa" w:w="90"/>
+            </w:tcMar>
+          </w:tcPr>
+          <w:p>
+            <w:pPr>
+              <w:jc w:val="left"/>
+            </w:pPr>
+            <w:r>
+              <w:rPr>
+                <w:sz w:val="18"/>
+                <w:szCs w:val="18"/>
+              </w:rPr>
+              <w:t xml:space="preserve">How far the soft training labels are from a real-data judge's answers.</w:t>
+            </w:r>
+          </w:p>
+        </w:tc>
+        <w:tc>
+          <w:tcPr>
+            <w:tcW w:type="dxa" w:w="3012"/>
+            <w:tcBorders>
+              <w:top w:val="single" w:color="BFC7D5" w:sz="4"/>
+              <w:left w:val="single" w:color="BFC7D5" w:sz="4"/>
+              <w:bottom w:val="single" w:color="BFC7D5" w:sz="4"/>
+              <w:right w:val="single" w:color="BFC7D5" w:sz="4"/>
+            </w:tcBorders>
+            <w:shd w:fill="F7F9FC" w:color="auto" w:val="clear"/>
+            <w:tcMar>
+              <w:top w:type="dxa" w:w="60"/>
+              <w:left w:type="dxa" w:w="90"/>
+              <w:bottom w:type="dxa" w:w="60"/>
+              <w:right w:type="dxa" w:w="90"/>
+            </w:tcMar>
+          </w:tcPr>
+          <w:p>
+            <w:pPr>
+              <w:jc w:val="left"/>
+            </w:pPr>
+            <w:r>
+              <w:rPr>
+                <w:sz w:val="18"/>
+                <w:szCs w:val="18"/>
+              </w:rPr>
+              <w:t xml:space="preserve">0 = same answers. Used to show what consensus labels do.</w:t>
+            </w:r>
+          </w:p>
+        </w:tc>
+      </w:tr>
+      <w:tr>
+        <w:tc>
+          <w:tcPr>
+            <w:tcW w:type="dxa" w:w="2209"/>
+            <w:tcBorders>
+              <w:top w:val="single" w:color="BFC7D5" w:sz="4"/>
+              <w:left w:val="single" w:color="BFC7D5" w:sz="4"/>
+              <w:bottom w:val="single" w:color="BFC7D5" w:sz="4"/>
+              <w:right w:val="single" w:color="BFC7D5" w:sz="4"/>
+            </w:tcBorders>
+            <w:shd w:fill="FFFFFF" w:color="auto" w:val="clear"/>
+            <w:tcMar>
+              <w:top w:type="dxa" w:w="60"/>
+              <w:left w:type="dxa" w:w="90"/>
+              <w:bottom w:type="dxa" w:w="60"/>
+              <w:right w:type="dxa" w:w="90"/>
+            </w:tcMar>
+          </w:tcPr>
+          <w:p>
+            <w:pPr>
+              <w:jc w:val="left"/>
+            </w:pPr>
+            <w:r>
+              <w:rPr>
+                <w:b/>
+                <w:bCs/>
+                <w:sz w:val="18"/>
+                <w:szCs w:val="18"/>
+              </w:rPr>
+              <w:t xml:space="preserve">Privacy budget</w:t>
+            </w:r>
+            <w:r>
+              <w:rPr>
+                <w:sz w:val="18"/>
+                <w:szCs w:val="18"/>
+              </w:rPr>
+              <w:t xml:space="preserve"> ε</w:t>
+            </w:r>
+          </w:p>
+        </w:tc>
+        <w:tc>
+          <w:tcPr>
+            <w:tcW w:type="dxa" w:w="4417"/>
+            <w:tcBorders>
+              <w:top w:val="single" w:color="BFC7D5" w:sz="4"/>
+              <w:left w:val="single" w:color="BFC7D5" w:sz="4"/>
+              <w:bottom w:val="single" w:color="BFC7D5" w:sz="4"/>
+              <w:right w:val="single" w:color="BFC7D5" w:sz="4"/>
+            </w:tcBorders>
+            <w:shd w:fill="FFFFFF" w:color="auto" w:val="clear"/>
+            <w:tcMar>
+              <w:top w:type="dxa" w:w="60"/>
+              <w:left w:type="dxa" w:w="90"/>
+              <w:bottom w:type="dxa" w:w="60"/>
+              <w:right w:type="dxa" w:w="90"/>
+            </w:tcMar>
+          </w:tcPr>
+          <w:p>
+            <w:pPr>
+              <w:jc w:val="left"/>
+            </w:pPr>
+            <w:r>
+              <w:rPr>
+                <w:sz w:val="18"/>
+                <w:szCs w:val="18"/>
+              </w:rPr>
+              <w:t xml:space="preserve">Strength of the formal privacy guarantee when noise is added to the uploaded class sums.</w:t>
+            </w:r>
+          </w:p>
+        </w:tc>
+        <w:tc>
+          <w:tcPr>
+            <w:tcW w:type="dxa" w:w="3012"/>
+            <w:tcBorders>
+              <w:top w:val="single" w:color="BFC7D5" w:sz="4"/>
+              <w:left w:val="single" w:color="BFC7D5" w:sz="4"/>
+              <w:bottom w:val="single" w:color="BFC7D5" w:sz="4"/>
+              <w:right w:val="single" w:color="BFC7D5" w:sz="4"/>
+            </w:tcBorders>
+            <w:shd w:fill="FFFFFF" w:color="auto" w:val="clear"/>
+            <w:tcMar>
+              <w:top w:type="dxa" w:w="60"/>
+              <w:left w:type="dxa" w:w="90"/>
+              <w:bottom w:type="dxa" w:w="60"/>
+              <w:right w:type="dxa" w:w="90"/>
+            </w:tcMar>
+          </w:tcPr>
+          <w:p>
+            <w:pPr>
+              <w:jc w:val="left"/>
+            </w:pPr>
+            <w:r>
+              <w:rPr>
+                <w:sz w:val="18"/>
+                <w:szCs w:val="18"/>
+              </w:rPr>
+              <w:t xml:space="preserve">Smaller = more private. 8 = moderate, 2 = strong.</w:t>
+            </w:r>
+          </w:p>
+        </w:tc>
+      </w:tr>
+    </w:tbl>
+    <w:p>
+      <w:pPr>
+        <w:spacing w:after="160"/>
+      </w:pPr>
+    </w:p>
+    <w:p>
+      <w:pPr>
+        <w:pStyle w:val="Heading2"/>
+        <w:keepNext/>
+        <w:spacing w:after="120" w:before="240"/>
+      </w:pPr>
+      <w:r>
+        <w:t xml:space="preserve">D. The settings</w:t>
+      </w:r>
+    </w:p>
+    <w:tbl>
+      <w:tblPr>
+        <w:tblW w:type="dxa" w:w="9638"/>
+        <w:tblBorders>
+          <w:top w:val="single" w:color="auto" w:sz="4"/>
+          <w:left w:val="single" w:color="auto" w:sz="4"/>
+          <w:bottom w:val="single" w:color="auto" w:sz="4"/>
+          <w:right w:val="single" w:color="auto" w:sz="4"/>
+          <w:insideH w:val="single" w:color="auto" w:sz="4"/>
+          <w:insideV w:val="single" w:color="auto" w:sz="4"/>
+        </w:tblBorders>
+      </w:tblPr>
+      <w:tblGrid>
+        <w:gridCol w:w="2209"/>
+        <w:gridCol w:w="4417"/>
+        <w:gridCol w:w="3012"/>
+      </w:tblGrid>
+      <w:tr>
+        <w:trPr>
+          <w:tblHeader/>
+        </w:trPr>
+        <w:tc>
+          <w:tcPr>
+            <w:tcW w:type="dxa" w:w="2209"/>
+            <w:tcBorders>
+              <w:top w:val="single" w:color="BFC7D5" w:sz="4"/>
+              <w:left w:val="single" w:color="BFC7D5" w:sz="4"/>
+              <w:bottom w:val="single" w:color="BFC7D5" w:sz="4"/>
+              <w:right w:val="single" w:color="BFC7D5" w:sz="4"/>
+            </w:tcBorders>
+            <w:shd w:fill="1C4E9A" w:color="auto" w:val="clear"/>
+            <w:tcMar>
+              <w:top w:type="dxa" w:w="60"/>
+              <w:left w:type="dxa" w:w="90"/>
+              <w:bottom w:type="dxa" w:w="60"/>
+              <w:right w:type="dxa" w:w="90"/>
+            </w:tcMar>
+          </w:tcPr>
+          <w:p>
+            <w:pPr>
+              <w:jc w:val="left"/>
+            </w:pPr>
+            <w:r>
+              <w:rPr>
+                <w:b/>
+                <w:bCs/>
+                <w:color w:val="FFFFFF"/>
+                <w:sz w:val="18"/>
+                <w:szCs w:val="18"/>
+              </w:rPr>
+              <w:t xml:space="preserve">Measurement</w:t>
+            </w:r>
+          </w:p>
+        </w:tc>
+        <w:tc>
+          <w:tcPr>
+            <w:tcW w:type="dxa" w:w="4417"/>
+            <w:tcBorders>
+              <w:top w:val="single" w:color="BFC7D5" w:sz="4"/>
+              <w:left w:val="single" w:color="BFC7D5" w:sz="4"/>
+              <w:bottom w:val="single" w:color="BFC7D5" w:sz="4"/>
+              <w:right w:val="single" w:color="BFC7D5" w:sz="4"/>
+            </w:tcBorders>
+            <w:shd w:fill="1C4E9A" w:color="auto" w:val="clear"/>
+            <w:tcMar>
+              <w:top w:type="dxa" w:w="60"/>
+              <w:left w:type="dxa" w:w="90"/>
+              <w:bottom w:type="dxa" w:w="60"/>
+              <w:right w:type="dxa" w:w="90"/>
+            </w:tcMar>
+          </w:tcPr>
+          <w:p>
+            <w:pPr>
+              <w:jc w:val="left"/>
+            </w:pPr>
+            <w:r>
+              <w:rPr>
+                <w:b/>
+                <w:bCs/>
+                <w:color w:val="FFFFFF"/>
+                <w:sz w:val="18"/>
+                <w:szCs w:val="18"/>
+              </w:rPr>
+              <w:t xml:space="preserve">What it measures, in plain words</w:t>
+            </w:r>
+          </w:p>
+        </w:tc>
+        <w:tc>
+          <w:tcPr>
+            <w:tcW w:type="dxa" w:w="3012"/>
+            <w:tcBorders>
+              <w:top w:val="single" w:color="BFC7D5" w:sz="4"/>
+              <w:left w:val="single" w:color="BFC7D5" w:sz="4"/>
+              <w:bottom w:val="single" w:color="BFC7D5" w:sz="4"/>
+              <w:right w:val="single" w:color="BFC7D5" w:sz="4"/>
+            </w:tcBorders>
+            <w:shd w:fill="1C4E9A" w:color="auto" w:val="clear"/>
+            <w:tcMar>
+              <w:top w:type="dxa" w:w="60"/>
+              <w:left w:type="dxa" w:w="90"/>
+              <w:bottom w:type="dxa" w:w="60"/>
+              <w:right w:type="dxa" w:w="90"/>
+            </w:tcMar>
+          </w:tcPr>
+          <w:p>
+            <w:pPr>
+              <w:jc w:val="left"/>
+            </w:pPr>
+            <w:r>
+              <w:rPr>
+                <w:b/>
+                <w:bCs/>
+                <w:color w:val="FFFFFF"/>
+                <w:sz w:val="18"/>
+                <w:szCs w:val="18"/>
+              </w:rPr>
+              <w:t xml:space="preserve">How to read it</w:t>
+            </w:r>
+          </w:p>
+        </w:tc>
+      </w:tr>
+      <w:tr>
+        <w:tc>
+          <w:tcPr>
+            <w:tcW w:type="dxa" w:w="2209"/>
+            <w:tcBorders>
+              <w:top w:val="single" w:color="BFC7D5" w:sz="4"/>
+              <w:left w:val="single" w:color="BFC7D5" w:sz="4"/>
+              <w:bottom w:val="single" w:color="BFC7D5" w:sz="4"/>
+              <w:right w:val="single" w:color="BFC7D5" w:sz="4"/>
+            </w:tcBorders>
+            <w:shd w:fill="FFFFFF" w:color="auto" w:val="clear"/>
+            <w:tcMar>
+              <w:top w:type="dxa" w:w="60"/>
+              <w:left w:type="dxa" w:w="90"/>
+              <w:bottom w:type="dxa" w:w="60"/>
+              <w:right w:type="dxa" w:w="90"/>
+            </w:tcMar>
+          </w:tcPr>
+          <w:p>
+            <w:pPr>
+              <w:jc w:val="left"/>
+            </w:pPr>
+            <w:r>
+              <w:rPr>
+                <w:b/>
+                <w:bCs/>
+                <w:sz w:val="18"/>
+                <w:szCs w:val="18"/>
+              </w:rPr>
+              <w:t xml:space="preserve">Long tail</w:t>
+            </w:r>
+            <w:r>
+              <w:rPr>
+                <w:sz w:val="18"/>
+                <w:szCs w:val="18"/>
+              </w:rPr>
+              <w:t xml:space="preserve"> (imbalance 100 : 1)</w:t>
+            </w:r>
+          </w:p>
+        </w:tc>
+        <w:tc>
+          <w:tcPr>
+            <w:tcW w:type="dxa" w:w="4417"/>
+            <w:tcBorders>
+              <w:top w:val="single" w:color="BFC7D5" w:sz="4"/>
+              <w:left w:val="single" w:color="BFC7D5" w:sz="4"/>
+              <w:bottom w:val="single" w:color="BFC7D5" w:sz="4"/>
+              <w:right w:val="single" w:color="BFC7D5" w:sz="4"/>
+            </w:tcBorders>
+            <w:shd w:fill="FFFFFF" w:color="auto" w:val="clear"/>
+            <w:tcMar>
+              <w:top w:type="dxa" w:w="60"/>
+              <w:left w:type="dxa" w:w="90"/>
+              <w:bottom w:type="dxa" w:w="60"/>
+              <w:right w:type="dxa" w:w="90"/>
+            </w:tcMar>
+          </w:tcPr>
+          <w:p>
+            <w:pPr>
+              <w:jc w:val="left"/>
+            </w:pPr>
+            <w:r>
+              <w:rPr>
+                <w:sz w:val="18"/>
+                <w:szCs w:val="18"/>
+              </w:rPr>
+              <w:t xml:space="preserve">The most common class has 100 times as many samples as the rarest.</w:t>
+            </w:r>
+          </w:p>
+        </w:tc>
+        <w:tc>
+          <w:tcPr>
+            <w:tcW w:type="dxa" w:w="3012"/>
+            <w:tcBorders>
+              <w:top w:val="single" w:color="BFC7D5" w:sz="4"/>
+              <w:left w:val="single" w:color="BFC7D5" w:sz="4"/>
+              <w:bottom w:val="single" w:color="BFC7D5" w:sz="4"/>
+              <w:right w:val="single" w:color="BFC7D5" w:sz="4"/>
+            </w:tcBorders>
+            <w:shd w:fill="FFFFFF" w:color="auto" w:val="clear"/>
+            <w:tcMar>
+              <w:top w:type="dxa" w:w="60"/>
+              <w:left w:type="dxa" w:w="90"/>
+              <w:bottom w:type="dxa" w:w="60"/>
+              <w:right w:type="dxa" w:w="90"/>
+            </w:tcMar>
+          </w:tcPr>
+          <w:p>
+            <w:pPr>
+              <w:jc w:val="left"/>
+            </w:pPr>
+            <w:r>
+              <w:rPr>
+                <w:sz w:val="18"/>
+                <w:szCs w:val="18"/>
+              </w:rPr>
+              <w:t xml:space="preserve">The setting this work is built for.</w:t>
+            </w:r>
+          </w:p>
+        </w:tc>
+      </w:tr>
+      <w:tr>
+        <w:tc>
+          <w:tcPr>
+            <w:tcW w:type="dxa" w:w="2209"/>
+            <w:tcBorders>
+              <w:top w:val="single" w:color="BFC7D5" w:sz="4"/>
+              <w:left w:val="single" w:color="BFC7D5" w:sz="4"/>
+              <w:bottom w:val="single" w:color="BFC7D5" w:sz="4"/>
+              <w:right w:val="single" w:color="BFC7D5" w:sz="4"/>
+            </w:tcBorders>
+            <w:shd w:fill="F7F9FC" w:color="auto" w:val="clear"/>
+            <w:tcMar>
+              <w:top w:type="dxa" w:w="60"/>
+              <w:left w:type="dxa" w:w="90"/>
+              <w:bottom w:type="dxa" w:w="60"/>
+              <w:right w:type="dxa" w:w="90"/>
+            </w:tcMar>
+          </w:tcPr>
+          <w:p>
+            <w:pPr>
+              <w:jc w:val="left"/>
+            </w:pPr>
+            <w:r>
+              <w:rPr>
+                <w:b/>
+                <w:bCs/>
+                <w:sz w:val="18"/>
+                <w:szCs w:val="18"/>
+              </w:rPr>
+              <w:t xml:space="preserve">Balanced</w:t>
+            </w:r>
+            <w:r>
+              <w:rPr>
+                <w:sz w:val="18"/>
+                <w:szCs w:val="18"/>
+              </w:rPr>
+              <w:t xml:space="preserve"> setting</w:t>
+            </w:r>
+          </w:p>
+        </w:tc>
+        <w:tc>
+          <w:tcPr>
+            <w:tcW w:type="dxa" w:w="4417"/>
+            <w:tcBorders>
+              <w:top w:val="single" w:color="BFC7D5" w:sz="4"/>
+              <w:left w:val="single" w:color="BFC7D5" w:sz="4"/>
+              <w:bottom w:val="single" w:color="BFC7D5" w:sz="4"/>
+              <w:right w:val="single" w:color="BFC7D5" w:sz="4"/>
+            </w:tcBorders>
+            <w:shd w:fill="F7F9FC" w:color="auto" w:val="clear"/>
+            <w:tcMar>
+              <w:top w:type="dxa" w:w="60"/>
+              <w:left w:type="dxa" w:w="90"/>
+              <w:bottom w:type="dxa" w:w="60"/>
+              <w:right w:type="dxa" w:w="90"/>
+            </w:tcMar>
+          </w:tcPr>
+          <w:p>
+            <w:pPr>
+              <w:jc w:val="left"/>
+            </w:pPr>
+            <w:r>
+              <w:rPr>
+                <w:sz w:val="18"/>
+                <w:szCs w:val="18"/>
+              </w:rPr>
+              <w:t xml:space="preserve">Every class has the same number of samples, split evenly over clients: the original paper's setting.</w:t>
+            </w:r>
+          </w:p>
+        </w:tc>
+        <w:tc>
+          <w:tcPr>
+            <w:tcW w:type="dxa" w:w="3012"/>
+            <w:tcBorders>
+              <w:top w:val="single" w:color="BFC7D5" w:sz="4"/>
+              <w:left w:val="single" w:color="BFC7D5" w:sz="4"/>
+              <w:bottom w:val="single" w:color="BFC7D5" w:sz="4"/>
+              <w:right w:val="single" w:color="BFC7D5" w:sz="4"/>
+            </w:tcBorders>
+            <w:shd w:fill="F7F9FC" w:color="auto" w:val="clear"/>
+            <w:tcMar>
+              <w:top w:type="dxa" w:w="60"/>
+              <w:left w:type="dxa" w:w="90"/>
+              <w:bottom w:type="dxa" w:w="60"/>
+              <w:right w:type="dxa" w:w="90"/>
+            </w:tcMar>
+          </w:tcPr>
+          <w:p>
+            <w:pPr>
+              <w:jc w:val="left"/>
+            </w:pPr>
+            <w:r>
+              <w:rPr>
+                <w:sz w:val="18"/>
+                <w:szCs w:val="18"/>
+              </w:rPr>
+              <w:t xml:space="preserve">Checks that the method does no harm when there is no imbalance.</w:t>
+            </w:r>
+          </w:p>
+        </w:tc>
+      </w:tr>
+      <w:tr>
+        <w:tc>
+          <w:tcPr>
+            <w:tcW w:type="dxa" w:w="2209"/>
+            <w:tcBorders>
+              <w:top w:val="single" w:color="BFC7D5" w:sz="4"/>
+              <w:left w:val="single" w:color="BFC7D5" w:sz="4"/>
+              <w:bottom w:val="single" w:color="BFC7D5" w:sz="4"/>
+              <w:right w:val="single" w:color="BFC7D5" w:sz="4"/>
+            </w:tcBorders>
+            <w:shd w:fill="FFFFFF" w:color="auto" w:val="clear"/>
+            <w:tcMar>
+              <w:top w:type="dxa" w:w="60"/>
+              <w:left w:type="dxa" w:w="90"/>
+              <w:bottom w:type="dxa" w:w="60"/>
+              <w:right w:type="dxa" w:w="90"/>
+            </w:tcMar>
+          </w:tcPr>
+          <w:p>
+            <w:pPr>
+              <w:jc w:val="left"/>
+            </w:pPr>
+            <w:r>
+              <w:rPr>
+                <w:b/>
+                <w:bCs/>
+                <w:sz w:val="18"/>
+                <w:szCs w:val="18"/>
+              </w:rPr>
+              <w:t xml:space="preserve">Dirichlet 0.5</w:t>
+            </w:r>
+          </w:p>
+        </w:tc>
+        <w:tc>
+          <w:tcPr>
+            <w:tcW w:type="dxa" w:w="4417"/>
+            <w:tcBorders>
+              <w:top w:val="single" w:color="BFC7D5" w:sz="4"/>
+              <w:left w:val="single" w:color="BFC7D5" w:sz="4"/>
+              <w:bottom w:val="single" w:color="BFC7D5" w:sz="4"/>
+              <w:right w:val="single" w:color="BFC7D5" w:sz="4"/>
+            </w:tcBorders>
+            <w:shd w:fill="FFFFFF" w:color="auto" w:val="clear"/>
+            <w:tcMar>
+              <w:top w:type="dxa" w:w="60"/>
+              <w:left w:type="dxa" w:w="90"/>
+              <w:bottom w:type="dxa" w:w="60"/>
+              <w:right w:type="dxa" w:w="90"/>
+            </w:tcMar>
+          </w:tcPr>
+          <w:p>
+            <w:pPr>
+              <w:jc w:val="left"/>
+            </w:pPr>
+            <w:r>
+              <w:rPr>
+                <w:sz w:val="18"/>
+                <w:szCs w:val="18"/>
+              </w:rPr>
+              <w:t xml:space="preserve">How unevenly each class is shared among clients. Smaller = more uneven.</w:t>
+            </w:r>
+          </w:p>
+        </w:tc>
+        <w:tc>
+          <w:tcPr>
+            <w:tcW w:type="dxa" w:w="3012"/>
+            <w:tcBorders>
+              <w:top w:val="single" w:color="BFC7D5" w:sz="4"/>
+              <w:left w:val="single" w:color="BFC7D5" w:sz="4"/>
+              <w:bottom w:val="single" w:color="BFC7D5" w:sz="4"/>
+              <w:right w:val="single" w:color="BFC7D5" w:sz="4"/>
+            </w:tcBorders>
+            <w:shd w:fill="FFFFFF" w:color="auto" w:val="clear"/>
+            <w:tcMar>
+              <w:top w:type="dxa" w:w="60"/>
+              <w:left w:type="dxa" w:w="90"/>
+              <w:bottom w:type="dxa" w:w="60"/>
+              <w:right w:type="dxa" w:w="90"/>
+            </w:tcMar>
+          </w:tcPr>
+          <w:p>
+            <w:pPr>
+              <w:jc w:val="left"/>
+            </w:pPr>
+            <w:r>
+              <w:rPr>
+                <w:sz w:val="18"/>
+                <w:szCs w:val="18"/>
+              </w:rPr>
+              <w:t xml:space="preserve">At 0.5 most clients have several classes missing entirely.</w:t>
+            </w:r>
+          </w:p>
+        </w:tc>
+      </w:tr>
+      <w:tr>
+        <w:tc>
+          <w:tcPr>
+            <w:tcW w:type="dxa" w:w="2209"/>
+            <w:tcBorders>
+              <w:top w:val="single" w:color="BFC7D5" w:sz="4"/>
+              <w:left w:val="single" w:color="BFC7D5" w:sz="4"/>
+              <w:bottom w:val="single" w:color="BFC7D5" w:sz="4"/>
+              <w:right w:val="single" w:color="BFC7D5" w:sz="4"/>
+            </w:tcBorders>
+            <w:shd w:fill="F7F9FC" w:color="auto" w:val="clear"/>
+            <w:tcMar>
+              <w:top w:type="dxa" w:w="60"/>
+              <w:left w:type="dxa" w:w="90"/>
+              <w:bottom w:type="dxa" w:w="60"/>
+              <w:right w:type="dxa" w:w="90"/>
+            </w:tcMar>
+          </w:tcPr>
+          <w:p>
+            <w:pPr>
+              <w:jc w:val="left"/>
+            </w:pPr>
+            <w:r>
+              <w:rPr>
+                <w:b/>
+                <w:bCs/>
+                <w:sz w:val="18"/>
+                <w:szCs w:val="18"/>
+              </w:rPr>
+              <w:t xml:space="preserve">Number of clients</w:t>
+            </w:r>
+            <w:r>
+              <w:rPr>
+                <w:sz w:val="18"/>
+                <w:szCs w:val="18"/>
+              </w:rPr>
+              <w:t xml:space="preserve"> (10, 50, 100)</w:t>
+            </w:r>
+          </w:p>
+        </w:tc>
+        <w:tc>
+          <w:tcPr>
+            <w:tcW w:type="dxa" w:w="4417"/>
+            <w:tcBorders>
+              <w:top w:val="single" w:color="BFC7D5" w:sz="4"/>
+              <w:left w:val="single" w:color="BFC7D5" w:sz="4"/>
+              <w:bottom w:val="single" w:color="BFC7D5" w:sz="4"/>
+              <w:right w:val="single" w:color="BFC7D5" w:sz="4"/>
+            </w:tcBorders>
+            <w:shd w:fill="F7F9FC" w:color="auto" w:val="clear"/>
+            <w:tcMar>
+              <w:top w:type="dxa" w:w="60"/>
+              <w:left w:type="dxa" w:w="90"/>
+              <w:bottom w:type="dxa" w:w="60"/>
+              <w:right w:type="dxa" w:w="90"/>
+            </w:tcMar>
+          </w:tcPr>
+          <w:p>
+            <w:pPr>
+              <w:jc w:val="left"/>
+            </w:pPr>
+            <w:r>
+              <w:rPr>
+                <w:sz w:val="18"/>
+                <w:szCs w:val="18"/>
+              </w:rPr>
+              <w:t xml:space="preserve">Devices taking part. There are always 10 model types, so 50 clients means 5 clients per model type.</w:t>
+            </w:r>
+          </w:p>
+        </w:tc>
+        <w:tc>
+          <w:tcPr>
+            <w:tcW w:type="dxa" w:w="3012"/>
+            <w:tcBorders>
+              <w:top w:val="single" w:color="BFC7D5" w:sz="4"/>
+              <w:left w:val="single" w:color="BFC7D5" w:sz="4"/>
+              <w:bottom w:val="single" w:color="BFC7D5" w:sz="4"/>
+              <w:right w:val="single" w:color="BFC7D5" w:sz="4"/>
+            </w:tcBorders>
+            <w:shd w:fill="F7F9FC" w:color="auto" w:val="clear"/>
+            <w:tcMar>
+              <w:top w:type="dxa" w:w="60"/>
+              <w:left w:type="dxa" w:w="90"/>
+              <w:bottom w:type="dxa" w:w="60"/>
+              <w:right w:type="dxa" w:w="90"/>
+            </w:tcMar>
+          </w:tcPr>
+          <w:p>
+            <w:pPr>
+              <w:jc w:val="left"/>
+            </w:pPr>
+            <w:r>
+              <w:rPr>
+                <w:sz w:val="18"/>
+                <w:szCs w:val="18"/>
+              </w:rPr>
+              <w:t xml:space="preserve">More clients = less data each.</w:t>
+            </w:r>
+          </w:p>
+        </w:tc>
+      </w:tr>
+    </w:tbl>
+    <w:p>
+      <w:pPr>
+        <w:spacing w:after="160"/>
+      </w:pPr>
+    </w:p>
+    <w:tbl>
+      <w:tblPr>
+        <w:tblW w:type="dxa" w:w="9638"/>
+        <w:tblBorders>
+          <w:top w:val="single" w:color="auto" w:sz="4"/>
+          <w:left w:val="single" w:color="auto" w:sz="4"/>
+          <w:bottom w:val="single" w:color="auto" w:sz="4"/>
+          <w:right w:val="single" w:color="auto" w:sz="4"/>
+          <w:insideH w:val="single" w:color="auto" w:sz="4"/>
+          <w:insideV w:val="single" w:color="auto" w:sz="4"/>
+        </w:tblBorders>
+      </w:tblPr>
+      <w:tblGrid>
+        <w:gridCol w:w="9638"/>
+      </w:tblGrid>
+      <w:tr>
+        <w:tc>
+          <w:tcPr>
+            <w:tcW w:type="dxa" w:w="9638"/>
+            <w:tcBorders>
+              <w:top w:val="single" w:color="1C4E9A" w:sz="12"/>
+              <w:left w:val="single" w:color="BFC7D5" w:sz="4"/>
+              <w:bottom w:val="single" w:color="BFC7D5" w:sz="4"/>
+              <w:right w:val="single" w:color="BFC7D5" w:sz="4"/>
+            </w:tcBorders>
+            <w:shd w:fill="EEF2F8" w:color="auto" w:val="clear"/>
+            <w:tcMar>
+              <w:top w:type="dxa" w:w="120"/>
+              <w:left w:type="dxa" w:w="160"/>
+              <w:bottom w:type="dxa" w:w="120"/>
+              <w:right w:type="dxa" w:w="160"/>
+            </w:tcMar>
+          </w:tcPr>
+          <w:p>
+            <w:pPr>
+              <w:spacing w:after="80"/>
+            </w:pPr>
+            <w:r>
+              <w:rPr>
+                <w:b/>
+                <w:bCs/>
+                <w:color w:val="1C4E9A"/>
+              </w:rPr>
+              <w:t xml:space="preserve">If you remember only four numbers</w:t>
+            </w:r>
+          </w:p>
+          <w:p>
+            <w:pPr>
+              <w:spacing w:after="60"/>
+            </w:pPr>
+            <w:r>
+              <w:rPr>
+                <w:b/>
+                <w:bCs/>
+              </w:rPr>
+              <w:t xml:space="preserve">Balanced accuracy</w:t>
+            </w:r>
+            <w:r>
+              <w:t xml:space="preserve"> (does it work), </w:t>
+            </w:r>
+            <w:r>
+              <w:rPr>
+                <w:b/>
+                <w:bCs/>
+              </w:rPr>
+              <w:t xml:space="preserve">rare-class accuracy</w:t>
+            </w:r>
+            <w:r>
+              <w:t xml:space="preserve"> (do rare classes come back), </w:t>
+            </w:r>
+            <w:r>
+              <w:rPr>
+                <w:b/>
+                <w:bCs/>
+              </w:rPr>
+              <w:t xml:space="preserve">row length ratio</w:t>
+            </w:r>
+            <w:r>
+              <w:t xml:space="preserve"> (proof of the cause), and </w:t>
+            </w:r>
+            <w:r>
+              <w:rPr>
+                <w:b/>
+                <w:bCs/>
+              </w:rPr>
+              <w:t xml:space="preserve">last-layer gap</w:t>
+            </w:r>
+            <w:r>
+              <w:t xml:space="preserve"> (where the remaining error is).</w:t>
+            </w:r>
+          </w:p>
+          <w:p>
+            <w:pPr>
+              <w:spacing w:after="60"/>
+            </w:pPr>
+            <w:r>
+              <w:t xml:space="preserve">Short names used in tables: Ours-A = our final method; GeFL-F = the original paper's method; holder-weighted averaging, moment correction, sample selection, consensus labels and logit adjustment are the parts described in Part 4.</w:t>
+            </w:r>
+          </w:p>
+        </w:tc>
+      </w:tr>
+    </w:tbl>
+    <w:p>
+      <w:pPr>
+        <w:spacing w:after="160"/>
+      </w:pPr>
+    </w:p>
+    <w:p>
+      <w:pPr>
+        <w:pStyle w:val="Heading1"/>
+        <w:pageBreakBefore/>
+        <w:spacing w:after="200"/>
+      </w:pPr>
+      <w:r>
         <w:t xml:space="preserve">1. The baseline: GeFL-F and the full lifecycle of its data</w:t>
       </w:r>
     </w:p>
@@ -1559,7 +4267,7 @@
         <w:t xml:space="preserve">Clients.</w:t>
       </w:r>
       <w:r>
-        <w:t xml:space="preserve"> K clients (K = 10, 50 or 100). Client k holds private data D_k and a classifier head of architecture a(k), one of G = 10 CNNs (CNN-1 … CNN-10), assigned contiguously (K/10 clients per architecture).</w:t>
+        <w:t xml:space="preserve"> K clients (10 clients, 50 or 100). Client k holds private data D_k and a classifier head of architecture a(k), one of G = 10 CNNs (CNN-1 … CNN-10), assigned contiguously (K/10 clients per architecture).</w:t>
       </w:r>
     </w:p>
     <w:p>
@@ -1579,7 +4287,7 @@
         <w:t xml:space="preserve">Data.</w:t>
       </w:r>
       <w:r>
-        <w:t xml:space="preserve"> MNIST, FashionMNIST and SVHN use a 10% fraction of the training set (6,000 / 6,000 / 7,326 images); CIFAR-10 uses 50% (25,000). In the paper's setting the data are split IID across clients. Test sets are the full balanced test sets.</w:t>
+        <w:t xml:space="preserve"> MNIST, FashionMNIST and SVHN use a 10% fraction of the training set (6,000 / 6,000 / 7,326 images); CIFAR-10 uses 50% (25,000). In the paper's setting the data are split evenly (balanced) across clients. Test sets are the full balanced test sets.</w:t>
       </w:r>
     </w:p>
     <w:p>
@@ -1636,10 +4344,10 @@
           <w:i/>
           <w:iCs/>
         </w:rPr>
-        <w:t xml:space="preserve">tail recall</w:t>
-      </w:r>
-      <w:r>
-        <w:t xml:space="preserve"> (mean recall of the four rarest classes).</w:t>
+        <w:t xml:space="preserve">rare-class accuracy</w:t>
+      </w:r>
+      <w:r>
+        <w:t xml:space="preserve"> (average accuracy on the four rarest classes; see "How to read the numbers").</w:t>
       </w:r>
     </w:p>
     <w:p>
@@ -1724,7 +4432,7 @@
           <wp:inline distT="0" distB="0" distL="0" distR="0">
             <wp:extent cx="6096000" cy="3295650"/>
             <wp:effectExtent t="0" r="0" b="0" l="0"/>
-            <wp:docPr id="1" name="f03_architectures.png" descr="Figure 2. Architectures. The CVAE-F's label projection W (C × 512) holds the only class-specific parameters; this matters in Part 2." title="f03_architectures.png"/>
+            <wp:docPr id="1" name="f03_architectures.png" descr="Figure 2. Architectures. The original generator's label projection W (C × 512) holds the only class-specific parameters; this matters in Part 2." title="f03_architectures.png"/>
             <wp:cNvGraphicFramePr>
               <a:graphicFrameLocks xmlns:a="http://schemas.openxmlformats.org/drawingml/2006/main" noChangeAspect="1"/>
             </wp:cNvGraphicFramePr>
@@ -1773,7 +4481,7 @@
           <w:sz w:val="18"/>
           <w:szCs w:val="18"/>
         </w:rPr>
-        <w:t xml:space="preserve">Figure 2. Architectures. The CVAE-F's label projection W (C × 512) holds the only class-specific parameters; this matters in Part 2.</w:t>
+        <w:t xml:space="preserve">Figure 2. Architectures. The original generator's label projection W (C × 512) holds the only class-specific parameters; this matters in Part 2.</w:t>
       </w:r>
     </w:p>
     <w:tbl>
@@ -2022,7 +4730,7 @@
                 <w:sz w:val="18"/>
                 <w:szCs w:val="18"/>
               </w:rPr>
-              <w:t xml:space="preserve">image resized to 1×32×32 (MNIST, FMNIST) / 3×32×32</w:t>
+              <w:t xml:space="preserve">image resized to 1×32×32 (MNIST, FashionMNIST) / 3×32×32</w:t>
             </w:r>
           </w:p>
         </w:tc>
@@ -2052,7 +4760,7 @@
                 <w:sz w:val="18"/>
                 <w:szCs w:val="18"/>
               </w:rPr>
-              <w:t xml:space="preserve">feature h: 3×16×16 = 768 (MNIST, FMNIST, SVHN); CIFAR-10 10×16×16 = 2,560</w:t>
+              <w:t xml:space="preserve">feature h: 3×16×16 = 768 (MNIST, FashionMNIST, SVHN); CIFAR-10 10×16×16 = 2,560</w:t>
             </w:r>
           </w:p>
         </w:tc>
@@ -2144,7 +4852,7 @@
                 <w:sz w:val="18"/>
                 <w:szCs w:val="18"/>
               </w:rPr>
-              <w:t xml:space="preserve">Generator G, CVAE-F (Table XX)</w:t>
+              <w:t xml:space="preserve">Generator G, original generator (Table XX)</w:t>
             </w:r>
           </w:p>
         </w:tc>
@@ -2546,7 +5254,7 @@
         <w:t xml:space="preserve">Local training:</w:t>
       </w:r>
       <w:r>
-        <w:t xml:space="preserve"> 5 epochs per round; φ and the client's head trained jointly; SGD, learning rate 0.1, batch 64 (128 for CIFAR-10); loss = cross-entropy CE(h_k(φ(x)), y).</w:t>
+        <w:t xml:space="preserve"> 5 epochs per round; φ and the client's head trained jointly; stochastic gradient descent, learning rate 0.1, batch 64 (128 for CIFAR-10); loss = cross-entropy cross-entropy(h_k(φ(x)), y).</w:t>
       </w:r>
     </w:p>
     <w:p>
@@ -2708,7 +5416,7 @@
         <w:t xml:space="preserve">Local training:</w:t>
       </w:r>
       <w:r>
-        <w:t xml:space="preserve"> 5 epochs per round of the conditional VAE, Adam with learning rate 10⁻³ and coupled weight decay 10⁻³, batch 64. The loss is the evidence lower bound:</w:t>
+        <w:t xml:space="preserve"> 5 epochs per round of the conditional variational autoencoder, Adam with learning rate 10⁻³ and coupled weight decay 10⁻³, batch 64. The loss is the evidence lower bound:</w:t>
       </w:r>
     </w:p>
     <w:p>
@@ -2863,7 +5571,7 @@
         <w:t xml:space="preserve">Synthetic phase:</w:t>
       </w:r>
       <w:r>
-        <w:t xml:space="preserve"> T_s = 1 epoch on generated features h̃ = G(z, y), with y drawn uniformly over the 10 classes and z ~ N(0, I), sampled locally from the client's own copy of G; loss CE(h_k(h̃), y).</w:t>
+        <w:t xml:space="preserve"> 1 synthetic epoch epoch on generated features h̃ = G(z, y), with y drawn uniformly over the 10 classes and z ~ N(0, I), sampled locally from the client's own copy of G; loss cross-entropy(h_k(h̃), y).</w:t>
       </w:r>
     </w:p>
     <w:p>
@@ -2883,7 +5591,7 @@
         <w:t xml:space="preserve">Real phase:</w:t>
       </w:r>
       <w:r>
-        <w:t xml:space="preserve"> T_r = 5 epochs on the client's real features φ(x); loss CE(h_k(φ(x)), y); SGD, learning rate 0.1.</w:t>
+        <w:t xml:space="preserve"> T_r = 5 epochs on the client's real features φ(x); loss cross-entropy(h_k(φ(x)), y); stochastic gradient descent, learning rate 0.1.</w:t>
       </w:r>
     </w:p>
     <w:p>
@@ -2903,7 +5611,7 @@
         <w:t xml:space="preserve">Uplink and aggregation:</w:t>
       </w:r>
       <w:r>
-        <w:t xml:space="preserve"> head weights, averaged within an architecture group only when several clients share an architecture (K = 50, 100). At K = 10 each architecture has one client, and nothing is exchanged in this stage.</w:t>
+        <w:t xml:space="preserve"> head weights, averaged within an architecture group only when several clients share an architecture (50 clients, 100). At 10 clients each architecture has one client, and nothing is exchanged in this stage.</w:t>
       </w:r>
     </w:p>
     <w:p>
@@ -3713,7 +6421,7 @@
                 <w:sz w:val="18"/>
                 <w:szCs w:val="18"/>
               </w:rPr>
-              <w:t xml:space="preserve">MNIST IID, K = 10 (best_mean_acc)</w:t>
+              <w:t xml:space="preserve">MNIST balanced, 10 clients (best_mean_acc)</w:t>
             </w:r>
           </w:p>
         </w:tc>
@@ -3835,7 +6543,7 @@
                 <w:sz w:val="18"/>
                 <w:szCs w:val="18"/>
               </w:rPr>
-              <w:t xml:space="preserve">MNIST IID, K = 50</w:t>
+              <w:t xml:space="preserve">MNIST balanced, 50 clients</w:t>
             </w:r>
           </w:p>
         </w:tc>
@@ -3957,7 +6665,7 @@
                 <w:sz w:val="18"/>
                 <w:szCs w:val="18"/>
               </w:rPr>
-              <w:t xml:space="preserve">MNIST IID, K = 100</w:t>
+              <w:t xml:space="preserve">MNIST balanced, 100 clients</w:t>
             </w:r>
           </w:p>
         </w:tc>
@@ -4079,7 +6787,7 @@
                 <w:sz w:val="18"/>
                 <w:szCs w:val="18"/>
               </w:rPr>
-              <w:t xml:space="preserve">FashionMNIST IID, K = 10</w:t>
+              <w:t xml:space="preserve">FashionMNIST balanced, 10 clients</w:t>
             </w:r>
           </w:p>
         </w:tc>
@@ -4337,7 +7045,7 @@
         <w:jc w:val="both"/>
       </w:pPr>
       <w:r>
-        <w:t xml:space="preserve">Class sizes n_c ∝ IF^{c/(C−1)}, IF = 100 (MNIST: 24 to ≈2,400 samples). Client shares: Dirichlet(0.5). Test sets balanced.</w:t>
+        <w:t xml:space="preserve">The most common class has 100 times as many training samples as the rarest, with sizes falling evenly (on a log scale) in between (MNIST: about 2,400 down to 24 samples). Each class is shared out among the clients with a Dirichlet(0.5) draw, so most clients have many samples of a few classes and none of several others. Test sets stay balanced.</w:t>
       </w:r>
     </w:p>
     <w:p>
@@ -4520,7 +7228,7 @@
         <w:t xml:space="preserve">whatever λ is</w:t>
       </w:r>
       <w:r>
-        <w:t xml:space="preserve"> (10⁻⁴ or 10⁻³ give the same step). Only λ = 0 removes it. With plain SGD the same decay would be about 1,000 times weaker here.</w:t>
+        <w:t xml:space="preserve"> (10⁻⁴ or 10⁻³ give the same step). Only λ = 0 removes it. With plain stochastic gradient descent the same decay would be about 1,000 times weaker here.</w:t>
       </w:r>
     </w:p>
     <w:p>
@@ -4613,7 +7321,7 @@
                 <w:sz w:val="18"/>
                 <w:szCs w:val="18"/>
               </w:rPr>
-              <w:t xml:space="preserve">Measurement (IF = 100, Dir 0.5, K = 10)</w:t>
+              <w:t xml:space="preserve">Measurement (imbalance 100 : 1, Dirichlet 0.5, 10 clients)</w:t>
             </w:r>
           </w:p>
         </w:tc>
@@ -4866,7 +7574,7 @@
                 <w:sz w:val="18"/>
                 <w:szCs w:val="18"/>
               </w:rPr>
-              <w:t xml:space="preserve">Same, with non-holders excluded from the average (HWA)</w:t>
+              <w:t xml:space="preserve">Same, with non-holders excluded from the average </w:t>
             </w:r>
           </w:p>
         </w:tc>
@@ -5110,7 +7818,7 @@
                 <w:sz w:val="18"/>
                 <w:szCs w:val="18"/>
               </w:rPr>
-              <w:t xml:space="preserve">GeFL-F balanced accuracy: IID → long tail</w:t>
+              <w:t xml:space="preserve">GeFL-F balanced accuracy: balanced → long tail</w:t>
             </w:r>
           </w:p>
         </w:tc>
@@ -5227,7 +7935,7 @@
         <w:spacing w:after="80" w:before="180"/>
       </w:pPr>
       <w:r>
-        <w:t xml:space="preserve">Direct test of Theorem 1 on the real generator (T01: MNIST long tail, K = 10, 40 rounds, 4 arms)</w:t>
+        <w:t xml:space="preserve">Direct test of Theorem 1 on the real generator (T01: MNIST long tail, 10 clients, 40 rounds, 4 arms)</w:t>
       </w:r>
     </w:p>
     <w:p>
@@ -5240,7 +7948,7 @@
           <wp:inline distT="0" distB="0" distL="0" distR="0">
             <wp:extent cx="6096000" cy="2066925"/>
             <wp:effectExtent t="0" r="0" b="0" l="0"/>
-            <wp:docPr id="1" name="t01_collapse.png" descr="Figure 5b. (a) Tail rows shrink to 15 % of head rows with decay 10⁻³ or 10⁻⁴ (identical curves), not without decay, and not with HWA. (b) The bound holds in all 1,200 row-rounds. (c) Rows of classes held by 7–9 of 10 clients still collapse; under HWA they grow." title="t01_collapse.png"/>
+            <wp:docPr id="1" name="t01_collapse.png" descr="Figure 5b. (a) Tail rows shrink to 15 % of head rows with decay 10⁻³ or 10⁻⁴ (identical curves), not without decay, and not with holder-weighted averaging. (b) The bound holds in all 1,200 row-rounds. (c) Rows of classes held by 7–9 of 10 clients still collapse; under holder-weighted averaging they grow." title="t01_collapse.png"/>
             <wp:cNvGraphicFramePr>
               <a:graphicFrameLocks xmlns:a="http://schemas.openxmlformats.org/drawingml/2006/main" noChangeAspect="1"/>
             </wp:cNvGraphicFramePr>
@@ -5289,7 +7997,7 @@
           <w:sz w:val="18"/>
           <w:szCs w:val="18"/>
         </w:rPr>
-        <w:t xml:space="preserve">Figure 5b. (a) Tail rows shrink to 15 % of head rows with decay 10⁻³ or 10⁻⁴ (identical curves), not without decay, and not with HWA. (b) The bound holds in all 1,200 row-rounds. (c) Rows of classes held by 7–9 of 10 clients still collapse; under HWA they grow.</w:t>
+        <w:t xml:space="preserve">Figure 5b. (a) Tail rows shrink to 15 % of head rows with decay 10⁻³ or 10⁻⁴ (identical curves), not without decay, and not with holder-weighted averaging. (b) The bound holds in all 1,200 row-rounds. (c) Rows of classes held by 7–9 of 10 clients still collapse; under holder-weighted averaging they grow.</w:t>
       </w:r>
     </w:p>
     <w:tbl>
@@ -5716,7 +8424,7 @@
                 <w:sz w:val="18"/>
                 <w:szCs w:val="18"/>
               </w:rPr>
-              <w:t xml:space="preserve">HWA, decay 10⁻³</w:t>
+              <w:t xml:space="preserve">Holder-weighted averaging, decay 10⁻³</w:t>
             </w:r>
           </w:p>
         </w:tc>
@@ -5810,7 +8518,7 @@
         <w:t xml:space="preserve">generator's</w:t>
       </w:r>
       <w:r>
-        <w:t xml:space="preserve"> conditioning rows and the Adam-decay explanation. The obvious existing fixes (AdamW, no decay on the rows, lazy decay) are compared with HWA in the prepared job K15 (Part 8).</w:t>
+        <w:t xml:space="preserve"> conditioning rows and the Adam-decay explanation. The obvious existing fixes (AdamW, no decay on the rows, lazy decay) are compared with holder-weighted averaging in the prepared job K15 (Part 8).</w:t>
       </w:r>
     </w:p>
     <w:p>
@@ -5829,7 +8537,7 @@
         <w:jc w:val="both"/>
       </w:pPr>
       <w:r>
-        <w:t xml:space="preserve">A head trained on fake features is only as good on real data as the fake features are close to real ones (TV distance). For rare classes this gap is large:</w:t>
+        <w:t xml:space="preserve">A head trained on fake features is only as good on real data as the fake features are close to real ones (total-variation distance). For rare classes this gap is large:</w:t>
       </w:r>
     </w:p>
     <w:p>
@@ -5973,7 +8681,7 @@
         <w:spacing w:after="80" w:before="180"/>
       </w:pPr>
       <w:r>
-        <w:t xml:space="preserve">HWA: holder-weighted aggregation (kept)</w:t>
+        <w:t xml:space="preserve">Holder-weighted averaging (kept)</w:t>
       </w:r>
     </w:p>
     <w:p>
@@ -6067,7 +8775,7 @@
         <w:t xml:space="preserve">Result:</w:t>
       </w:r>
       <w:r>
-        <w:t xml:space="preserve"> +9.0 / +11.2 / +3.4 / +6.0 (MNIST / FMNIST / CIFAR-10 / SVHN, long tail); row ratio back to 0.80–1.05. Later replaced in Ours-A by the mean anchor, which has no class rows at all.</w:t>
+        <w:t xml:space="preserve"> +9.0 / +11.2 / +3.4 / +6.0 (MNIST / FashionMNIST / CIFAR-10 / SVHN, long tail); row ratio back to 0.80–1.05. Later replaced in Ours-A by the mean anchor, which has no class rows at all.</w:t>
       </w:r>
     </w:p>
     <w:p>
@@ -6077,7 +8785,7 @@
         <w:spacing w:after="80" w:before="180"/>
       </w:pPr>
       <w:r>
-        <w:t xml:space="preserve">LCD: lazy conditioning decay (dropped)</w:t>
+        <w:t xml:space="preserve">Lazy decay (dropped)</w:t>
       </w:r>
     </w:p>
     <w:p>
@@ -6113,7 +8821,7 @@
         <w:t xml:space="preserve">Result:</w:t>
       </w:r>
       <w:r>
-        <w:t xml:space="preserve"> 78.6 vs 79.1 for HWA; adds nothing.</w:t>
+        <w:t xml:space="preserve"> 78.6 vs 79.1 for holder-weighted averaging; adds nothing.</w:t>
       </w:r>
     </w:p>
     <w:p>
@@ -6133,7 +8841,7 @@
         <w:spacing w:after="80" w:before="180"/>
       </w:pPr>
       <w:r>
-        <w:t xml:space="preserve">LA: logit adjustment with the client's own prior (kept; established technique)</w:t>
+        <w:t xml:space="preserve">Logit adjustment with the client's own class shares (kept; established technique)</w:t>
       </w:r>
     </w:p>
     <w:p>
@@ -6227,7 +8935,7 @@
         <w:t xml:space="preserve">Result:</w:t>
       </w:r>
       <w:r>
-        <w:t xml:space="preserve"> +3.6 to +6.3 on all four datasets. Needed because the 5 real epochs pull each head back to its own skew. No effect in IID.</w:t>
+        <w:t xml:space="preserve"> +3.6 to +6.3 on all four datasets. Needed because the 5 real epochs pull each head back to its own skew. No effect in balanced.</w:t>
       </w:r>
     </w:p>
     <w:p>
@@ -6237,7 +8945,7 @@
         <w:spacing w:after="80" w:before="180"/>
       </w:pPr>
       <w:r>
-        <w:t xml:space="preserve">CSL: consensus soft labels on synthetic features (kept)</w:t>
+        <w:t xml:space="preserve">Consensus labels on synthetic features (kept)</w:t>
       </w:r>
     </w:p>
     <w:p>
@@ -6331,7 +9039,7 @@
         <w:t xml:space="preserve">Result:</w:t>
       </w:r>
       <w:r>
-        <w:t xml:space="preserve"> +2.5 MNIST long tail; +0.5 to +0.8 IID. β = 0.5 better than β = 1.</w:t>
+        <w:t xml:space="preserve"> +2.5 MNIST long tail; +0.5 to +0.8 balanced. β = 0.5 better than β = 1.</w:t>
       </w:r>
     </w:p>
     <w:p>
@@ -6341,7 +9049,7 @@
         <w:spacing w:after="80" w:before="180"/>
       </w:pPr>
       <w:r>
-        <w:t xml:space="preserve">T_s = 10: a larger synthetic budget (kept)</w:t>
+        <w:t xml:space="preserve">10 synthetic epochs: a larger synthetic budget (kept)</w:t>
       </w:r>
     </w:p>
     <w:p>
@@ -6425,7 +9133,7 @@
         <w:t xml:space="preserve">Result:</w:t>
       </w:r>
       <w:r>
-        <w:t xml:space="preserve"> with the anchored generator +1.7 (MNIST long tail) and +3.9 at K = 100; with the original generator −0.05, as predicted.</w:t>
+        <w:t xml:space="preserve"> with the anchored generator +1.7 (MNIST long tail) and +3.9 at 100 clients; with the original generator −0.05, as predicted.</w:t>
       </w:r>
     </w:p>
     <w:tbl>
@@ -6610,7 +9318,7 @@
                 <w:sz w:val="18"/>
                 <w:szCs w:val="18"/>
               </w:rPr>
-              <w:t xml:space="preserve">Bayesian CSL</w:t>
+              <w:t xml:space="preserve">Bayesian consensus labels</w:t>
             </w:r>
           </w:p>
         </w:tc>
@@ -6670,7 +9378,7 @@
                 <w:sz w:val="18"/>
                 <w:szCs w:val="18"/>
               </w:rPr>
-              <w:t xml:space="preserve">83.16 vs 84.22 (FMNIST IID, p = 0.004); 87.3 vs 90.5 (MNIST LT)</w:t>
+              <w:t xml:space="preserve">83.16 vs 84.22 (FashionMNIST balanced, p = 0.004); 87.3 vs 90.5 (MNIST long tail)</w:t>
             </w:r>
           </w:p>
         </w:tc>
@@ -6732,7 +9440,7 @@
                 <w:sz w:val="18"/>
                 <w:szCs w:val="18"/>
               </w:rPr>
-              <w:t xml:space="preserve">CSLM</w:t>
+              <w:t xml:space="preserve">Consensus labels inside real batches</w:t>
             </w:r>
           </w:p>
         </w:tc>
@@ -6792,7 +9500,7 @@
                 <w:sz w:val="18"/>
                 <w:szCs w:val="18"/>
               </w:rPr>
-              <w:t xml:space="preserve">SVHN LT 49.9 vs 62.4</w:t>
+              <w:t xml:space="preserve">SVHN long tail 49.9 vs 62.4</w:t>
             </w:r>
           </w:p>
         </w:tc>
@@ -6854,7 +9562,7 @@
                 <w:sz w:val="18"/>
                 <w:szCs w:val="18"/>
               </w:rPr>
-              <w:t xml:space="preserve">PCM</w:t>
+              <w:t xml:space="preserve">Prior-completing batches</w:t>
             </w:r>
           </w:p>
         </w:tc>
@@ -6914,7 +9622,7 @@
                 <w:sz w:val="18"/>
                 <w:szCs w:val="18"/>
               </w:rPr>
-              <w:t xml:space="preserve">FMNIST LT 59.6 vs 65.2 (with LA)</w:t>
+              <w:t xml:space="preserve">FashionMNIST long tail 59.6 vs 65.2 (with logit adjustment)</w:t>
             </w:r>
           </w:p>
         </w:tc>
@@ -6976,7 +9684,7 @@
                 <w:sz w:val="18"/>
                 <w:szCs w:val="18"/>
               </w:rPr>
-              <w:t xml:space="preserve">RSA</w:t>
+              <w:t xml:space="preserve">Real–synthetic alignment</w:t>
             </w:r>
           </w:p>
         </w:tc>
@@ -7098,7 +9806,7 @@
                 <w:sz w:val="18"/>
                 <w:szCs w:val="18"/>
               </w:rPr>
-              <w:t xml:space="preserve">VCT / MixUp</w:t>
+              <w:t xml:space="preserve">Our mixing variant / MixUp</w:t>
             </w:r>
           </w:p>
         </w:tc>
@@ -7128,7 +9836,7 @@
                 <w:sz w:val="18"/>
                 <w:szCs w:val="18"/>
               </w:rPr>
-              <w:t xml:space="preserve">Mix real features with consensus-labelled synthetic partners (VCT) or with each other (MixUp)</w:t>
+              <w:t xml:space="preserve">Mix real features with consensus-labelled synthetic partners (our mixing variant) or with each other (MixUp)</w:t>
             </w:r>
           </w:p>
         </w:tc>
@@ -7158,7 +9866,7 @@
                 <w:sz w:val="18"/>
                 <w:szCs w:val="18"/>
               </w:rPr>
-              <w:t xml:space="preserve">CIFAR-10 IID: VCT 60.29, MixUp 59.98, neither 60.93; LT tail recall +10 with VCT</w:t>
+              <w:t xml:space="preserve">CIFAR-10 balanced: our mixing variant 60.29, MixUp 59.98, neither 60.93; long tail tail recall +10 with our mixing variant</w:t>
             </w:r>
           </w:p>
         </w:tc>
@@ -7391,7 +10099,7 @@
                 <w:sz w:val="18"/>
                 <w:szCs w:val="18"/>
               </w:rPr>
-              <w:t xml:space="preserve">SED: server-side ensemble distillation</w:t>
+              <w:t xml:space="preserve">Server-side ensemble distillation</w:t>
             </w:r>
           </w:p>
         </w:tc>
@@ -7451,7 +10159,7 @@
                 <w:sz w:val="18"/>
                 <w:szCs w:val="18"/>
               </w:rPr>
-              <w:t xml:space="preserve">FMNIST IID 81.69 → 80.96; LT 70.65 → 71.30</w:t>
+              <w:t xml:space="preserve">FashionMNIST balanced 81.69 → 80.96; long tail 70.65 → 71.30</w:t>
             </w:r>
           </w:p>
         </w:tc>
@@ -7513,7 +10221,7 @@
                 <w:sz w:val="18"/>
                 <w:szCs w:val="18"/>
               </w:rPr>
-              <w:t xml:space="preserve">BCR: balanced classifier re-training</w:t>
+              <w:t xml:space="preserve">Balanced classifier re-training</w:t>
             </w:r>
           </w:p>
         </w:tc>
@@ -7573,7 +10281,7 @@
                 <w:sz w:val="18"/>
                 <w:szCs w:val="18"/>
               </w:rPr>
-              <w:t xml:space="preserve">62.0 vs 65.2 for LA (FMNIST LT, quick)</w:t>
+              <w:t xml:space="preserve">62.0 vs 65.2 for logit adjustment (FashionMNIST long tail, quick)</w:t>
             </w:r>
           </w:p>
         </w:tc>
@@ -7603,7 +10311,7 @@
                 <w:sz w:val="18"/>
                 <w:szCs w:val="18"/>
               </w:rPr>
-              <w:t xml:space="preserve">Dropped: weaker than LA</w:t>
+              <w:t xml:space="preserve">Dropped: weaker than logit adjustment</w:t>
             </w:r>
           </w:p>
         </w:tc>
@@ -7635,7 +10343,7 @@
                 <w:sz w:val="18"/>
                 <w:szCs w:val="18"/>
               </w:rPr>
-              <w:t xml:space="preserve">GF: gradient filtering</w:t>
+              <w:t xml:space="preserve">Gradient filtering</w:t>
             </w:r>
           </w:p>
         </w:tc>
@@ -7757,7 +10465,7 @@
                 <w:sz w:val="18"/>
                 <w:szCs w:val="18"/>
               </w:rPr>
-              <w:t xml:space="preserve">BBC: balanced bias calibration (Saerens et al., 2002)</w:t>
+              <w:t xml:space="preserve">Bias calibration (Saerens et al., 2002)</w:t>
             </w:r>
           </w:p>
         </w:tc>
@@ -7817,7 +10525,7 @@
                 <w:sz w:val="18"/>
                 <w:szCs w:val="18"/>
               </w:rPr>
-              <w:t xml:space="preserve">+0.35 to +1.4 under the long tail (MNIST/FMNIST); stays below the last-layer refit in every run</w:t>
+              <w:t xml:space="preserve">+0.35 to +1.4 under the long tail (MNIST/FashionMNIST); stays below the last-layer refit in every run</w:t>
             </w:r>
           </w:p>
         </w:tc>
@@ -7847,7 +10555,7 @@
                 <w:sz w:val="18"/>
                 <w:szCs w:val="18"/>
               </w:rPr>
-              <w:t xml:space="preserve">Kept as an optional, gated post-hoc step; overlaps with LA (Part 5.6); cannot fix a weight error (Part 6)</w:t>
+              <w:t xml:space="preserve">Kept as an optional, gated post-hoc step; overlaps with logit adjustment (Part 5.6); cannot fix a weight error (Part 6)</w:t>
             </w:r>
           </w:p>
         </w:tc>
@@ -8050,7 +10758,7 @@
                 <w:sz w:val="18"/>
                 <w:szCs w:val="18"/>
               </w:rPr>
-              <w:t xml:space="preserve">FSG: Gaussian from exact statistics</w:t>
+              <w:t xml:space="preserve">Gaussian generator from exact statistics</w:t>
             </w:r>
           </w:p>
         </w:tc>
@@ -8110,7 +10818,7 @@
                 <w:sz w:val="18"/>
                 <w:szCs w:val="18"/>
               </w:rPr>
-              <w:t xml:space="preserve">MNIST LT 87.0; CIFAR-10 LT 44.2; SVHN LT 44.2 &lt; GeFL-F 50.5</w:t>
+              <w:t xml:space="preserve">MNIST long tail 87.0; CIFAR-10 long tail 44.2; SVHN long tail 44.2 &lt; GeFL-F 50.5</w:t>
             </w:r>
           </w:p>
         </w:tc>
@@ -8140,7 +10848,7 @@
                 <w:sz w:val="18"/>
                 <w:szCs w:val="18"/>
               </w:rPr>
-              <w:t xml:space="preserve">Dropped: its Bayes head is LDA (eq. 8), which reaches only 21 % on SVHN pixels</w:t>
+              <w:t xml:space="preserve">Dropped: its Bayes head is linear discriminant analysis (eq. 8), which reaches only 21 % on SVHN pixels</w:t>
             </w:r>
           </w:p>
         </w:tc>
@@ -8172,7 +10880,7 @@
                 <w:sz w:val="18"/>
                 <w:szCs w:val="18"/>
               </w:rPr>
-              <w:t xml:space="preserve">Hybrid CVAE / Gaussian</w:t>
+              <w:t xml:space="preserve">Hybrid original generator / Gaussian</w:t>
             </w:r>
           </w:p>
         </w:tc>
@@ -8294,7 +11002,7 @@
                 <w:sz w:val="18"/>
                 <w:szCs w:val="18"/>
               </w:rPr>
-              <w:t xml:space="preserve">KME-Gen</w:t>
+              <w:t xml:space="preserve">Server-trained generator (kernel matching)</w:t>
             </w:r>
           </w:p>
         </w:tc>
@@ -8324,7 +11032,7 @@
                 <w:sz w:val="18"/>
                 <w:szCs w:val="18"/>
               </w:rPr>
-              <w:t xml:space="preserve">Generator trained only at the server, by MMD to exact kernel embeddings</w:t>
+              <w:t xml:space="preserve">Generator trained only at the server, by fake-to-real distance to exact kernel embeddings</w:t>
             </w:r>
           </w:p>
         </w:tc>
@@ -8354,7 +11062,7 @@
                 <w:sz w:val="18"/>
                 <w:szCs w:val="18"/>
               </w:rPr>
-              <w:t xml:space="preserve">MNIST 89.9, FMNIST 75.1 (+15 over GeFL-F) at 1/3000 of the communication</w:t>
+              <w:t xml:space="preserve">MNIST 89.9, FashionMNIST 75.1 (+15 over GeFL-F) at 1/3000 of the communication</w:t>
             </w:r>
           </w:p>
         </w:tc>
@@ -8416,7 +11124,7 @@
                 <w:sz w:val="18"/>
                 <w:szCs w:val="18"/>
               </w:rPr>
-              <w:t xml:space="preserve">DDPM-F (paper's diffusion generator)</w:t>
+              <w:t xml:space="preserve">Diffusion generator (paper's diffusion generator)</w:t>
             </w:r>
           </w:p>
         </w:tc>
@@ -8476,7 +11184,7 @@
                 <w:sz w:val="18"/>
                 <w:szCs w:val="18"/>
               </w:rPr>
-              <w:t xml:space="preserve">SVHN IID 70.37 vs DDPM GeFL-F 69.77 (p = 0.10); far below 76–77 with CVAE</w:t>
+              <w:t xml:space="preserve">SVHN balanced 70.37 vs diffusion GeFL-F 69.77 (p = 0.10); far below 76–77 with original generator</w:t>
             </w:r>
           </w:p>
         </w:tc>
@@ -8538,7 +11246,7 @@
                 <w:sz w:val="18"/>
                 <w:szCs w:val="18"/>
               </w:rPr>
-              <w:t xml:space="preserve">ZP: ex-post latent prior</w:t>
+              <w:t xml:space="preserve">Latent prior fitted afterwards</w:t>
             </w:r>
           </w:p>
         </w:tc>
@@ -8598,7 +11306,7 @@
                 <w:sz w:val="18"/>
                 <w:szCs w:val="18"/>
               </w:rPr>
-              <w:t xml:space="preserve">PC + ZP 91.69 vs PC + MC 92.31</w:t>
+              <w:t xml:space="preserve">Mean anchor + latent prior 91.69 vs mean anchor + moment correction 92.31</w:t>
             </w:r>
           </w:p>
         </w:tc>
@@ -8628,7 +11336,7 @@
                 <w:sz w:val="18"/>
                 <w:szCs w:val="18"/>
               </w:rPr>
-              <w:t xml:space="preserve">Dropped: MC fixes the same issue better</w:t>
+              <w:t xml:space="preserve">Dropped: moment correction fixes the same issue better</w:t>
             </w:r>
           </w:p>
         </w:tc>
@@ -8660,7 +11368,7 @@
                 <w:sz w:val="18"/>
                 <w:szCs w:val="18"/>
               </w:rPr>
-              <w:t xml:space="preserve">PCR: class rows + mean anchor</w:t>
+              <w:t xml:space="preserve">Class rows plus mean anchor</w:t>
             </w:r>
           </w:p>
         </w:tc>
@@ -8720,7 +11428,7 @@
                 <w:sz w:val="18"/>
                 <w:szCs w:val="18"/>
               </w:rPr>
-              <w:t xml:space="preserve">Ties Ours-A on MNIST/FMNIST; SVHN LT 60.9 vs 65.6 for rows alone</w:t>
+              <w:t xml:space="preserve">Ties Ours-A on MNIST/FashionMNIST; SVHN long tail 60.9 vs 65.6 for rows alone</w:t>
             </w:r>
           </w:p>
         </w:tc>
@@ -8769,7 +11477,7 @@
       <w:r>
         <w:drawing>
           <wp:inline distT="0" distB="0" distL="0" distR="0">
-            <wp:extent cx="5715000" cy="323850"/>
+            <wp:extent cx="5715000" cy="295275"/>
             <wp:effectExtent t="0" r="0" b="0" l="0"/>
             <wp:docPr id="1" name="eq_lda" descr="equation" title="eq_lda"/>
             <wp:cNvGraphicFramePr>
@@ -8794,7 +11502,7 @@
                   <pic:spPr bwMode="auto">
                     <a:xfrm>
                       <a:off x="0" y="0"/>
-                      <a:ext cx="5715000" cy="323850"/>
+                      <a:ext cx="5715000" cy="295275"/>
                     </a:xfrm>
                     <a:prstGeom prst="rect">
                       <a:avLst/>
@@ -8833,10 +11541,10 @@
           <w:b/>
           <w:bCs/>
         </w:rPr>
-        <w:t xml:space="preserve">MC (kept in Ours-A).</w:t>
-      </w:r>
-      <w:r>
-        <w:t xml:space="preserve"> Moves each fake class onto its exact mean and spread with the smallest change (Proposition 3): +1.6 MNIST, +1.6 FMNIST over the plain anchored generator.</w:t>
+        <w:t xml:space="preserve">Moment correction (kept in Ours-A).</w:t>
+      </w:r>
+      <w:r>
+        <w:t xml:space="preserve"> Moves each fake class onto its exact mean and spread with the smallest change (Proposition 3): +1.6 MNIST, +1.6 FashionMNIST over the plain anchored generator.</w:t>
       </w:r>
     </w:p>
     <w:p>
@@ -8849,10 +11557,10 @@
           <w:b/>
           <w:bCs/>
         </w:rPr>
-        <w:t xml:space="preserve">Covariance version (MC-S / MC-B): future scope.</w:t>
-      </w:r>
-      <w:r>
-        <w:t xml:space="preserve"> Helps FMNIST and SVHN but not yet complete on every dataset (Part 8).</w:t>
+        <w:t xml:space="preserve">Covariance correction: promising, not yet final.</w:t>
+      </w:r>
+      <w:r>
+        <w:t xml:space="preserve"> Uses each class's exact covariance where the class has enough data: FashionMNIST 81.57 (long tail) and 85.75 (balanced, above the paper's best); unstable on one MNIST seed (Part 8).</w:t>
       </w:r>
     </w:p>
     <w:p>
@@ -9307,7 +12015,7 @@
                 <w:sz w:val="18"/>
                 <w:szCs w:val="18"/>
               </w:rPr>
-              <w:t xml:space="preserve">Feature extractor (FE), same as GeFL-F</w:t>
+              <w:t xml:space="preserve">Feature extractor, same as GeFL-F</w:t>
             </w:r>
           </w:p>
         </w:tc>
@@ -9671,7 +12379,7 @@
                 <w:sz w:val="18"/>
                 <w:szCs w:val="18"/>
               </w:rPr>
-              <w:t xml:space="preserve">PC-VAE generator</w:t>
+              <w:t xml:space="preserve">Mean-anchored generator generator</w:t>
             </w:r>
           </w:p>
         </w:tc>
@@ -9853,7 +12561,7 @@
                 <w:sz w:val="18"/>
                 <w:szCs w:val="18"/>
               </w:rPr>
-              <w:t xml:space="preserve">MC: moment fix</w:t>
+              <w:t xml:space="preserve">Moment correction: moment fix</w:t>
             </w:r>
           </w:p>
         </w:tc>
@@ -10035,7 +12743,7 @@
                 <w:sz w:val="18"/>
                 <w:szCs w:val="18"/>
               </w:rPr>
-              <w:t xml:space="preserve">KH: fingerprint selection</w:t>
+              <w:t xml:space="preserve">Sample selection: fingerprint selection</w:t>
             </w:r>
           </w:p>
         </w:tc>
@@ -10217,7 +12925,7 @@
                 <w:sz w:val="18"/>
                 <w:szCs w:val="18"/>
               </w:rPr>
-              <w:t xml:space="preserve">CSL: consensus labels</w:t>
+              <w:t xml:space="preserve">Consensus labels: consensus labels</w:t>
             </w:r>
           </w:p>
         </w:tc>
@@ -10399,7 +13107,7 @@
                 <w:sz w:val="18"/>
                 <w:szCs w:val="18"/>
               </w:rPr>
-              <w:t xml:space="preserve">LA: client-prior loss</w:t>
+              <w:t xml:space="preserve">Logit adjustment: client-prior loss</w:t>
             </w:r>
           </w:p>
         </w:tc>
@@ -10941,7 +13649,7 @@
                 <w:sz w:val="18"/>
                 <w:szCs w:val="18"/>
               </w:rPr>
-              <w:t xml:space="preserve">Once, right after Stage I (the FE is frozen, so features never change again).</w:t>
+              <w:t xml:space="preserve">Once, right after Stage I (the feature extractor is frozen, so features never change again).</w:t>
             </w:r>
           </w:p>
         </w:tc>
@@ -11474,7 +14182,7 @@
                 <w:sz w:val="18"/>
                 <w:szCs w:val="18"/>
               </w:rPr>
-              <w:t xml:space="preserve">class mean (used by PC-VAE and MC)</w:t>
+              <w:t xml:space="preserve">class mean (used by mean-anchored generator and moment correction)</w:t>
             </w:r>
           </w:p>
         </w:tc>
@@ -11596,7 +14304,7 @@
                 <w:sz w:val="18"/>
                 <w:szCs w:val="18"/>
               </w:rPr>
-              <w:t xml:space="preserve">class spread (used by MC)</w:t>
+              <w:t xml:space="preserve">class spread (used by moment correction)</w:t>
             </w:r>
           </w:p>
         </w:tc>
@@ -11718,7 +14426,7 @@
                 <w:sz w:val="18"/>
                 <w:szCs w:val="18"/>
               </w:rPr>
-              <w:t xml:space="preserve">class fingerprint (used by KH)</w:t>
+              <w:t xml:space="preserve">class fingerprint (used by sample selection)</w:t>
             </w:r>
           </w:p>
         </w:tc>
@@ -11807,7 +14515,7 @@
         <w:spacing w:after="120" w:before="240"/>
       </w:pPr>
       <w:r>
-        <w:t xml:space="preserve">4.3 Step 2: the generator PC-VAE (replaces CVAE-F in Stage II)</w:t>
+        <w:t xml:space="preserve">4.3 Step 2: the generator mean-anchored generator (replaces original generator in Stage II)</w:t>
       </w:r>
     </w:p>
     <w:p>
@@ -11820,7 +14528,7 @@
           <wp:inline distT="0" distB="0" distL="0" distR="0">
             <wp:extent cx="6096000" cy="3905250"/>
             <wp:effectExtent t="0" r="0" b="0" l="0"/>
-            <wp:docPr id="1" name="f13_pcvae.png" descr="Figure 8. PC-VAE with every shape. Blue boxes: where the exact class mean enters." title="f13_pcvae.png"/>
+            <wp:docPr id="1" name="f13_pcvae.png" descr="Figure 8. Mean-anchored generator with every shape. Blue boxes: where the exact class mean enters." title="f13_pcvae.png"/>
             <wp:cNvGraphicFramePr>
               <a:graphicFrameLocks xmlns:a="http://schemas.openxmlformats.org/drawingml/2006/main" noChangeAspect="1"/>
             </wp:cNvGraphicFramePr>
@@ -11869,7 +14577,7 @@
           <w:sz w:val="18"/>
           <w:szCs w:val="18"/>
         </w:rPr>
-        <w:t xml:space="preserve">Figure 8. PC-VAE with every shape. Blue boxes: where the exact class mean enters.</w:t>
+        <w:t xml:space="preserve">Figure 8. Mean-anchored generator with every shape. Blue boxes: where the exact class mean enters.</w:t>
       </w:r>
     </w:p>
     <w:tbl>
@@ -11954,7 +14662,7 @@
                 <w:sz w:val="18"/>
                 <w:szCs w:val="18"/>
               </w:rPr>
-              <w:t xml:space="preserve">PC-VAE</w:t>
+              <w:t xml:space="preserve">Mean-anchored generator</w:t>
             </w:r>
           </w:p>
         </w:tc>
@@ -12018,7 +14726,7 @@
                 <w:sz w:val="18"/>
                 <w:szCs w:val="18"/>
               </w:rPr>
-              <w:t xml:space="preserve">In CVAE-F the class enters only through a learned row w_y. A client without class c only shrinks w_c (weight decay), so rows of rare classes collapse (Theorem 1, Part 2.2).</w:t>
+              <w:t xml:space="preserve">In original generator the class enters only through a learned row w_y. A client without class c only shrinks w_c (weight decay), so rows of rare classes collapse (Theorem 1, Part 2.2).</w:t>
             </w:r>
           </w:p>
         </w:tc>
@@ -12354,7 +15062,7 @@
                 <w:sz w:val="18"/>
                 <w:szCs w:val="18"/>
               </w:rPr>
-              <w:t xml:space="preserve">5.94 M parameters (CVAE-F: 5.55 M). Same training as GeFL-F: loss ‖h̃ − h‖² + KL, Adam lr 0.001, wd 0.001, batch 64, 5 local epochs, 100 rounds (CIFAR-10: 200).</w:t>
+              <w:t xml:space="preserve">5.94 M parameters (original generator: 5.55 M). Same training as GeFL-F: loss ‖h̃ − h‖² + KL, Adam lr 0.001, wd 0.001, batch 64, 5 local epochs, 100 rounds (CIFAR-10: 200).</w:t>
             </w:r>
           </w:p>
         </w:tc>
@@ -12500,7 +15208,7 @@
                 <w:sz w:val="18"/>
                 <w:szCs w:val="18"/>
               </w:rPr>
-              <w:t xml:space="preserve">MNIST / FMNIST / SVHN</w:t>
+              <w:t xml:space="preserve">MNIST / FashionMNIST / SVHN</w:t>
             </w:r>
           </w:p>
         </w:tc>
@@ -12657,7 +15365,7 @@
                 <w:sz w:val="18"/>
                 <w:szCs w:val="18"/>
               </w:rPr>
-              <w:t xml:space="preserve">Conv 4×4 stride 2 → BN → ReLU (×4)</w:t>
+              <w:t xml:space="preserve">Conv 4×4 stride 2 → batch norm → ReLU (×4)</w:t>
             </w:r>
           </w:p>
         </w:tc>
@@ -13103,7 +15811,7 @@
         <w:spacing w:after="120" w:before="240"/>
       </w:pPr>
       <w:r>
-        <w:t xml:space="preserve">4.4 Step 3: moment fix (MC)</w:t>
+        <w:t xml:space="preserve">4.4 Step 3: moment fix </w:t>
       </w:r>
     </w:p>
     <w:tbl>
@@ -13188,7 +15896,7 @@
                 <w:sz w:val="18"/>
                 <w:szCs w:val="18"/>
               </w:rPr>
-              <w:t xml:space="preserve">MC</w:t>
+              <w:t xml:space="preserve">Moment correction</w:t>
             </w:r>
           </w:p>
         </w:tc>
@@ -13252,7 +15960,7 @@
                 <w:sz w:val="18"/>
                 <w:szCs w:val="18"/>
               </w:rPr>
-              <w:t xml:space="preserve">A VAE's samples are too narrow (under-dispersed), and the mean of a rare class can be slightly off.</w:t>
+              <w:t xml:space="preserve">A variational autoencoder's samples are too narrow (under-dispersed), and the mean of a rare class can be slightly off.</w:t>
             </w:r>
           </w:p>
         </w:tc>
@@ -13658,7 +16366,7 @@
         <w:spacing w:after="120" w:before="240"/>
       </w:pPr>
       <w:r>
-        <w:t xml:space="preserve">4.5 Step 4: fingerprint selection (kernel herding, KH)</w:t>
+        <w:t xml:space="preserve">4.5 Step 4: fingerprint selection (kernel herding, sample selection)</w:t>
       </w:r>
     </w:p>
     <w:tbl>
@@ -13743,7 +16451,7 @@
                 <w:sz w:val="18"/>
                 <w:szCs w:val="18"/>
               </w:rPr>
-              <w:t xml:space="preserve">KH</w:t>
+              <w:t xml:space="preserve">Sample selection</w:t>
             </w:r>
           </w:p>
         </w:tc>
@@ -13951,7 +16659,7 @@
                 <w:sz w:val="18"/>
                 <w:szCs w:val="18"/>
               </w:rPr>
-              <w:t xml:space="preserve">A head's error on real data differs from its error on fake data by at most B · MMD(fake, real). KH directly lowers this MMD.</w:t>
+              <w:t xml:space="preserve">A head's error on real data differs from its error on fake data by at most B × (fake-to-real distance). Sample selection directly lowers this fake-to-real distance.</w:t>
             </w:r>
           </w:p>
         </w:tc>
@@ -14015,7 +16723,7 @@
                 <w:sz w:val="18"/>
                 <w:szCs w:val="18"/>
               </w:rPr>
-              <w:t xml:space="preserve">Kernel herding (Chen, Welling and Smola, UAI 2010); MMD (Gretton et al., JMLR 2012).</w:t>
+              <w:t xml:space="preserve">Kernel herding (Chen, Welling and Smola, UAI 2010); maximum mean discrepancy (Gretton et al., JMLR 2012).</w:t>
             </w:r>
           </w:p>
         </w:tc>
@@ -14207,7 +16915,7 @@
           <wp:inline distT="0" distB="0" distL="0" distR="0">
             <wp:extent cx="6096000" cy="1771650"/>
             <wp:effectExtent t="0" r="0" b="0" l="0"/>
-            <wp:docPr id="1" name="ev07_rare_class_mnist.png" descr="Figure 9. Real data, MNIST's rarest class (24 samples): the generator's output, after MC (right centre and width) and after KH (right shape). Details in Part 5.9." title="ev07_rare_class_mnist.png"/>
+            <wp:docPr id="1" name="ev07_rare_class_mnist.png" descr="Figure 9. Real data, MNIST's rarest class (24 samples): the generator's output, after moment correction (right centre and width) and after sample selection (right shape). Details in Part 5.9." title="ev07_rare_class_mnist.png"/>
             <wp:cNvGraphicFramePr>
               <a:graphicFrameLocks xmlns:a="http://schemas.openxmlformats.org/drawingml/2006/main" noChangeAspect="1"/>
             </wp:cNvGraphicFramePr>
@@ -14256,7 +16964,7 @@
           <w:sz w:val="18"/>
           <w:szCs w:val="18"/>
         </w:rPr>
-        <w:t xml:space="preserve">Figure 9. Real data, MNIST's rarest class (24 samples): the generator's output, after MC (right centre and width) and after KH (right shape). Details in Part 5.9.</w:t>
+        <w:t xml:space="preserve">Figure 9. Real data, MNIST's rarest class (24 samples): the generator's output, after moment correction (right centre and width) and after sample selection (right shape). Details in Part 5.9.</w:t>
       </w:r>
     </w:p>
     <w:p>
@@ -14338,7 +17046,7 @@
         <w:spacing w:after="80" w:before="180"/>
       </w:pPr>
       <w:r>
-        <w:t xml:space="preserve">(a) 10 epochs on the fake pool, with consensus soft labels (CSL)</w:t>
+        <w:t xml:space="preserve">(a) 10 epochs on the fake pool, with consensus soft labels </w:t>
       </w:r>
     </w:p>
     <w:tbl>
@@ -14423,7 +17131,7 @@
                 <w:sz w:val="18"/>
                 <w:szCs w:val="18"/>
               </w:rPr>
-              <w:t xml:space="preserve">CSL</w:t>
+              <w:t xml:space="preserve">Consensus labels</w:t>
             </w:r>
           </w:p>
         </w:tc>
@@ -14765,7 +17473,7 @@
         <w:spacing w:after="80" w:before="180"/>
       </w:pPr>
       <w:r>
-        <w:t xml:space="preserve">(b) 5 epochs on the client's own real features, with logit adjustment (LA)</w:t>
+        <w:t xml:space="preserve">(b) 5 epochs on the client's own real features, with logit adjustment </w:t>
       </w:r>
     </w:p>
     <w:tbl>
@@ -14850,7 +17558,7 @@
                 <w:sz w:val="18"/>
                 <w:szCs w:val="18"/>
               </w:rPr>
-              <w:t xml:space="preserve">LA</w:t>
+              <w:t xml:space="preserve">Logit adjustment</w:t>
             </w:r>
           </w:p>
         </w:tc>
@@ -14914,7 +17622,7 @@
                 <w:sz w:val="18"/>
                 <w:szCs w:val="18"/>
               </w:rPr>
-              <w:t xml:space="preserve">Loss = CE( head(h) + τ · log π_k , y ), τ = 1, where π_k is the client's own label distribution.</w:t>
+              <w:t xml:space="preserve">Loss = cross-entropy( head(h) + τ · log π_k , y ), τ = 1, where π_k is the client's own label distribution.</w:t>
             </w:r>
           </w:p>
         </w:tc>
@@ -15192,7 +17900,7 @@
         <w:t xml:space="preserve">Proposition 5:</w:t>
       </w:r>
       <w:r>
-        <w:t xml:space="preserve"> more fake training helps only when the generator is faithful. Measured on MNIST (long tail): +1.7 with PC-VAE + MC + KH, +3.9 at 100 clients, but −0.05 with the original generator.</w:t>
+        <w:t xml:space="preserve"> more fake training helps only when the generator is faithful. Measured on MNIST (long tail): +1.7 with mean-anchored generator + moment correction + sample selection, +3.9 at 100 clients, but −0.05 with the original generator.</w:t>
       </w:r>
     </w:p>
     <w:p>
@@ -15238,7 +17946,7 @@
         <w:spacing w:after="60" w:line="264"/>
       </w:pPr>
       <w:r>
-        <w:t xml:space="preserve">Test: image → frozen FE → 3×16×16 → the client's own head → 10 logits. No generator is needed.</w:t>
+        <w:t xml:space="preserve">Test: image → frozen feature extractor → 3×16×16 → the client's own head → 10 logits. No generator is needed.</w:t>
       </w:r>
     </w:p>
     <w:p>
@@ -15368,7 +18076,7 @@
                 <w:sz w:val="18"/>
                 <w:szCs w:val="18"/>
               </w:rPr>
-              <w:t xml:space="preserve">FMNIST</w:t>
+              <w:t xml:space="preserve">FashionMNIST</w:t>
             </w:r>
           </w:p>
         </w:tc>
@@ -15555,7 +18263,7 @@
                 <w:sz w:val="18"/>
                 <w:szCs w:val="18"/>
               </w:rPr>
-              <w:t xml:space="preserve">+ LA</w:t>
+              <w:t xml:space="preserve">+ logit adjustment</w:t>
             </w:r>
           </w:p>
         </w:tc>
@@ -15677,7 +18385,7 @@
                 <w:sz w:val="18"/>
                 <w:szCs w:val="18"/>
               </w:rPr>
-              <w:t xml:space="preserve">+ HWA (class rows averaged over holders)</w:t>
+              <w:t xml:space="preserve">+ holder-weighted averaging (class rows averaged over holders)</w:t>
             </w:r>
           </w:p>
         </w:tc>
@@ -15799,7 +18507,7 @@
                 <w:sz w:val="18"/>
                 <w:szCs w:val="18"/>
               </w:rPr>
-              <w:t xml:space="preserve">+ CSL</w:t>
+              <w:t xml:space="preserve">+ consensus labels</w:t>
             </w:r>
           </w:p>
         </w:tc>
@@ -15921,7 +18629,7 @@
                 <w:sz w:val="18"/>
                 <w:szCs w:val="18"/>
               </w:rPr>
-              <w:t xml:space="preserve">PC-VAE replaces HWA</w:t>
+              <w:t xml:space="preserve">Mean-anchored generator replaces holder-weighted averaging</w:t>
             </w:r>
           </w:p>
         </w:tc>
@@ -16043,7 +18751,7 @@
                 <w:sz w:val="18"/>
                 <w:szCs w:val="18"/>
               </w:rPr>
-              <w:t xml:space="preserve">+ MC</w:t>
+              <w:t xml:space="preserve">+ moment correction</w:t>
             </w:r>
           </w:p>
         </w:tc>
@@ -16165,7 +18873,7 @@
                 <w:sz w:val="18"/>
                 <w:szCs w:val="18"/>
               </w:rPr>
-              <w:t xml:space="preserve">+ KH</w:t>
+              <w:t xml:space="preserve">+ sample selection</w:t>
             </w:r>
           </w:p>
         </w:tc>
@@ -16255,7 +18963,7 @@
                 <w:sz w:val="18"/>
                 <w:szCs w:val="18"/>
               </w:rPr>
-              <w:t xml:space="preserve">fake ≈ real (low MMD)</w:t>
+              <w:t xml:space="preserve">fake ≈ real (low fake-to-real distance)</w:t>
             </w:r>
           </w:p>
         </w:tc>
@@ -16287,7 +18995,7 @@
                 <w:sz w:val="18"/>
                 <w:szCs w:val="18"/>
               </w:rPr>
-              <w:t xml:space="preserve">+ T_s = 10  = </w:t>
+              <w:t xml:space="preserve">+ 10 synthetic epochs  = </w:t>
             </w:r>
             <w:r>
               <w:rPr>
@@ -16743,7 +19451,7 @@
                 <w:sz w:val="18"/>
                 <w:szCs w:val="18"/>
               </w:rPr>
-              <w:t xml:space="preserve">Moment fix (MC)</w:t>
+              <w:t xml:space="preserve">Moment fix </w:t>
             </w:r>
           </w:p>
         </w:tc>
@@ -16835,7 +19543,7 @@
                 <w:sz w:val="18"/>
                 <w:szCs w:val="18"/>
               </w:rPr>
-              <w:t xml:space="preserve">Fingerprint selection (KH)</w:t>
+              <w:t xml:space="preserve">Fingerprint selection </w:t>
             </w:r>
           </w:p>
         </w:tc>
@@ -16865,7 +19573,7 @@
                 <w:sz w:val="18"/>
                 <w:szCs w:val="18"/>
               </w:rPr>
-              <w:t xml:space="preserve">Chen, Welling and Smola, Kernel Herding, UAI 2010; Gretton et al., MMD, JMLR 2012</w:t>
+              <w:t xml:space="preserve">Chen, Welling and Smola, Kernel Herding, UAI 2010; Gretton et al., JMLR 2012</w:t>
             </w:r>
           </w:p>
         </w:tc>
@@ -16927,7 +19635,7 @@
                 <w:sz w:val="18"/>
                 <w:szCs w:val="18"/>
               </w:rPr>
-              <w:t xml:space="preserve">Client-prior loss (LA)</w:t>
+              <w:t xml:space="preserve">Client-prior loss </w:t>
             </w:r>
           </w:p>
         </w:tc>
@@ -17019,7 +19727,7 @@
                 <w:sz w:val="18"/>
                 <w:szCs w:val="18"/>
               </w:rPr>
-              <w:t xml:space="preserve">Consensus labels (CSL)</w:t>
+              <w:t xml:space="preserve">Consensus labels </w:t>
             </w:r>
           </w:p>
         </w:tc>
@@ -17103,7 +19811,7 @@
         <w:t xml:space="preserve">What is new in Ours-A:</w:t>
       </w:r>
       <w:r>
-        <w:t xml:space="preserve"> taking class information from exact secure-aggregation sums instead of from FedAvg-trained weights, and using it in three places (generator input, moment fix, sample selection). Each building block exists; the combination, its use inside a heterogeneous generator-based pipeline, and the collapse analysis that motivates it are ours. LA, CSL and HWA are adopted, not claimed.</w:t>
+        <w:t xml:space="preserve"> taking class information from exact secure-aggregation sums instead of from FedAvg-trained weights, and using it in three places (generator input, moment fix, sample selection). Each building block exists; the combination, its use inside a heterogeneous generator-based pipeline, and the collapse analysis that motivates it are ours. Logit adjustment, consensus labels and holder-weighted averaging are adopted, not claimed.</w:t>
       </w:r>
     </w:p>
     <w:p>
@@ -17388,7 +20096,7 @@
                 <w:sz w:val="18"/>
                 <w:szCs w:val="18"/>
               </w:rPr>
-              <w:t xml:space="preserve">secure aggregation; optional (ε, δ)-DP</w:t>
+              <w:t xml:space="preserve">secure aggregation; optional (ε, δ) differential privacy</w:t>
             </w:r>
           </w:p>
         </w:tc>
@@ -17771,7 +20479,7 @@
         <w:jc w:val="both"/>
       </w:pPr>
       <w:r>
-        <w:t xml:space="preserve">For formal privacy, features are clipped and each release gets Gaussian noise (zero-concentrated DP):</w:t>
+        <w:t xml:space="preserve">For formal privacy, features are clipped and each release gets Gaussian noise (zero-concentrated differential privacy):</w:t>
       </w:r>
     </w:p>
     <w:p>
@@ -17917,7 +20625,7 @@
                 <w:sz w:val="18"/>
                 <w:szCs w:val="18"/>
               </w:rPr>
-              <w:t xml:space="preserve">Method (IF = 100, Dir 0.5, K = 10; balanced accuracy)</w:t>
+              <w:t xml:space="preserve">Method (imbalance 100 : 1, Dirichlet 0.5, 10 clients; balanced accuracy)</w:t>
             </w:r>
           </w:p>
         </w:tc>
@@ -18233,7 +20941,7 @@
                 <w:sz w:val="18"/>
                 <w:szCs w:val="18"/>
               </w:rPr>
-              <w:t xml:space="preserve">GeFL-F + logit adjustment (≈ FedLC)</w:t>
+              <w:t xml:space="preserve">GeFL-F + logit adjustment (similar to FedLC)</w:t>
             </w:r>
           </w:p>
         </w:tc>
@@ -18385,7 +21093,7 @@
                 <w:sz w:val="18"/>
                 <w:szCs w:val="18"/>
               </w:rPr>
-              <w:t xml:space="preserve">+ HWA (count-anchored rows) + LA</w:t>
+              <w:t xml:space="preserve">+ holder-weighted averaging + logit adjustment</w:t>
             </w:r>
           </w:p>
         </w:tc>
@@ -18537,7 +21245,7 @@
                 <w:sz w:val="18"/>
                 <w:szCs w:val="18"/>
               </w:rPr>
-              <w:t xml:space="preserve">+ HWA + LA + consensus labels</w:t>
+              <w:t xml:space="preserve">+ holder-weighted averaging + logit adjustment + consensus labels</w:t>
             </w:r>
           </w:p>
         </w:tc>
@@ -18689,7 +21397,7 @@
                 <w:sz w:val="18"/>
                 <w:szCs w:val="18"/>
               </w:rPr>
-              <w:t xml:space="preserve">Gaussian generator from exact statistics (FSG) + LA</w:t>
+              <w:t xml:space="preserve">Gaussian generator from exact statistics + logit adjustment</w:t>
             </w:r>
           </w:p>
         </w:tc>
@@ -19162,7 +21870,7 @@
                 <w:sz w:val="18"/>
                 <w:szCs w:val="18"/>
               </w:rPr>
-              <w:t xml:space="preserve"> (class rows + HWA + MC + KH when class means are uninformative)</w:t>
+              <w:t xml:space="preserve"> (class rows + holder-weighted averaging + moment correction + sample selection when class means are uninformative)</w:t>
             </w:r>
           </w:p>
         </w:tc>
@@ -19590,7 +22298,7 @@
                 <w:sz w:val="18"/>
                 <w:szCs w:val="18"/>
               </w:rPr>
-              <w:t xml:space="preserve">best_mean_acc, IID</w:t>
+              <w:t xml:space="preserve">best_mean_acc, balanced</w:t>
             </w:r>
           </w:p>
         </w:tc>
@@ -19787,7 +22495,7 @@
                 <w:sz w:val="18"/>
                 <w:szCs w:val="18"/>
               </w:rPr>
-              <w:t xml:space="preserve">MNIST, K = 10</w:t>
+              <w:t xml:space="preserve">MNIST, 10 clients</w:t>
             </w:r>
           </w:p>
         </w:tc>
@@ -19847,7 +22555,7 @@
                 <w:sz w:val="18"/>
                 <w:szCs w:val="18"/>
               </w:rPr>
-              <w:t xml:space="preserve">96.44 (GeFL, DDPM)</w:t>
+              <w:t xml:space="preserve">96.44 (GeFL, diffusion)</w:t>
             </w:r>
           </w:p>
         </w:tc>
@@ -19971,7 +22679,7 @@
                 <w:sz w:val="18"/>
                 <w:szCs w:val="18"/>
               </w:rPr>
-              <w:t xml:space="preserve">MNIST, K = 50</w:t>
+              <w:t xml:space="preserve">MNIST, 50 clients</w:t>
             </w:r>
           </w:p>
         </w:tc>
@@ -20031,7 +22739,7 @@
                 <w:sz w:val="18"/>
                 <w:szCs w:val="18"/>
               </w:rPr>
-              <w:t xml:space="preserve">95.04 (GeFL-F, CVAE-F)</w:t>
+              <w:t xml:space="preserve">95.04 (GeFL-F, original generator)</w:t>
             </w:r>
           </w:p>
         </w:tc>
@@ -20155,7 +22863,7 @@
                 <w:sz w:val="18"/>
                 <w:szCs w:val="18"/>
               </w:rPr>
-              <w:t xml:space="preserve">MNIST, K = 100</w:t>
+              <w:t xml:space="preserve">MNIST, 100 clients</w:t>
             </w:r>
           </w:p>
         </w:tc>
@@ -20215,7 +22923,7 @@
                 <w:sz w:val="18"/>
                 <w:szCs w:val="18"/>
               </w:rPr>
-              <w:t xml:space="preserve">94.63 (GeFL-F, CVAE-F)</w:t>
+              <w:t xml:space="preserve">94.63 (GeFL-F, original generator)</w:t>
             </w:r>
           </w:p>
         </w:tc>
@@ -20339,7 +23047,7 @@
                 <w:sz w:val="18"/>
                 <w:szCs w:val="18"/>
               </w:rPr>
-              <w:t xml:space="preserve">FashionMNIST, K = 10</w:t>
+              <w:t xml:space="preserve">FashionMNIST, 10 clients</w:t>
             </w:r>
           </w:p>
         </w:tc>
@@ -20399,7 +23107,7 @@
                 <w:sz w:val="18"/>
                 <w:szCs w:val="18"/>
               </w:rPr>
-              <w:t xml:space="preserve">84.28 (GeFL-F, DDPM-F)</w:t>
+              <w:t xml:space="preserve">84.28 (GeFL-F, diffusion generator)</w:t>
             </w:r>
           </w:p>
         </w:tc>
@@ -20521,7 +23229,7 @@
                 <w:sz w:val="18"/>
                 <w:szCs w:val="18"/>
               </w:rPr>
-              <w:t xml:space="preserve">FashionMNIST, K = 50</w:t>
+              <w:t xml:space="preserve">FashionMNIST, 50 clients</w:t>
             </w:r>
           </w:p>
         </w:tc>
@@ -20581,7 +23289,7 @@
                 <w:sz w:val="18"/>
                 <w:szCs w:val="18"/>
               </w:rPr>
-              <w:t xml:space="preserve">82.96 (GeFL-F, DDPM-F)</w:t>
+              <w:t xml:space="preserve">82.96 (GeFL-F, diffusion generator)</w:t>
             </w:r>
           </w:p>
         </w:tc>
@@ -20705,7 +23413,7 @@
                 <w:sz w:val="18"/>
                 <w:szCs w:val="18"/>
               </w:rPr>
-              <w:t xml:space="preserve">CIFAR-10, K = 10</w:t>
+              <w:t xml:space="preserve">CIFAR-10, 10 clients</w:t>
             </w:r>
           </w:p>
         </w:tc>
@@ -20765,7 +23473,7 @@
                 <w:sz w:val="18"/>
                 <w:szCs w:val="18"/>
               </w:rPr>
-              <w:t xml:space="preserve">59.36 (GeFL, DDPM)</w:t>
+              <w:t xml:space="preserve">59.36 (GeFL, diffusion)</w:t>
             </w:r>
           </w:p>
         </w:tc>
@@ -20889,7 +23597,7 @@
                 <w:sz w:val="18"/>
                 <w:szCs w:val="18"/>
               </w:rPr>
-              <w:t xml:space="preserve">SVHN, K = 10 (mean anchor)</w:t>
+              <w:t xml:space="preserve">SVHN, 10 clients (mean anchor)</w:t>
             </w:r>
           </w:p>
         </w:tc>
@@ -20949,7 +23657,7 @@
                 <w:sz w:val="18"/>
                 <w:szCs w:val="18"/>
               </w:rPr>
-              <w:t xml:space="preserve">76.26 (GeFL-F, CVAE-F)</w:t>
+              <w:t xml:space="preserve">76.26 (GeFL-F, original generator)</w:t>
             </w:r>
           </w:p>
         </w:tc>
@@ -21071,7 +23779,7 @@
                 <w:sz w:val="18"/>
                 <w:szCs w:val="18"/>
               </w:rPr>
-              <w:t xml:space="preserve">SVHN, K = 10 (with the switch to class rows)</w:t>
+              <w:t xml:space="preserve">SVHN, 10 clients (with the switch to class rows)</w:t>
             </w:r>
           </w:p>
         </w:tc>
@@ -21131,7 +23839,7 @@
                 <w:sz w:val="18"/>
                 <w:szCs w:val="18"/>
               </w:rPr>
-              <w:t xml:space="preserve">76.26 (GeFL-F, CVAE-F)</w:t>
+              <w:t xml:space="preserve">76.26 (GeFL-F, original generator)</w:t>
             </w:r>
           </w:p>
         </w:tc>
@@ -21255,7 +23963,7 @@
                 <w:sz w:val="18"/>
                 <w:szCs w:val="18"/>
               </w:rPr>
-              <w:t xml:space="preserve">FashionMNIST, K = 10, with MC-B (covariance version)</w:t>
+              <w:t xml:space="preserve">FashionMNIST, 10 clients, with covariance correction (covariance version)</w:t>
             </w:r>
           </w:p>
         </w:tc>
@@ -21315,7 +24023,7 @@
                 <w:sz w:val="18"/>
                 <w:szCs w:val="18"/>
               </w:rPr>
-              <w:t xml:space="preserve">84.28 (GeFL-F, DDPM-F)</w:t>
+              <w:t xml:space="preserve">84.28 (GeFL-F, diffusion generator)</w:t>
             </w:r>
           </w:p>
         </w:tc>
@@ -21424,7 +24132,7 @@
         <w:jc w:val="both"/>
       </w:pPr>
       <w:r>
-        <w:t xml:space="preserve">Above the best of the paper's 10 methods on MNIST (all client counts), CIFAR-10 and, with the switch, SVHN; level on FashionMNIST with the main method and above it with MC-B. Note: best_mean_acc picks each architecture's best round on the test set, which flatters every method equally; our long-tail results use the final round instead.</w:t>
+        <w:t xml:space="preserve">Above the best of the paper's 10 methods on MNIST (all client counts), CIFAR-10 and, with the switch, SVHN; level on FashionMNIST with the main method and above it with covariance correction. Note: best_mean_acc picks each architecture's best round on the test set, which flatters every method equally; our long-tail results use the final round instead.</w:t>
       </w:r>
     </w:p>
     <w:p>
@@ -21548,7 +24256,7 @@
                 <w:sz w:val="18"/>
                 <w:szCs w:val="18"/>
               </w:rPr>
-              <w:t xml:space="preserve">CIFAR-10, IID, K = 10</w:t>
+              <w:t xml:space="preserve">CIFAR-10, balanced, 10 clients</w:t>
             </w:r>
           </w:p>
         </w:tc>
@@ -21861,7 +24569,7 @@
                 <w:sz w:val="18"/>
                 <w:szCs w:val="18"/>
               </w:rPr>
-              <w:t xml:space="preserve">Ours-A + VCT (our MixUp variant)</w:t>
+              <w:t xml:space="preserve">Ours-A + our mixing variant</w:t>
             </w:r>
           </w:p>
         </w:tc>
@@ -21929,9 +24637,9 @@
       <w:r>
         <w:drawing>
           <wp:inline distT="0" distB="0" distL="0" distR="0">
-            <wp:extent cx="6096000" cy="2076450"/>
+            <wp:extent cx="6096000" cy="2085975"/>
             <wp:effectExtent t="0" r="0" b="0" l="0"/>
-            <wp:docPr id="1" name="f11_scaling_privacy.png" descr="Figure 13. (a) 100 clients, MNIST long tail. (b) Ours-A with every statistic made (ε, 10⁻⁵)-differentially private." title="f11_scaling_privacy.png"/>
+            <wp:docPr id="1" name="f11_scaling_privacy.png" descr="Figure 13. (a) 100 clients, MNIST long tail. (b) Ours-A with every statistic made differentially private (ε, δ = 10⁻⁵)." title="f11_scaling_privacy.png"/>
             <wp:cNvGraphicFramePr>
               <a:graphicFrameLocks xmlns:a="http://schemas.openxmlformats.org/drawingml/2006/main" noChangeAspect="1"/>
             </wp:cNvGraphicFramePr>
@@ -21954,7 +24662,7 @@
                   <pic:spPr bwMode="auto">
                     <a:xfrm>
                       <a:off x="0" y="0"/>
-                      <a:ext cx="6096000" cy="2076450"/>
+                      <a:ext cx="6096000" cy="2085975"/>
                     </a:xfrm>
                     <a:prstGeom prst="rect">
                       <a:avLst/>
@@ -21980,7 +24688,7 @@
           <w:sz w:val="18"/>
           <w:szCs w:val="18"/>
         </w:rPr>
-        <w:t xml:space="preserve">Figure 13. (a) 100 clients, MNIST long tail. (b) Ours-A with every statistic made (ε, 10⁻⁵)-differentially private.</w:t>
+        <w:t xml:space="preserve">Figure 13. (a) 100 clients, MNIST long tail. (b) Ours-A with every statistic made differentially private (ε, δ = 10⁻⁵).</w:t>
       </w:r>
     </w:p>
     <w:tbl>
@@ -22101,7 +24809,7 @@
                 <w:sz w:val="18"/>
                 <w:szCs w:val="18"/>
               </w:rPr>
-              <w:t xml:space="preserve">HWA + LA</w:t>
+              <w:t xml:space="preserve">Holder-weighted averaging + logit adjustment</w:t>
             </w:r>
           </w:p>
         </w:tc>
@@ -22134,7 +24842,7 @@
                 <w:sz w:val="18"/>
                 <w:szCs w:val="18"/>
               </w:rPr>
-              <w:t xml:space="preserve">FSG + LA</w:t>
+              <w:t xml:space="preserve">Gaussian generator + logit adjustment</w:t>
             </w:r>
           </w:p>
         </w:tc>
@@ -22199,7 +24907,7 @@
                 <w:sz w:val="18"/>
                 <w:szCs w:val="18"/>
               </w:rPr>
-              <w:t xml:space="preserve">MNIST long tail, K = 100</w:t>
+              <w:t xml:space="preserve">MNIST long tail, 100 clients</w:t>
             </w:r>
           </w:p>
         </w:tc>
@@ -22338,7 +25046,7 @@
         <w:jc w:val="both"/>
       </w:pPr>
       <w:r>
-        <w:t xml:space="preserve">Only −0.5 from 10 to 100 clients (the CVAE with HWA loses 4.8): no class weights to estimate from shrinking client data. FashionMNIST long tail (3 seeds): Ours-A 79.7 / 79.5 / 79.0 at K = 10 / 50 / 100, against GeFL-F 58.5 / 61.9 / 61.9.</w:t>
+        <w:t xml:space="preserve">Only −0.5 from 10 to 100 clients (the original generator with holder-weighted averaging loses 4.8): no class weights to estimate from shrinking client data. FashionMNIST long tail (3 seeds): Ours-A 79.7 / 79.5 / 79.0 at 10 / 50 / 100 clients, against GeFL-F 58.5 / 61.9 / 61.9.</w:t>
       </w:r>
     </w:p>
     <w:tbl>
@@ -22393,7 +25101,7 @@
                 <w:sz w:val="18"/>
                 <w:szCs w:val="18"/>
               </w:rPr>
-              <w:t xml:space="preserve">Long tail, K = 10</w:t>
+              <w:t xml:space="preserve">Long tail, 10 clients</w:t>
             </w:r>
           </w:p>
         </w:tc>
@@ -23122,7 +25830,7 @@
                 <w:sz w:val="18"/>
                 <w:szCs w:val="18"/>
               </w:rPr>
-              <w:t xml:space="preserve">PC-VAE (back to CVAE + HWA)</w:t>
+              <w:t xml:space="preserve">Mean-anchored generator (back to original generator + holder-weighted averaging)</w:t>
             </w:r>
           </w:p>
         </w:tc>
@@ -23212,7 +25920,7 @@
                 <w:sz w:val="18"/>
                 <w:szCs w:val="18"/>
               </w:rPr>
-              <w:t xml:space="preserve">large on MNIST, small on FMNIST</w:t>
+              <w:t xml:space="preserve">large on MNIST, small on FashionMNIST</w:t>
             </w:r>
           </w:p>
         </w:tc>
@@ -23244,7 +25952,7 @@
                 <w:sz w:val="18"/>
                 <w:szCs w:val="18"/>
               </w:rPr>
-              <w:t xml:space="preserve">LA</w:t>
+              <w:t xml:space="preserve">Logit adjustment</w:t>
             </w:r>
           </w:p>
         </w:tc>
@@ -23334,7 +26042,7 @@
                 <w:sz w:val="18"/>
                 <w:szCs w:val="18"/>
               </w:rPr>
-              <w:t xml:space="preserve">largest; mostly recovered by post-hoc BBC</w:t>
+              <w:t xml:space="preserve">largest; mostly recovered by post-hoc bias calibration</w:t>
             </w:r>
           </w:p>
         </w:tc>
@@ -23366,7 +26074,7 @@
                 <w:sz w:val="18"/>
                 <w:szCs w:val="18"/>
               </w:rPr>
-              <w:t xml:space="preserve">CSL</w:t>
+              <w:t xml:space="preserve">Consensus labels</w:t>
             </w:r>
           </w:p>
         </w:tc>
@@ -23488,7 +26196,7 @@
                 <w:sz w:val="18"/>
                 <w:szCs w:val="18"/>
               </w:rPr>
-              <w:t xml:space="preserve">MC</w:t>
+              <w:t xml:space="preserve">Moment correction</w:t>
             </w:r>
           </w:p>
         </w:tc>
@@ -23610,7 +26318,7 @@
                 <w:sz w:val="18"/>
                 <w:szCs w:val="18"/>
               </w:rPr>
-              <w:t xml:space="preserve">KH</w:t>
+              <w:t xml:space="preserve">Sample selection</w:t>
             </w:r>
           </w:p>
         </w:tc>
@@ -23717,7 +26425,7 @@
         <w:jc w:val="both"/>
       </w:pPr>
       <w:r>
-        <w:t xml:space="preserve">Full Ours-A in this run: 95.18 ± 0.08 (MNIST), 79.79 ± 0.31 (FMNIST). All 30 seed-level differences are negative (every part, every seed, both datasets; sign test p = 2·10⁻⁹). With 3 seeds no single part survives a multiple-test correction; two more seeds (job K14, ready) are needed for per-part significance.</w:t>
+        <w:t xml:space="preserve">Full Ours-A in this run: 95.18 ± 0.08 (MNIST), 79.79 ± 0.31 (FashionMNIST). All 30 seed-level differences are negative (every part, every seed, both datasets; sign test p = 2·10⁻⁹). With 3 seeds no single part survives a multiple-test correction; two more seeds (job K14, ready) are needed for per-part significance.</w:t>
       </w:r>
     </w:p>
     <w:p>
@@ -23847,7 +26555,7 @@
                 <w:sz w:val="18"/>
                 <w:szCs w:val="18"/>
               </w:rPr>
-              <w:t xml:space="preserve">+ HWA + LA</w:t>
+              <w:t xml:space="preserve">+ holder-weighted averaging + logit adjustment</w:t>
             </w:r>
           </w:p>
         </w:tc>
@@ -23912,7 +26620,7 @@
                 <w:sz w:val="18"/>
                 <w:szCs w:val="18"/>
               </w:rPr>
-              <w:t xml:space="preserve">long tail, balanced accuracy</w:t>
+              <w:t xml:space="preserve">Long tail, balanced accuracy</w:t>
             </w:r>
           </w:p>
         </w:tc>
@@ -24034,7 +26742,7 @@
                 <w:sz w:val="18"/>
                 <w:szCs w:val="18"/>
               </w:rPr>
-              <w:t xml:space="preserve">balanced setting, best_mean_acc</w:t>
+              <w:t xml:space="preserve">Balanced setting, paper's accuracy (best_mean_acc)</w:t>
             </w:r>
           </w:p>
         </w:tc>
@@ -24157,7 +26865,7 @@
         <w:t xml:space="preserve">Switch (implemented):</w:t>
       </w:r>
       <w:r>
-        <w:t xml:space="preserve"> the server measures how well the exact class means separate the classes (F, from the same sums). When F &lt; 0.05 it keeps GeFL-F's class rows, protected by HWA, and still applies MC and KH. On SVHN this gives </w:t>
+        <w:t xml:space="preserve"> the server measures how well the exact class means separate the classes (F, from the same sums). When F &lt; 0.05 it keeps GeFL-F's class rows, protected by holder-weighted averaging, and still applies moment correction and sample selection. On SVHN this gives </w:t>
       </w:r>
       <w:r>
         <w:rPr>
@@ -24177,7 +26885,7 @@
         <w:t xml:space="preserve">77.07 ± 0.19</w:t>
       </w:r>
       <w:r>
-        <w:t xml:space="preserve"> in the balanced setting (above the paper's 76.26). MNIST, FMNIST and CIFAR-10 are unaffected (F = 0.07–0.60).</w:t>
+        <w:t xml:space="preserve"> in the balanced setting (above the paper's 76.26). MNIST, FashionMNIST and CIFAR-10 are unaffected (F = 0.07–0.60).</w:t>
       </w:r>
     </w:p>
     <w:p>
@@ -24338,7 +27046,7 @@
                 <w:sz w:val="18"/>
                 <w:szCs w:val="18"/>
               </w:rPr>
-              <w:t xml:space="preserve">Tail fidelity (referee accuracy on synthetic tail features), MNIST / FMNIST</w:t>
+              <w:t xml:space="preserve">Tail fidelity (referee accuracy on synthetic tail features), MNIST / FashionMNIST</w:t>
             </w:r>
           </w:p>
         </w:tc>
@@ -24522,7 +27230,7 @@
                 <w:sz w:val="18"/>
                 <w:szCs w:val="18"/>
               </w:rPr>
-              <w:t xml:space="preserve">IID fidelity vs the referee's accuracy on real data (FMNIST)</w:t>
+              <w:t xml:space="preserve">Fake-sample correctness in the balanced setting vs the judge's accuracy on real data (FashionMNIST)</w:t>
             </w:r>
           </w:p>
         </w:tc>
@@ -24641,7 +27349,7 @@
           <wp:inline distT="0" distB="0" distL="0" distR="0">
             <wp:extent cx="6096000" cy="3105150"/>
             <wp:effectExtent t="0" r="0" b="0" l="0"/>
-            <wp:docPr id="1" name="ev01_collapse.png" descr="Rows of rare classes under FedAvg end at 0.33 (MNIST) and 0.44 (FMNIST) of their start value; with HWA they grow (×1.7, ×2.4). They shrink even when 70–90 % of clients hold the class." title="ev01_collapse.png"/>
+            <wp:docPr id="1" name="ev01_collapse.png" descr="Rows of rare classes under FedAvg end at 0.33 (MNIST) and 0.44 (FashionMNIST) of their start value; with holder-weighted averaging they grow (×1.7, ×2.4). They shrink even when 70–90 % of clients hold the class." title="ev01_collapse.png"/>
             <wp:cNvGraphicFramePr>
               <a:graphicFrameLocks xmlns:a="http://schemas.openxmlformats.org/drawingml/2006/main" noChangeAspect="1"/>
             </wp:cNvGraphicFramePr>
@@ -24690,7 +27398,7 @@
           <w:sz w:val="18"/>
           <w:szCs w:val="18"/>
         </w:rPr>
-        <w:t xml:space="preserve">Rows of rare classes under FedAvg end at 0.33 (MNIST) and 0.44 (FMNIST) of their start value; with HWA they grow (×1.7, ×2.4). They shrink even when 70–90 % of clients hold the class.</w:t>
+        <w:t xml:space="preserve">Rows of rare classes under FedAvg end at 0.33 (MNIST) and 0.44 (FashionMNIST) of their start value; with holder-weighted averaging they grow (×1.7, ×2.4). They shrink even when 70–90 % of clients hold the class.</w:t>
       </w:r>
     </w:p>
     <w:p>
@@ -24703,7 +27411,7 @@
           <wp:inline distT="0" distB="0" distL="0" distR="0">
             <wp:extent cx="6096000" cy="3829050"/>
             <wp:effectExtent t="0" r="0" b="0" l="0"/>
-            <wp:docPr id="1" name="ev02_fidelity.png" descr="Rare-class fake samples recognised as their class: GeFL-F 10 % / 20 %, + HWA 31 % / 71 %, PC-VAE 93 % / 88 %, Ours-A 90 % / 79 % (real test features: 97 % / 84 %)." title="ev02_fidelity.png"/>
+            <wp:docPr id="1" name="ev02_fidelity.png" descr="Rare-class fake samples recognised as their class: GeFL-F 10 % / 20 %, + holder-weighted averaging 31 % / 71 %, mean-anchored generator 93 % / 88 %, Ours-A 90 % / 79 % (real test features: 97 % / 84 %)." title="ev02_fidelity.png"/>
             <wp:cNvGraphicFramePr>
               <a:graphicFrameLocks xmlns:a="http://schemas.openxmlformats.org/drawingml/2006/main" noChangeAspect="1"/>
             </wp:cNvGraphicFramePr>
@@ -24752,7 +27460,7 @@
           <w:sz w:val="18"/>
           <w:szCs w:val="18"/>
         </w:rPr>
-        <w:t xml:space="preserve">Rare-class fake samples recognised as their class: GeFL-F 10 % / 20 %, + HWA 31 % / 71 %, PC-VAE 93 % / 88 %, Ours-A 90 % / 79 % (real test features: 97 % / 84 %).</w:t>
+        <w:t xml:space="preserve">Rare-class fake samples recognised as their class: GeFL-F 10 % / 20 %, + holder-weighted averaging 31 % / 71 %, mean-anchored generator 93 % / 88 %, Ours-A 90 % / 79 % (real test features: 97 % / 84 %).</w:t>
       </w:r>
     </w:p>
     <w:p>
@@ -24765,7 +27473,7 @@
           <wp:inline distT="0" distB="0" distL="0" distR="0">
             <wp:extent cx="6096000" cy="3552825"/>
             <wp:effectExtent t="0" r="0" b="0" l="0"/>
-            <wp:docPr id="1" name="ev03_moments.png" descr="Spread of fake features (1 = real): PC-VAE 0.47 / 0.45, + MC 0.85 / 0.90, + KH 0.95 / 0.98. Rare-class mean error: 0.22 → 0.09 → 0.05 class std (MNIST)." title="ev03_moments.png"/>
+            <wp:docPr id="1" name="ev03_moments.png" descr="Spread of fake features (1 = real): mean-anchored generator 0.47 / 0.45, + moment correction 0.85 / 0.90, + sample selection 0.95 / 0.98. Rare-class mean error: 0.22 → 0.09 → 0.05 class std (MNIST)." title="ev03_moments.png"/>
             <wp:cNvGraphicFramePr>
               <a:graphicFrameLocks xmlns:a="http://schemas.openxmlformats.org/drawingml/2006/main" noChangeAspect="1"/>
             </wp:cNvGraphicFramePr>
@@ -24814,7 +27522,7 @@
           <w:sz w:val="18"/>
           <w:szCs w:val="18"/>
         </w:rPr>
-        <w:t xml:space="preserve">Spread of fake features (1 = real): PC-VAE 0.47 / 0.45, + MC 0.85 / 0.90, + KH 0.95 / 0.98. Rare-class mean error: 0.22 → 0.09 → 0.05 class std (MNIST).</w:t>
+        <w:t xml:space="preserve">Spread of fake features (1 = real): mean-anchored generator 0.47 / 0.45, + moment correction 0.85 / 0.90, + sample selection 0.95 / 0.98. Rare-class mean error: 0.22 → 0.09 → 0.05 class std (MNIST).</w:t>
       </w:r>
     </w:p>
     <w:p>
@@ -24827,7 +27535,7 @@
           <wp:inline distT="0" distB="0" distL="0" distR="0">
             <wp:extent cx="5715000" cy="1895475"/>
             <wp:effectExtent t="0" r="0" b="0" l="0"/>
-            <wp:docPr id="1" name="ev11_fake_separability.png" descr="Class separability F of fake features: GeFL-F 0.09 / 0.32 (classes overlap), PC-VAE 0.78 / 1.35 (too clean), Ours-A 0.32 / 0.61, real 0.30 / 0.60." title="ev11_fake_separability.png"/>
+            <wp:docPr id="1" name="ev11_fake_separability.png" descr="Class separability F of fake features: GeFL-F 0.09 / 0.32 (classes overlap), mean-anchored generator 0.78 / 1.35 (too clean), Ours-A 0.32 / 0.61, real 0.30 / 0.60." title="ev11_fake_separability.png"/>
             <wp:cNvGraphicFramePr>
               <a:graphicFrameLocks xmlns:a="http://schemas.openxmlformats.org/drawingml/2006/main" noChangeAspect="1"/>
             </wp:cNvGraphicFramePr>
@@ -24876,7 +27584,7 @@
           <w:sz w:val="18"/>
           <w:szCs w:val="18"/>
         </w:rPr>
-        <w:t xml:space="preserve">Class separability F of fake features: GeFL-F 0.09 / 0.32 (classes overlap), PC-VAE 0.78 / 1.35 (too clean), Ours-A 0.32 / 0.61, real 0.30 / 0.60.</w:t>
+        <w:t xml:space="preserve">Class separability F of fake features: GeFL-F 0.09 / 0.32 (classes overlap), mean-anchored generator 0.78 / 1.35 (too clean), Ours-A 0.32 / 0.61, real 0.30 / 0.60.</w:t>
       </w:r>
     </w:p>
     <w:p>
@@ -24889,7 +27597,7 @@
           <wp:inline distT="0" distB="0" distL="0" distR="0">
             <wp:extent cx="6096000" cy="3762375"/>
             <wp:effectExtent t="0" r="0" b="0" l="0"/>
-            <wp:docPr id="1" name="ev04_mmd.png" descr="Distance to real test features (MMD, all classes): GeFL-F 0.22 / 0.25 → PC-VAE 0.20 / 0.19 → + MC 0.089 / 0.093 → + KH 0.071 / 0.078. Lower MMD goes with higher real accuracy (r = −0.69 / −0.47), as Lemma 1 says." title="ev04_mmd.png"/>
+            <wp:docPr id="1" name="ev04_mmd.png" descr="Distance to real test features (fake-to-real distance, all classes): GeFL-F 0.22 / 0.25 → mean-anchored generator 0.20 / 0.19 → + moment correction 0.089 / 0.093 → + sample selection 0.071 / 0.078. Lower fake-to-real distance goes with higher real accuracy (r = −0.69 / −0.47), as Lemma 1 says." title="ev04_mmd.png"/>
             <wp:cNvGraphicFramePr>
               <a:graphicFrameLocks xmlns:a="http://schemas.openxmlformats.org/drawingml/2006/main" noChangeAspect="1"/>
             </wp:cNvGraphicFramePr>
@@ -24938,7 +27646,7 @@
           <w:sz w:val="18"/>
           <w:szCs w:val="18"/>
         </w:rPr>
-        <w:t xml:space="preserve">Distance to real test features (MMD, all classes): GeFL-F 0.22 / 0.25 → PC-VAE 0.20 / 0.19 → + MC 0.089 / 0.093 → + KH 0.071 / 0.078. Lower MMD goes with higher real accuracy (r = −0.69 / −0.47), as Lemma 1 says.</w:t>
+        <w:t xml:space="preserve">Distance to real test features (fake-to-real distance, all classes): GeFL-F 0.22 / 0.25 → mean-anchored generator 0.20 / 0.19 → + moment correction 0.089 / 0.093 → + sample selection 0.071 / 0.078. Lower fake-to-real distance goes with higher real accuracy (r = −0.69 / −0.47), as Lemma 1 says.</w:t>
       </w:r>
     </w:p>
     <w:p>
@@ -24951,7 +27659,7 @@
           <wp:inline distT="0" distB="0" distL="0" distR="0">
             <wp:extent cx="6096000" cy="2114550"/>
             <wp:effectExtent t="0" r="0" b="0" l="0"/>
-            <wp:docPr id="1" name="ev05_tstr.png" descr="Head trained only on fake features, tested on real data (balanced accuracy): GeFL-F 57 / 48, + HWA 81 / 76, PC-VAE 92 / 76, + MC 94 / 77, + KH 94 / 76. Rare classes on MNIST: 32 → 89. KH does not add in this test (−0.2 / −1.1); its gain shows only inside the full pipeline (+0.8 / +0.7)." title="ev05_tstr.png"/>
+            <wp:docPr id="1" name="ev05_tstr.png" descr="Head trained only on fake features, tested on real data (balanced accuracy): GeFL-F 57 / 48, + holder-weighted averaging 81 / 76, mean-anchored generator 92 / 76, + moment correction 94 / 77, + sample selection 94 / 76. Rare classes on MNIST: 32 → 89. Sample selection does not add in this test (−0.2 / −1.1); its gain shows only inside the full pipeline (+0.8 / +0.7)." title="ev05_tstr.png"/>
             <wp:cNvGraphicFramePr>
               <a:graphicFrameLocks xmlns:a="http://schemas.openxmlformats.org/drawingml/2006/main" noChangeAspect="1"/>
             </wp:cNvGraphicFramePr>
@@ -25000,7 +27708,7 @@
           <w:sz w:val="18"/>
           <w:szCs w:val="18"/>
         </w:rPr>
-        <w:t xml:space="preserve">Head trained only on fake features, tested on real data (balanced accuracy): GeFL-F 57 / 48, + HWA 81 / 76, PC-VAE 92 / 76, + MC 94 / 77, + KH 94 / 76. Rare classes on MNIST: 32 → 89. KH does not add in this test (−0.2 / −1.1); its gain shows only inside the full pipeline (+0.8 / +0.7).</w:t>
+        <w:t xml:space="preserve">Head trained only on fake features, tested on real data (balanced accuracy): GeFL-F 57 / 48, + holder-weighted averaging 81 / 76, mean-anchored generator 92 / 76, + moment correction 94 / 77, + sample selection 94 / 76. Rare classes on MNIST: 32 → 89. Sample selection does not add in this test (−0.2 / −1.1); its gain shows only inside the full pipeline (+0.8 / +0.7).</w:t>
       </w:r>
     </w:p>
     <w:p>
@@ -25013,7 +27721,7 @@
           <wp:inline distT="0" distB="0" distL="0" distR="0">
             <wp:extent cx="6096000" cy="1771650"/>
             <wp:effectExtent t="0" r="0" b="0" l="0"/>
-            <wp:docPr id="1" name="ev07_rare_class_mnist.png" descr="MNIST's rarest class (24 real samples): GeFL-F's fake class 9 lies on other classes; PC-VAE is on the class but too narrow; MC and KH spread it over the real class." title="ev07_rare_class_mnist.png"/>
+            <wp:docPr id="1" name="ev07_rare_class_mnist.png" descr="MNIST's rarest class (24 real samples): GeFL-F's fake class 9 lies on other classes; mean-anchored generator is on the class but too narrow; moment correction and sample selection spread it over the real class." title="ev07_rare_class_mnist.png"/>
             <wp:cNvGraphicFramePr>
               <a:graphicFrameLocks xmlns:a="http://schemas.openxmlformats.org/drawingml/2006/main" noChangeAspect="1"/>
             </wp:cNvGraphicFramePr>
@@ -25062,7 +27770,7 @@
           <w:sz w:val="18"/>
           <w:szCs w:val="18"/>
         </w:rPr>
-        <w:t xml:space="preserve">MNIST's rarest class (24 real samples): GeFL-F's fake class 9 lies on other classes; PC-VAE is on the class but too narrow; MC and KH spread it over the real class.</w:t>
+        <w:t xml:space="preserve">MNIST's rarest class (24 real samples): GeFL-F's fake class 9 lies on other classes; mean-anchored generator is on the class but too narrow; moment correction and sample selection spread it over the real class.</w:t>
       </w:r>
     </w:p>
     <w:p>
@@ -25075,7 +27783,7 @@
           <wp:inline distT="0" distB="0" distL="0" distR="0">
             <wp:extent cx="6096000" cy="3133725"/>
             <wp:effectExtent t="0" r="0" b="0" l="0"/>
-            <wp:docPr id="1" name="ev08_la_csl.png" descr="LA (seed 0): balanced accuracy 92.0 → 95.2 (MNIST), 75.5 → 79.9 (FMNIST); correlation between a client's own class shares and its predictions 0.64 → 0.44, 0.67 → 0.52. CSL: the soft target is closer to the real-data referee than the one-hot label, lower or equal in every class (TV 0.100 → 0.092, 0.212 → 0.202)." title="ev08_la_csl.png"/>
+            <wp:docPr id="1" name="ev08_la_csl.png" descr="Logit adjustment (seed 0): balanced accuracy 92.0 → 95.2 (MNIST), 75.5 → 79.9 (FashionMNIST); correlation between a client's own class shares and its predictions 0.64 → 0.44, 0.67 → 0.52. Consensus labels: the soft target is closer to the real-data referee than the one-hot label, lower or equal in every class (total-variation distance 0.100 → 0.092, 0.212 → 0.202)." title="ev08_la_csl.png"/>
             <wp:cNvGraphicFramePr>
               <a:graphicFrameLocks xmlns:a="http://schemas.openxmlformats.org/drawingml/2006/main" noChangeAspect="1"/>
             </wp:cNvGraphicFramePr>
@@ -25124,7 +27832,7 @@
           <w:sz w:val="18"/>
           <w:szCs w:val="18"/>
         </w:rPr>
-        <w:t xml:space="preserve">LA (seed 0): balanced accuracy 92.0 → 95.2 (MNIST), 75.5 → 79.9 (FMNIST); correlation between a client's own class shares and its predictions 0.64 → 0.44, 0.67 → 0.52. CSL: the soft target is closer to the real-data referee than the one-hot label, lower or equal in every class (TV 0.100 → 0.092, 0.212 → 0.202).</w:t>
+        <w:t xml:space="preserve">Logit adjustment (seed 0): balanced accuracy 92.0 → 95.2 (MNIST), 75.5 → 79.9 (FashionMNIST); correlation between a client's own class shares and its predictions 0.64 → 0.44, 0.67 → 0.52. Consensus labels: the soft target is closer to the real-data referee than the one-hot label, lower or equal in every class (total-variation distance 0.100 → 0.092, 0.212 → 0.202).</w:t>
       </w:r>
     </w:p>
     <w:p>
@@ -25199,7 +27907,7 @@
           <wp:inline distT="0" distB="0" distL="0" distR="0">
             <wp:extent cx="6096000" cy="2828925"/>
             <wp:effectExtent t="0" r="0" b="0" l="0"/>
-            <wp:docPr id="1" name="ev06_separability.png" descr="How well the exact class mean identifies the class (3 seeds): F = 0.30 / 0.60 / 0.07 / 0.012 and nearest-mean accuracy 82 / 69 / 41 / 12 % on MNIST / FMNIST / CIFAR-10 / SVHN (chance 10 %). SVHN's means carry almost no class information: the reason Ours-A is weak there." title="ev06_separability.png"/>
+            <wp:docPr id="1" name="ev06_separability.png" descr="How well the exact class mean identifies the class (3 seeds): F = 0.30 / 0.60 / 0.07 / 0.012 and nearest-mean accuracy 82 / 69 / 41 / 12 % on MNIST / FashionMNIST / CIFAR-10 / SVHN (chance 10 %). SVHN's means carry almost no class information: the reason Ours-A is weak there." title="ev06_separability.png"/>
             <wp:cNvGraphicFramePr>
               <a:graphicFrameLocks xmlns:a="http://schemas.openxmlformats.org/drawingml/2006/main" noChangeAspect="1"/>
             </wp:cNvGraphicFramePr>
@@ -25248,7 +27956,7 @@
           <w:sz w:val="18"/>
           <w:szCs w:val="18"/>
         </w:rPr>
-        <w:t xml:space="preserve">How well the exact class mean identifies the class (3 seeds): F = 0.30 / 0.60 / 0.07 / 0.012 and nearest-mean accuracy 82 / 69 / 41 / 12 % on MNIST / FMNIST / CIFAR-10 / SVHN (chance 10 %). SVHN's means carry almost no class information: the reason Ours-A is weak there.</w:t>
+        <w:t xml:space="preserve">How well the exact class mean identifies the class (3 seeds): F = 0.30 / 0.60 / 0.07 / 0.012 and nearest-mean accuracy 82 / 69 / 41 / 12 % on MNIST / FashionMNIST / CIFAR-10 / SVHN (chance 10 %). SVHN's means carry almost no class information: the reason Ours-A is weak there.</w:t>
       </w:r>
     </w:p>
     <w:p>
@@ -25554,7 +28262,7 @@
                 <w:sz w:val="18"/>
                 <w:szCs w:val="18"/>
               </w:rPr>
-              <w:t xml:space="preserve">GeFL-F, MNIST / FMNIST / SVHN</w:t>
+              <w:t xml:space="preserve">GeFL-F, MNIST / FashionMNIST / SVHN</w:t>
             </w:r>
           </w:p>
         </w:tc>
@@ -25678,7 +28386,7 @@
                 <w:sz w:val="18"/>
                 <w:szCs w:val="18"/>
               </w:rPr>
-              <w:t xml:space="preserve">+ HWA + LA, MNIST / FMNIST</w:t>
+              <w:t xml:space="preserve">+ holder-weighted averaging + logit adjustment, MNIST / FashionMNIST</w:t>
             </w:r>
           </w:p>
         </w:tc>
@@ -25800,7 +28508,7 @@
                 <w:sz w:val="18"/>
                 <w:szCs w:val="18"/>
               </w:rPr>
-              <w:t xml:space="preserve">Ours-A, MNIST / FMNIST</w:t>
+              <w:t xml:space="preserve">Ours-A, MNIST / FashionMNIST</w:t>
             </w:r>
           </w:p>
         </w:tc>
@@ -25922,7 +28630,7 @@
                 <w:sz w:val="18"/>
                 <w:szCs w:val="18"/>
               </w:rPr>
-              <w:t xml:space="preserve">Ours-A, FMNIST at K = 10 / 50 / 100</w:t>
+              <w:t xml:space="preserve">Ours-A, FashionMNIST at 10 / 50 / 100 clients</w:t>
             </w:r>
           </w:p>
         </w:tc>
@@ -26221,7 +28929,7 @@
         <w:t xml:space="preserve">What is left does not shrink with more clients</w:t>
       </w:r>
       <w:r>
-        <w:t xml:space="preserve"> (1.7–2.0 on FMNIST at every K) and is largest on CIFAR-10 (6.2).</w:t>
+        <w:t xml:space="preserve"> (1.7–2.0 on FashionMNIST at every K) and is largest on CIFAR-10 (6.2).</w:t>
       </w:r>
     </w:p>
     <w:p>
@@ -26231,7 +28939,7 @@
         <w:spacing w:after="120" w:before="240"/>
       </w:pPr>
       <w:r>
-        <w:t xml:space="preserve">6.1 A federated way to close the gap: exact readout (ER)</w:t>
+        <w:t xml:space="preserve">6.1 A federated way to close the gap: exact readout</w:t>
       </w:r>
     </w:p>
     <w:p>
@@ -26439,7 +29147,7 @@
                 <w:sz w:val="18"/>
                 <w:szCs w:val="18"/>
               </w:rPr>
-              <w:t xml:space="preserve">ER (sums only)</w:t>
+              <w:t xml:space="preserve">Exact readout (sums only)</w:t>
             </w:r>
           </w:p>
         </w:tc>
@@ -26472,7 +29180,7 @@
                 <w:sz w:val="18"/>
                 <w:szCs w:val="18"/>
               </w:rPr>
-              <w:t xml:space="preserve">BBC (offsets only)</w:t>
+              <w:t xml:space="preserve">Bias calibration (offsets only)</w:t>
             </w:r>
           </w:p>
         </w:tc>
@@ -26504,7 +29212,7 @@
                 <w:sz w:val="18"/>
                 <w:szCs w:val="18"/>
               </w:rPr>
-              <w:t xml:space="preserve">FMNIST GeFL-F</w:t>
+              <w:t xml:space="preserve">FashionMNIST GeFL-F</w:t>
             </w:r>
           </w:p>
         </w:tc>
@@ -26658,7 +29366,7 @@
                 <w:sz w:val="18"/>
                 <w:szCs w:val="18"/>
               </w:rPr>
-              <w:t xml:space="preserve">FMNIST + HWA + LA</w:t>
+              <w:t xml:space="preserve">FashionMNIST + holder-weighted averaging + logit adjustment</w:t>
             </w:r>
           </w:p>
         </w:tc>
@@ -26812,7 +29520,7 @@
                 <w:sz w:val="18"/>
                 <w:szCs w:val="18"/>
               </w:rPr>
-              <w:t xml:space="preserve">FMNIST Ours-A</w:t>
+              <w:t xml:space="preserve">FashionMNIST Ours-A</w:t>
             </w:r>
           </w:p>
         </w:tc>
@@ -27120,7 +29828,7 @@
                 <w:sz w:val="18"/>
                 <w:szCs w:val="18"/>
               </w:rPr>
-              <w:t xml:space="preserve">MNIST + HWA + LA</w:t>
+              <w:t xml:space="preserve">MNIST + holder-weighted averaging + logit adjustment</w:t>
             </w:r>
           </w:p>
         </w:tc>
@@ -27424,7 +30132,7 @@
         <w:t xml:space="preserve">Passed:</w:t>
       </w:r>
       <w:r>
-        <w:t xml:space="preserve"> ER is within 0.8 points of the pooled-data refit in all runs (9 of 9 including the follow-up), +18 points on plain GeFL-F. Logit offsets (BBC, LA) stay below the refit in every run: the error is in the weights, not only in a class prior.</w:t>
+        <w:t xml:space="preserve"> exact readout is within 0.8 points of the pooled-data refit in all runs (9 of 9 including the follow-up), +18 points on plain GeFL-F. Logit offsets (bias calibration, logit adjustment) stay below the refit in every run: the error is in the weights, not only in a class prior.</w:t>
       </w:r>
     </w:p>
     <w:p>
@@ -27454,7 +30162,7 @@
         <w:t xml:space="preserve">not hold</w:t>
       </w:r>
       <w:r>
-        <w:t xml:space="preserve"> (FMNIST Ours-A: −17 recall points against the refit), less on classes held with 1–20 samples (−7), none on well-held classes.</w:t>
+        <w:t xml:space="preserve"> (FashionMNIST Ours-A: −17 recall points against the refit), less on classes held with 1–20 samples (−7), none on well-held classes.</w:t>
       </w:r>
     </w:p>
     <w:p>
@@ -27501,7 +30209,7 @@
           <w:b/>
           <w:bCs/>
         </w:rPr>
-        <w:t xml:space="preserve">ER is not a new idea</w:t>
+        <w:t xml:space="preserve">Exact readout is not a new idea</w:t>
       </w:r>
       <w:r>
         <w:t xml:space="preserve">: it is the known classifier recalibration from federated statistics (CCVR, NeurIPS 2021; CReFF, IJCAI 2022; Fed3R, ICML 2024), extended to heterogeneous heads (one set of statistics per architecture). We present it that way.</w:t>
@@ -27537,7 +30245,7 @@
         <w:spacing w:after="60" w:line="264"/>
       </w:pPr>
       <w:r>
-        <w:t xml:space="preserve">ER is now logged automatically (er_bal) in every new run, at no extra GPU cost.</w:t>
+        <w:t xml:space="preserve">Exact readout is now logged automatically (er_bal) in every new run, at no extra GPU cost.</w:t>
       </w:r>
     </w:p>
     <w:p>
@@ -27627,7 +30335,7 @@
         <w:t xml:space="preserve">Same protocol and privacy model as GeFL-F:</w:t>
       </w:r>
       <w:r>
-        <w:t xml:space="preserve"> one small extra upload of class sums; formal DP possible.</w:t>
+        <w:t xml:space="preserve"> one small extra upload of class sums; formal differential privacy possible.</w:t>
       </w:r>
     </w:p>
     <w:p>
@@ -27958,7 +30666,7 @@
                 <w:sz w:val="18"/>
                 <w:szCs w:val="18"/>
               </w:rPr>
-              <w:t xml:space="preserve">: SVHN 54.4 → 65.6 (LT), 77.07 (IID)</w:t>
+              <w:t xml:space="preserve">: SVHN 54.4 → 65.6 (long tail), 77.07 (balanced)</w:t>
             </w:r>
           </w:p>
         </w:tc>
@@ -28293,7 +31001,7 @@
                 <w:sz w:val="18"/>
                 <w:szCs w:val="18"/>
               </w:rPr>
-              <w:t xml:space="preserve">Last-layer analysis and ER (T03)</w:t>
+              <w:t xml:space="preserve">Last-layer analysis and exact readout (T03)</w:t>
             </w:r>
           </w:p>
         </w:tc>
@@ -28394,7 +31102,7 @@
                 <w:sz w:val="18"/>
                 <w:szCs w:val="18"/>
               </w:rPr>
-              <w:t xml:space="preserve">K14: ablation seeds 3–4 and MC-B (Kaggle, ≈ 4 GPU-h)</w:t>
+              <w:t xml:space="preserve">K14: ablation seeds 3–4 and covariance correction (Kaggle, ≈ 4 GPU hours)</w:t>
             </w:r>
           </w:p>
         </w:tc>
@@ -28424,7 +31132,7 @@
                 <w:sz w:val="18"/>
                 <w:szCs w:val="18"/>
               </w:rPr>
-              <w:t xml:space="preserve">per-part significance; MC-B stability</w:t>
+              <w:t xml:space="preserve">per-part significance; covariance correction stability</w:t>
             </w:r>
           </w:p>
         </w:tc>
@@ -28486,7 +31194,7 @@
                 <w:sz w:val="18"/>
                 <w:szCs w:val="18"/>
               </w:rPr>
-              <w:t xml:space="preserve">K15: existing collapse fixes (AdamW, no decay on rows, lazy decay) vs HWA at K = 10/50/100 (≈ 7 GPU-h)</w:t>
+              <w:t xml:space="preserve">K15: existing collapse fixes (AdamW, no decay on rows, lazy decay) vs holder-weighted averaging at 10/50/100 clients (≈ 7 GPU hours)</w:t>
             </w:r>
           </w:p>
         </w:tc>
@@ -28578,7 +31286,7 @@
                 <w:sz w:val="18"/>
                 <w:szCs w:val="18"/>
               </w:rPr>
-              <w:t xml:space="preserve">CIFAR-10 / SVHN long tail with ER logged (≈ 6 GPU-h)</w:t>
+              <w:t xml:space="preserve">CIFAR-10 / SVHN long tail with exact readout logged (≈ 6 GPU hours)</w:t>
             </w:r>
           </w:p>
         </w:tc>
@@ -28670,7 +31378,7 @@
                 <w:sz w:val="18"/>
                 <w:szCs w:val="18"/>
               </w:rPr>
-              <w:t xml:space="preserve">Covariance correction MC-B</w:t>
+              <w:t xml:space="preserve">Covariance correction covariance correction</w:t>
             </w:r>
           </w:p>
         </w:tc>
@@ -28730,7 +31438,7 @@
                 <w:sz w:val="18"/>
                 <w:szCs w:val="18"/>
               </w:rPr>
-              <w:t xml:space="preserve">FMNIST: 81.57 (LT), 85.75 (IID); MNIST unstable on one seed</w:t>
+              <w:t xml:space="preserve">FashionMNIST: 81.57 (long tail), 85.75 (balanced); MNIST unstable on one seed</w:t>
             </w:r>
           </w:p>
         </w:tc>
@@ -28762,7 +31470,7 @@
                 <w:sz w:val="18"/>
                 <w:szCs w:val="18"/>
               </w:rPr>
-              <w:t xml:space="preserve">Paper's other FL baselines under the long tail</w:t>
+              <w:t xml:space="preserve">Paper's other federated learning baselines under the long tail</w:t>
             </w:r>
           </w:p>
         </w:tc>
@@ -28872,7 +31580,7 @@
         <w:t xml:space="preserve">Lemma 2.</w:t>
       </w:r>
       <w:r>
-        <w:t xml:space="preserve"> A non-holder's gradient on r_c is exactly λ r_c. Adam's step is η·m̂/(√v̂ + ε); multiplying every gradient by λ multiplies m̂ and √v̂ by λ, so the step is unchanged as long as λ|r| ≫ ε. Hence D̄ does not depend on λ &gt; 0, and D̄ = 0 at λ = 0. Under SGD the same step would be η λ ‖r‖. ∎</w:t>
+        <w:t xml:space="preserve"> A non-holder's gradient on r_c is exactly λ r_c. Adam's step is η·m̂/(√v̂ + ε); multiplying every gradient by λ multiplies m̂ and √v̂ by λ, so the step is unchanged as long as λ|r| ≫ ε. Hence D̄ does not depend on λ &gt; 0, and D̄ = 0 at λ = 0. Under stochastic gradient descent the same step would be η λ ‖r‖. ∎</w:t>
       </w:r>
     </w:p>
     <w:p>
@@ -28920,7 +31628,7 @@
         <w:t xml:space="preserve">Lemma 1</w:t>
       </w:r>
       <w:r>
-        <w:t xml:space="preserve"> is the standard RKHS bound: |E_G ℓ − E_P ℓ| = |⟨ℓ, μ_G − μ_P⟩| ≤ ‖ℓ‖·MMD(G, P).</w:t>
+        <w:t xml:space="preserve"> is the standard kernel bound: |E_G ℓ − E_P ℓ| = |⟨ℓ, μ_G − μ_P⟩| ≤ ‖ℓ‖·fake-to-real distance(G, P).</w:t>
       </w:r>
     </w:p>
     <w:p>
@@ -29896,7 +32604,7 @@
         <w:jc w:val="both"/>
       </w:pPr>
       <w:r>
-        <w:t xml:space="preserve">Ours-A settings: 6,144 random Fourier features; herding pool 4n; consensus weight β = 0.5; LA temperature τ = 1; T_s = 10, T_r = 5.</w:t>
+        <w:t xml:space="preserve">Ours-A settings: 6,144 random Fourier features; herding pool 4n; consensus weight β = 0.5; logit adjustment temperature τ = 1; 10 synthetic epochs, T_r = 5.</w:t>
       </w:r>
     </w:p>
     <w:tbl>
@@ -30167,7 +32875,7 @@
                 <w:sz w:val="18"/>
                 <w:szCs w:val="18"/>
               </w:rPr>
-              <w:t xml:space="preserve">Kernel herding, KME-Gen, the anchored stack</w:t>
+              <w:t xml:space="preserve">Kernel herding, server-trained generator (kernel matching), the anchored stack</w:t>
             </w:r>
           </w:p>
         </w:tc>
@@ -30229,7 +32937,7 @@
                 <w:sz w:val="18"/>
                 <w:szCs w:val="18"/>
               </w:rPr>
-              <w:t xml:space="preserve">Formal DP; IID at 50/100 clients; hybrid</w:t>
+              <w:t xml:space="preserve">Formal differential privacy; balanced at 50/100 clients; hybrid</w:t>
             </w:r>
           </w:p>
         </w:tc>
@@ -30353,7 +33061,7 @@
                 <w:sz w:val="18"/>
                 <w:szCs w:val="18"/>
               </w:rPr>
-              <w:t xml:space="preserve">Ours-A on CIFAR-10 and SVHN; SVHN switch; hybrid; VCT vs MixUp</w:t>
+              <w:t xml:space="preserve">Ours-A on CIFAR-10 and SVHN; SVHN switch; hybrid; our mixing variant vs MixUp</w:t>
             </w:r>
           </w:p>
         </w:tc>
@@ -30477,7 +33185,7 @@
                 <w:sz w:val="18"/>
                 <w:szCs w:val="18"/>
               </w:rPr>
-              <w:t xml:space="preserve">MC-B, covariance version of the moment fix</w:t>
+              <w:t xml:space="preserve">Covariance correction, covariance version of the moment fix</w:t>
             </w:r>
           </w:p>
         </w:tc>
@@ -30539,7 +33247,7 @@
                 <w:sz w:val="18"/>
                 <w:szCs w:val="18"/>
               </w:rPr>
-              <w:t xml:space="preserve">Collapse theorem on the real generator; last-layer gap and ER</w:t>
+              <w:t xml:space="preserve">Collapse theorem on the real generator; last-layer gap and exact readout</w:t>
             </w:r>
           </w:p>
         </w:tc>
@@ -30601,7 +33309,7 @@
                 <w:sz w:val="18"/>
                 <w:szCs w:val="18"/>
               </w:rPr>
-              <w:t xml:space="preserve">Ablation seeds 3–4; existing collapse fixes vs HWA</w:t>
+              <w:t xml:space="preserve">Ablation seeds 3–4; existing collapse fixes vs holder-weighted averaging</w:t>
             </w:r>
           </w:p>
         </w:tc>

</xml_diff>